<commit_message>
Added new literature review MD document
</commit_message>
<xml_diff>
--- a/10_Draft/Master Thesis - Draft.docx
+++ b/10_Draft/Master Thesis - Draft.docx
@@ -11853,7 +11853,7 @@
           <w:sz w:val="24"/>
           <w:u w:val="single"/>
         </w:rPr>
-        <w:t>Wildfire Hazard: Process Fundamentals and Contemporary Drivers</w:t>
+        <w:t>Wildfire Hazard: Process Fundamentals and Drivers</w:t>
       </w:r>
       <w:bookmarkEnd w:id="12"/>
     </w:p>
@@ -11872,13 +11872,7 @@
     </w:p>
     <w:p>
       <w:r>
-        <w:t xml:space="preserve">Fire is understood to be a natural and recurrent earth system process, contributing to the delineation of ecological boundaries, influencing geological cycles, and affecting atmospheric dynamics. These effects can be seen in ecoregions shaped on fire adaptation, fire effects on soil properties, and </w:t>
-      </w:r>
-      <w:r>
-        <w:t>gases</w:t>
-      </w:r>
-      <w:r>
-        <w:t xml:space="preserve"> released</w:t>
+        <w:t>Fire is understood to be a natural and recurrent earth system process, contributing to the delineation of ecological boundaries, influencing geological cycles, and affecting atmospheric dynamics</w:t>
       </w:r>
       <w:r>
         <w:t xml:space="preserve"> </w:t>
@@ -11909,41 +11903,20 @@
       <w:r>
         <w:t>.</w:t>
       </w:r>
-      <w:r>
-        <w:rPr>
-          <w:rFonts w:eastAsia="Times New Roman"/>
-        </w:rPr>
-        <w:t xml:space="preserve"> </w:t>
-      </w:r>
-      <w:r>
-        <w:t>Fire itself is considered to be a core ecological process across the planet</w:t>
-      </w:r>
-      <w:r>
-        <w:t xml:space="preserve"> </w:t>
-      </w:r>
-      <w:r>
-        <w:fldChar w:fldCharType="begin"/>
-      </w:r>
-      <w:r>
-        <w:instrText xml:space="preserve"> ADDIN ZOTERO_ITEM CSL_CITATION {"citationID":"vqFYeMNW","properties":{"formattedCitation":"(Cochrane and Ryan 2009)","plainCitation":"(Cochrane and Ryan 2009)","noteIndex":0},"citationItems":[{"id":221,"uris":["http://zotero.org/users/18505960/items/3JNH37SZ"],"itemData":{"id":221,"type":"article-journal","container-title":"In: Cochrane, Mark A., ed. Tropical fire ecology: Climate change, land use, and ecosystem dynamics. Springer-Praxis Books in Environmental Sciences. Chichester, UK: Praxis Publishing, Ltd. p. 25-62.","DOI":"10.1007/978-3-540-77381-8_2","language":"en","page":"25-62","source":"research.fs.usda.gov","title":"Fire and fire ecology: Concepts and principles","title-short":"Fire and fire ecology","author":[{"family":"Cochrane","given":"Mark A."},{"family":"Ryan","given":"Kevin C."}],"issued":{"date-parts":[["2009"]]}}}],"schema":"https://github.com/citation-style-language/schema/raw/master/csl-citation.json"} </w:instrText>
-      </w:r>
-      <w:r>
-        <w:fldChar w:fldCharType="separate"/>
-      </w:r>
-      <w:r>
-        <w:t>(Cochrane and Ryan 2009)</w:t>
-      </w:r>
-      <w:r>
-        <w:fldChar w:fldCharType="end"/>
-      </w:r>
-      <w:r>
-        <w:t>.</w:t>
-      </w:r>
     </w:p>
     <w:p/>
     <w:p>
       <w:r>
-        <w:t>Fire is a type of chemical reaction known as combustion. It liberates CO2, water in the form of steam, and stored energy in the form of light and heat</w:t>
+        <w:t>Fire is a type of chemical reaction known as combustion. It liberates CO</w:t>
+      </w:r>
+      <w:r>
+        <w:rPr>
+          <w:vertAlign w:val="subscript"/>
+        </w:rPr>
+        <w:t>2</w:t>
+      </w:r>
+      <w:r>
+        <w:t>, water in the form of steam, and stored energy in the form of light and heat</w:t>
       </w:r>
       <w:r>
         <w:t xml:space="preserve"> </w:t>
@@ -12361,7 +12334,13 @@
     <w:p>
       <w:r>
         <w:lastRenderedPageBreak/>
-        <w:t>Fire takes three elements to occur: heat, oxygen, and fuel. As we move forward in space and time, these elements change and vary with scale. To visualize the three fire fundamental elements, a triangle is often used. To better exemplify the change of these elements with scale as we discuss wildfires, Cochrane and Ryan 2009 proposed figure</w:t>
+        <w:t xml:space="preserve">Fire takes three elements to occur: heat, oxygen, and fuel. To better exemplify the change of these elements with scale Cochrane and Ryan 2009 proposed </w:t>
+      </w:r>
+      <w:r>
+        <w:t xml:space="preserve">an extended version of the fire triangle based on time and space in </w:t>
+      </w:r>
+      <w:r>
+        <w:t>figure</w:t>
       </w:r>
       <w:r>
         <w:t xml:space="preserve"> 1.</w:t>
@@ -12423,8 +12402,14 @@
       <w:r>
         <w:t xml:space="preserve"> </w:t>
       </w:r>
-      <w:r>
-        <w:t>Usually, natural causes of ignitions are lightnings and in rare cases caused by spontaneous ignitions</w:t>
+    </w:p>
+    <w:p/>
+    <w:p>
+      <w:r>
+        <w:t>N</w:t>
+      </w:r>
+      <w:r>
+        <w:t>atural causes of ignitions are lightnings and in rare cases spontaneous ignitions</w:t>
       </w:r>
       <w:r>
         <w:t xml:space="preserve"> </w:t>
@@ -12447,6 +12432,35 @@
       <w:r>
         <w:t xml:space="preserve">. </w:t>
       </w:r>
+      <w:r>
+        <w:t xml:space="preserve">However, the most common type of fire in the tropics is the one used for land clearing and land use conversion, with large forests in the Amazon starting as deforestation tools escaping outside of the agriculture bounds. This pattern of use change promotes forest fragmentation, degradation, and increase the forest edge density, which increases fuel material and enhances susceptibility to fire, thus creating a feedback loop </w:t>
+      </w:r>
+      <w:r>
+        <w:fldChar w:fldCharType="begin"/>
+      </w:r>
+      <w:r>
+        <w:instrText xml:space="preserve"> ADDIN ZOTERO_ITEM CSL_CITATION {"citationID":"rhl1ryyF","properties":{"formattedCitation":"(Shlisky et al. 2009)","plainCitation":"(Shlisky et al. 2009)","noteIndex":0},"citationItems":[{"id":211,"uris":["http://zotero.org/users/18505960/items/VJ39LW7E"],"itemData":{"id":211,"type":"chapter","abstract":"Fire is a natural process that has played a major role in shaping our environment and maintaining biodiversity worldwide.\nHowever, over 60% of the world’s terrestrial habitats have altered fire regimes. At least 20% of global habitats are classified\nas fire-sensitive, including most tropical habitats; they are composed of species that did not largely evolve in the presence\nof fire. Over 70% of these fire-sensitive habitats have altered fire regimes. While fire has been, and still is, an important\ntool used by humans to cultivate agricultural landscapes, when human actions cause too much, too little, or the wrong type\nof fire, it can threaten our environment by releasing unacceptable levels of greenhouse gases into the atmosphere, providing\npathways for harmful invasive species, altering landscape hydrology, impairing local and regional air quality, and presenting\na direct and often increased risk to human habitation. Recognizing the value and need to assess the world’s fire regimes,\nThe Nature Conservancy, University of California at Berkeley, World Conservation Union (IUCN), and World Wildlife Fund (WWF)\ncompleted an expert-based analysis of the state of the world’s fire regimes based on currently available data and expert opinion.\nThe major sources of fire regime alteration worldwide include climate change, agriculture and ranching, deforestation, rural\nand urban development, energy production, fire exclusion and suppression, invasive species, plantations, and arson. Integrated\nfire management (IFM) is an approach that considers both damaging and beneficial fires within the context of the natural environments\nand socio-economic systems in which they occur. IFM takes into account fire ecology, socio-economic issues, and fire management\ntechnology to generate practical solutions to fire-related threats to biodiversity.","DOI":"10.1007/978-3-540-77381-8_3","ISBN":"978-3-540-77380-1","page":"65-83","source":"ResearchGate","title":"Overview: Global fire regime conditions, threats, and opportunities for fire management in the tropics","title-short":"Overview","author":[{"family":"Shlisky","given":"Ayn"},{"family":"Alencar","given":"Ane"},{"family":"Manta","given":"María"},{"family":"Curran","given":"Lisa"},{"family":"Cochrane","given":"Mark"}],"issued":{"date-parts":[["2009",1,1]]}}}],"schema":"https://github.com/citation-style-language/schema/raw/master/csl-citation.json"} </w:instrText>
+      </w:r>
+      <w:r>
+        <w:fldChar w:fldCharType="separate"/>
+      </w:r>
+      <w:r>
+        <w:t>(</w:t>
+      </w:r>
+      <w:proofErr w:type="spellStart"/>
+      <w:r>
+        <w:t>Shlisky</w:t>
+      </w:r>
+      <w:proofErr w:type="spellEnd"/>
+      <w:r>
+        <w:t xml:space="preserve"> et al. 2009)</w:t>
+      </w:r>
+      <w:r>
+        <w:fldChar w:fldCharType="end"/>
+      </w:r>
+      <w:r>
+        <w:t>.</w:t>
+      </w:r>
     </w:p>
     <w:p/>
     <w:p>
@@ -12457,7 +12471,19 @@
         <w:t xml:space="preserve">wildland </w:t>
       </w:r>
       <w:r>
-        <w:t xml:space="preserve">fires can be divided </w:t>
+        <w:t>fire</w:t>
+      </w:r>
+      <w:r>
+        <w:t xml:space="preserve"> </w:t>
+      </w:r>
+      <w:r>
+        <w:t>spread,</w:t>
+      </w:r>
+      <w:r>
+        <w:t xml:space="preserve"> and intensity</w:t>
+      </w:r>
+      <w:r>
+        <w:t xml:space="preserve"> can be divided </w:t>
       </w:r>
       <w:r>
         <w:t>into</w:t>
@@ -12659,7 +12685,6 @@
           <w:sz w:val="24"/>
           <w:u w:val="single"/>
         </w:rPr>
-        <w:lastRenderedPageBreak/>
         <w:t xml:space="preserve">2.2. </w:t>
       </w:r>
       <w:r>
@@ -17619,16 +17644,8 @@
       <w:rPr>
         <w:rStyle w:val="PageNumber"/>
       </w:rPr>
-      <w:t>xii</w:t>
+      <w:t>xiii</w:t>
     </w:r>
-    <w:proofErr w:type="spellStart"/>
-    <w:r>
-      <w:rPr>
-        <w:rStyle w:val="PageNumber"/>
-      </w:rPr>
-      <w:t>i</w:t>
-    </w:r>
-    <w:proofErr w:type="spellEnd"/>
     <w:r>
       <w:rPr>
         <w:rStyle w:val="PageNumber"/>

</xml_diff>

<commit_message>
Added new flowcharts and directories
</commit_message>
<xml_diff>
--- a/10_Draft/Master Thesis - Draft.docx
+++ b/10_Draft/Master Thesis - Draft.docx
@@ -11853,7 +11853,16 @@
           <w:sz w:val="24"/>
           <w:u w:val="single"/>
         </w:rPr>
-        <w:t>Wildfire Hazard: Process Fundamentals and Drivers</w:t>
+        <w:t>Fire</w:t>
+      </w:r>
+      <w:r>
+        <w:rPr>
+          <w:rFonts w:cs="Times New Roman"/>
+          <w:bCs w:val="0"/>
+          <w:sz w:val="24"/>
+          <w:u w:val="single"/>
+        </w:rPr>
+        <w:t>: Process Fundamentals and Drivers</w:t>
       </w:r>
       <w:bookmarkEnd w:id="12"/>
     </w:p>
@@ -11887,15 +11896,7 @@
         <w:fldChar w:fldCharType="separate"/>
       </w:r>
       <w:r>
-        <w:t xml:space="preserve">(Bowman et al. 2009; Harrison et al. 2021; </w:t>
-      </w:r>
-      <w:proofErr w:type="spellStart"/>
-      <w:r>
-        <w:t>Shakesby</w:t>
-      </w:r>
-      <w:proofErr w:type="spellEnd"/>
-      <w:r>
-        <w:t xml:space="preserve"> and Doerr 2006)</w:t>
+        <w:t>(Bowman et al. 2009; Harrison et al. 2021; Shakesby and Doerr 2006)</w:t>
       </w:r>
       <w:r>
         <w:fldChar w:fldCharType="end"/>
@@ -11925,13 +11926,13 @@
         <w:fldChar w:fldCharType="begin"/>
       </w:r>
       <w:r>
-        <w:instrText xml:space="preserve"> ADDIN ZOTERO_ITEM CSL_CITATION {"citationID":"AFSgzGiJ","properties":{"formattedCitation":"(Pyne et al. 1996; Cochrane and Ryan 2009)","plainCitation":"(Pyne et al. 1996; Cochrane and Ryan 2009)","noteIndex":0},"citationItems":[{"id":77,"uris":["http://zotero.org/users/18505960/items/5R8BRJNG"],"itemData":{"id":77,"type":"book","edition":"2. ed","ISBN":"978-0-471-54913-0","language":"en","number-of-pages":"769","publisher":"Wiley","publisher-place":"New York, NY","source":"K10plus ISBN","title":"Introduction to wildland fire","author":[{"family":"Pyne","given":"Stephen J."},{"family":"Andrews","given":"Patricia L."},{"family":"Laven","given":"Richard D."}],"issued":{"date-parts":[["1996"]]}}},{"id":221,"uris":["http://zotero.org/users/18505960/items/3JNH37SZ"],"itemData":{"id":221,"type":"article-journal","container-title":"In: Cochrane, Mark A., ed. Tropical fire ecology: Climate change, land use, and ecosystem dynamics. Springer-Praxis Books in Environmental Sciences. Chichester, UK: Praxis Publishing, Ltd. p. 25-62.","DOI":"10.1007/978-3-540-77381-8_2","language":"en","page":"25-62","source":"research.fs.usda.gov","title":"Fire and fire ecology: Concepts and principles","title-short":"Fire and fire ecology","author":[{"family":"Cochrane","given":"Mark A."},{"family":"Ryan","given":"Kevin C."}],"issued":{"date-parts":[["2009"]]}}}],"schema":"https://github.com/citation-style-language/schema/raw/master/csl-citation.json"} </w:instrText>
+        <w:instrText xml:space="preserve"> ADDIN ZOTERO_ITEM CSL_CITATION {"citationID":"AFSgzGiJ","properties":{"formattedCitation":"(Pyne et al. 1996; M. A. Cochrane and Ryan 2009)","plainCitation":"(Pyne et al. 1996; M. A. Cochrane and Ryan 2009)","noteIndex":0},"citationItems":[{"id":77,"uris":["http://zotero.org/users/18505960/items/5R8BRJNG"],"itemData":{"id":77,"type":"book","edition":"2. ed","ISBN":"978-0-471-54913-0","language":"en","number-of-pages":"769","publisher":"Wiley","publisher-place":"New York, NY","source":"K10plus ISBN","title":"Introduction to wildland fire","author":[{"family":"Pyne","given":"Stephen J."},{"family":"Andrews","given":"Patricia L."},{"family":"Laven","given":"Richard D."}],"issued":{"date-parts":[["1996"]]}}},{"id":221,"uris":["http://zotero.org/users/18505960/items/3JNH37SZ"],"itemData":{"id":221,"type":"article-journal","container-title":"In: Cochrane, Mark A., ed. Tropical fire ecology: Climate change, land use, and ecosystem dynamics. Springer-Praxis Books in Environmental Sciences. Chichester, UK: Praxis Publishing, Ltd. p. 25-62.","DOI":"10.1007/978-3-540-77381-8_2","language":"en","page":"25-62","source":"research.fs.usda.gov","title":"Fire and fire ecology: Concepts and principles","title-short":"Fire and fire ecology","author":[{"family":"Cochrane","given":"Mark A."},{"family":"Ryan","given":"Kevin C."}],"issued":{"date-parts":[["2009"]]}}}],"schema":"https://github.com/citation-style-language/schema/raw/master/csl-citation.json"} </w:instrText>
       </w:r>
       <w:r>
         <w:fldChar w:fldCharType="separate"/>
       </w:r>
       <w:r>
-        <w:t>(Pyne et al. 1996; Cochrane and Ryan 2009)</w:t>
+        <w:t>(Pyne et al. 1996; M. A. Cochrane and Ryan 2009)</w:t>
       </w:r>
       <w:r>
         <w:fldChar w:fldCharType="end"/>
@@ -12180,13 +12181,13 @@
         <w:fldChar w:fldCharType="begin"/>
       </w:r>
       <w:r>
-        <w:instrText xml:space="preserve"> ADDIN ZOTERO_ITEM CSL_CITATION {"citationID":"v1CLGtCg","properties":{"formattedCitation":"(Cochrane and Ryan 2009)","plainCitation":"(Cochrane and Ryan 2009)","noteIndex":0},"citationItems":[{"id":221,"uris":["http://zotero.org/users/18505960/items/3JNH37SZ"],"itemData":{"id":221,"type":"article-journal","container-title":"In: Cochrane, Mark A., ed. Tropical fire ecology: Climate change, land use, and ecosystem dynamics. Springer-Praxis Books in Environmental Sciences. Chichester, UK: Praxis Publishing, Ltd. p. 25-62.","DOI":"10.1007/978-3-540-77381-8_2","language":"en","page":"25-62","source":"research.fs.usda.gov","title":"Fire and fire ecology: Concepts and principles","title-short":"Fire and fire ecology","author":[{"family":"Cochrane","given":"Mark A."},{"family":"Ryan","given":"Kevin C."}],"issued":{"date-parts":[["2009"]]}}}],"schema":"https://github.com/citation-style-language/schema/raw/master/csl-citation.json"} </w:instrText>
+        <w:instrText xml:space="preserve"> ADDIN ZOTERO_ITEM CSL_CITATION {"citationID":"v1CLGtCg","properties":{"formattedCitation":"(M. A. Cochrane and Ryan 2009)","plainCitation":"(M. A. Cochrane and Ryan 2009)","noteIndex":0},"citationItems":[{"id":221,"uris":["http://zotero.org/users/18505960/items/3JNH37SZ"],"itemData":{"id":221,"type":"article-journal","container-title":"In: Cochrane, Mark A., ed. Tropical fire ecology: Climate change, land use, and ecosystem dynamics. Springer-Praxis Books in Environmental Sciences. Chichester, UK: Praxis Publishing, Ltd. p. 25-62.","DOI":"10.1007/978-3-540-77381-8_2","language":"en","page":"25-62","source":"research.fs.usda.gov","title":"Fire and fire ecology: Concepts and principles","title-short":"Fire and fire ecology","author":[{"family":"Cochrane","given":"Mark A."},{"family":"Ryan","given":"Kevin C."}],"issued":{"date-parts":[["2009"]]}}}],"schema":"https://github.com/citation-style-language/schema/raw/master/csl-citation.json"} </w:instrText>
       </w:r>
       <w:r>
         <w:fldChar w:fldCharType="separate"/>
       </w:r>
       <w:r>
-        <w:t>(Cochrane and Ryan 2009)</w:t>
+        <w:t>(M. A. Cochrane and Ryan 2009)</w:t>
       </w:r>
       <w:r>
         <w:fldChar w:fldCharType="end"/>
@@ -12204,13 +12205,13 @@
         <w:fldChar w:fldCharType="begin"/>
       </w:r>
       <w:r>
-        <w:instrText xml:space="preserve"> ADDIN ZOTERO_ITEM CSL_CITATION {"citationID":"eDzes5Fa","properties":{"formattedCitation":"(Cochrane and Ryan 2009; Pyne et al. 1996)","plainCitation":"(Cochrane and Ryan 2009; Pyne et al. 1996)","noteIndex":0},"citationItems":[{"id":221,"uris":["http://zotero.org/users/18505960/items/3JNH37SZ"],"itemData":{"id":221,"type":"article-journal","container-title":"In: Cochrane, Mark A., ed. Tropical fire ecology: Climate change, land use, and ecosystem dynamics. Springer-Praxis Books in Environmental Sciences. Chichester, UK: Praxis Publishing, Ltd. p. 25-62.","DOI":"10.1007/978-3-540-77381-8_2","language":"en","page":"25-62","source":"research.fs.usda.gov","title":"Fire and fire ecology: Concepts and principles","title-short":"Fire and fire ecology","author":[{"family":"Cochrane","given":"Mark A."},{"family":"Ryan","given":"Kevin C."}],"issued":{"date-parts":[["2009"]]}}},{"id":77,"uris":["http://zotero.org/users/18505960/items/5R8BRJNG"],"itemData":{"id":77,"type":"book","edition":"2. ed","ISBN":"978-0-471-54913-0","language":"en","number-of-pages":"769","publisher":"Wiley","publisher-place":"New York, NY","source":"K10plus ISBN","title":"Introduction to wildland fire","author":[{"family":"Pyne","given":"Stephen J."},{"family":"Andrews","given":"Patricia L."},{"family":"Laven","given":"Richard D."}],"issued":{"date-parts":[["1996"]]}}}],"schema":"https://github.com/citation-style-language/schema/raw/master/csl-citation.json"} </w:instrText>
+        <w:instrText xml:space="preserve"> ADDIN ZOTERO_ITEM CSL_CITATION {"citationID":"eDzes5Fa","properties":{"formattedCitation":"(M. A. Cochrane and Ryan 2009; Pyne et al. 1996)","plainCitation":"(M. A. Cochrane and Ryan 2009; Pyne et al. 1996)","noteIndex":0},"citationItems":[{"id":221,"uris":["http://zotero.org/users/18505960/items/3JNH37SZ"],"itemData":{"id":221,"type":"article-journal","container-title":"In: Cochrane, Mark A., ed. Tropical fire ecology: Climate change, land use, and ecosystem dynamics. Springer-Praxis Books in Environmental Sciences. Chichester, UK: Praxis Publishing, Ltd. p. 25-62.","DOI":"10.1007/978-3-540-77381-8_2","language":"en","page":"25-62","source":"research.fs.usda.gov","title":"Fire and fire ecology: Concepts and principles","title-short":"Fire and fire ecology","author":[{"family":"Cochrane","given":"Mark A."},{"family":"Ryan","given":"Kevin C."}],"issued":{"date-parts":[["2009"]]}}},{"id":77,"uris":["http://zotero.org/users/18505960/items/5R8BRJNG"],"itemData":{"id":77,"type":"book","edition":"2. ed","ISBN":"978-0-471-54913-0","language":"en","number-of-pages":"769","publisher":"Wiley","publisher-place":"New York, NY","source":"K10plus ISBN","title":"Introduction to wildland fire","author":[{"family":"Pyne","given":"Stephen J."},{"family":"Andrews","given":"Patricia L."},{"family":"Laven","given":"Richard D."}],"issued":{"date-parts":[["1996"]]}}}],"schema":"https://github.com/citation-style-language/schema/raw/master/csl-citation.json"} </w:instrText>
       </w:r>
       <w:r>
         <w:fldChar w:fldCharType="separate"/>
       </w:r>
       <w:r>
-        <w:t>(Cochrane and Ryan 2009; Pyne et al. 1996)</w:t>
+        <w:t>(M. A. Cochrane and Ryan 2009; Pyne et al. 1996)</w:t>
       </w:r>
       <w:r>
         <w:fldChar w:fldCharType="end"/>
@@ -12301,24 +12302,14 @@
       <w:r>
         <w:t xml:space="preserve">Figure </w:t>
       </w:r>
-      <w:r>
-        <w:fldChar w:fldCharType="begin"/>
-      </w:r>
-      <w:r>
-        <w:instrText xml:space="preserve"> SEQ Figure \* ARABIC </w:instrText>
-      </w:r>
-      <w:r>
-        <w:fldChar w:fldCharType="separate"/>
-      </w:r>
-      <w:r>
-        <w:rPr>
-          <w:noProof/>
-        </w:rPr>
-        <w:t>1</w:t>
-      </w:r>
-      <w:r>
-        <w:fldChar w:fldCharType="end"/>
-      </w:r>
+      <w:fldSimple w:instr=" SEQ Figure \* ARABIC ">
+        <w:r>
+          <w:rPr>
+            <w:noProof/>
+          </w:rPr>
+          <w:t>1</w:t>
+        </w:r>
+      </w:fldSimple>
       <w:r>
         <w:t xml:space="preserve">. </w:t>
       </w:r>
@@ -12333,11 +12324,20 @@
     </w:p>
     <w:p>
       <w:r>
+        <w:t xml:space="preserve">Fire takes three elements to occur: heat, oxygen, and fuel. To better exemplify the change of these elements </w:t>
+      </w:r>
+      <w:r>
+        <w:t>at different temporal and spatial scales,</w:t>
+      </w:r>
+      <w:r>
+        <w:t xml:space="preserve"> Cochrane and Ryan 2009 proposed </w:t>
+      </w:r>
+      <w:r>
+        <w:t xml:space="preserve">an </w:t>
+      </w:r>
+      <w:r>
         <w:lastRenderedPageBreak/>
-        <w:t xml:space="preserve">Fire takes three elements to occur: heat, oxygen, and fuel. To better exemplify the change of these elements with scale Cochrane and Ryan 2009 proposed </w:t>
-      </w:r>
-      <w:r>
-        <w:t xml:space="preserve">an extended version of the fire triangle based on time and space in </w:t>
+        <w:t xml:space="preserve">extended version of the fire triangle based on time and space in </w:t>
       </w:r>
       <w:r>
         <w:t>figure</w:t>
@@ -12345,6 +12345,9 @@
       <w:r>
         <w:t xml:space="preserve"> 1.</w:t>
       </w:r>
+      <w:r>
+        <w:t xml:space="preserve"> From this figure, it can be taken that the three main drivers of fire at the landscape level are ignition, fuel, and weather.</w:t>
+      </w:r>
     </w:p>
     <w:p>
       <w:pPr>
@@ -12352,13 +12355,28 @@
       </w:pPr>
       <w:bookmarkStart w:id="16" w:name="_Toc224055065"/>
       <w:r>
-        <w:t>2.1.2. Wildland Fire</w:t>
+        <w:t xml:space="preserve">2.1.2. </w:t>
+      </w:r>
+      <w:r>
+        <w:t>Wildland</w:t>
+      </w:r>
+      <w:r>
+        <w:t xml:space="preserve"> Fire</w:t>
       </w:r>
       <w:bookmarkEnd w:id="16"/>
-    </w:p>
-    <w:p>
-      <w:r>
-        <w:t xml:space="preserve">Although there are different approaches and definitions, wildfires are widely understood as "any unplanned and uncontrolled fire started in shrubs or forest" </w:t>
+      <w:r>
+        <w:t xml:space="preserve"> Drivers</w:t>
+      </w:r>
+    </w:p>
+    <w:p>
+      <w:r>
+        <w:t>Although there are different approaches and definitions, wildfires</w:t>
+      </w:r>
+      <w:r>
+        <w:t xml:space="preserve"> or wildland fires</w:t>
+      </w:r>
+      <w:r>
+        <w:t xml:space="preserve"> are widely understood as "any unplanned and uncontrolled fire started in shrubs or forest" </w:t>
       </w:r>
       <w:r>
         <w:fldChar w:fldCharType="begin"/>
@@ -12385,13 +12403,13 @@
         <w:fldChar w:fldCharType="begin"/>
       </w:r>
       <w:r>
-        <w:instrText xml:space="preserve"> ADDIN ZOTERO_ITEM CSL_CITATION {"citationID":"swjLfXTt","properties":{"formattedCitation":"(Cochrane and Ryan 2009)","plainCitation":"(Cochrane and Ryan 2009)","noteIndex":0},"citationItems":[{"id":221,"uris":["http://zotero.org/users/18505960/items/3JNH37SZ"],"itemData":{"id":221,"type":"article-journal","container-title":"In: Cochrane, Mark A., ed. Tropical fire ecology: Climate change, land use, and ecosystem dynamics. Springer-Praxis Books in Environmental Sciences. Chichester, UK: Praxis Publishing, Ltd. p. 25-62.","DOI":"10.1007/978-3-540-77381-8_2","language":"en","page":"25-62","source":"research.fs.usda.gov","title":"Fire and fire ecology: Concepts and principles","title-short":"Fire and fire ecology","author":[{"family":"Cochrane","given":"Mark A."},{"family":"Ryan","given":"Kevin C."}],"issued":{"date-parts":[["2009"]]}}}],"schema":"https://github.com/citation-style-language/schema/raw/master/csl-citation.json"} </w:instrText>
+        <w:instrText xml:space="preserve"> ADDIN ZOTERO_ITEM CSL_CITATION {"citationID":"swjLfXTt","properties":{"formattedCitation":"(M. A. Cochrane and Ryan 2009)","plainCitation":"(M. A. Cochrane and Ryan 2009)","noteIndex":0},"citationItems":[{"id":221,"uris":["http://zotero.org/users/18505960/items/3JNH37SZ"],"itemData":{"id":221,"type":"article-journal","container-title":"In: Cochrane, Mark A., ed. Tropical fire ecology: Climate change, land use, and ecosystem dynamics. Springer-Praxis Books in Environmental Sciences. Chichester, UK: Praxis Publishing, Ltd. p. 25-62.","DOI":"10.1007/978-3-540-77381-8_2","language":"en","page":"25-62","source":"research.fs.usda.gov","title":"Fire and fire ecology: Concepts and principles","title-short":"Fire and fire ecology","author":[{"family":"Cochrane","given":"Mark A."},{"family":"Ryan","given":"Kevin C."}],"issued":{"date-parts":[["2009"]]}}}],"schema":"https://github.com/citation-style-language/schema/raw/master/csl-citation.json"} </w:instrText>
       </w:r>
       <w:r>
         <w:fldChar w:fldCharType="separate"/>
       </w:r>
       <w:r>
-        <w:t>(Cochrane and Ryan 2009)</w:t>
+        <w:t>(M. A. Cochrane and Ryan 2009)</w:t>
       </w:r>
       <w:r>
         <w:fldChar w:fldCharType="end"/>
@@ -12406,10 +12424,22 @@
     <w:p/>
     <w:p>
       <w:r>
-        <w:t>N</w:t>
-      </w:r>
-      <w:r>
-        <w:t>atural causes of ignitions are lightnings and in rare cases spontaneous ignitions</w:t>
+        <w:t>T</w:t>
+      </w:r>
+      <w:r>
+        <w:t xml:space="preserve">opography, vegetation, </w:t>
+      </w:r>
+      <w:r>
+        <w:t>weather</w:t>
+      </w:r>
+      <w:r>
+        <w:t>, and human activity</w:t>
+      </w:r>
+      <w:r>
+        <w:t xml:space="preserve"> are the main drivers of fire at the landscape level</w:t>
+      </w:r>
+      <w:r>
+        <w:t>. These factors influence the dominant mechanisms of heat transfer in a fire event, which influences the rate of spread of the wildfire</w:t>
       </w:r>
       <w:r>
         <w:t xml:space="preserve"> </w:t>
@@ -12418,7 +12448,7 @@
         <w:fldChar w:fldCharType="begin"/>
       </w:r>
       <w:r>
-        <w:instrText xml:space="preserve"> ADDIN ZOTERO_ITEM CSL_CITATION {"citationID":"BHMcYPj8","properties":{"formattedCitation":"(Pyne et al. 1996)","plainCitation":"(Pyne et al. 1996)","noteIndex":0},"citationItems":[{"id":77,"uris":["http://zotero.org/users/18505960/items/5R8BRJNG"],"itemData":{"id":77,"type":"book","edition":"2. ed","ISBN":"978-0-471-54913-0","language":"en","number-of-pages":"769","publisher":"Wiley","publisher-place":"New York, NY","source":"K10plus ISBN","title":"Introduction to wildland fire","author":[{"family":"Pyne","given":"Stephen J."},{"family":"Andrews","given":"Patricia L."},{"family":"Laven","given":"Richard D."}],"issued":{"date-parts":[["1996"]]}}}],"schema":"https://github.com/citation-style-language/schema/raw/master/csl-citation.json"} </w:instrText>
+        <w:instrText xml:space="preserve"> ADDIN ZOTERO_ITEM CSL_CITATION {"citationID":"HeNrcRNV","properties":{"formattedCitation":"(Pyne et al. 1996)","plainCitation":"(Pyne et al. 1996)","noteIndex":0},"citationItems":[{"id":77,"uris":["http://zotero.org/users/18505960/items/5R8BRJNG"],"itemData":{"id":77,"type":"book","edition":"2. ed","ISBN":"978-0-471-54913-0","language":"en","number-of-pages":"769","publisher":"Wiley","publisher-place":"New York, NY","source":"K10plus ISBN","title":"Introduction to wildland fire","author":[{"family":"Pyne","given":"Stephen J."},{"family":"Andrews","given":"Patricia L."},{"family":"Laven","given":"Richard D."}],"issued":{"date-parts":[["1996"]]}}}],"schema":"https://github.com/citation-style-language/schema/raw/master/csl-citation.json"} </w:instrText>
       </w:r>
       <w:r>
         <w:fldChar w:fldCharType="separate"/>
@@ -12430,127 +12460,7 @@
         <w:fldChar w:fldCharType="end"/>
       </w:r>
       <w:r>
-        <w:t xml:space="preserve">. </w:t>
-      </w:r>
-      <w:r>
-        <w:t xml:space="preserve">However, the most common type of fire in the tropics is the one used for land clearing and land use conversion, with large forests in the Amazon starting as deforestation tools escaping outside of the agriculture bounds. This pattern of use change promotes forest fragmentation, degradation, and increase the forest edge density, which increases fuel material and enhances susceptibility to fire, thus creating a feedback loop </w:t>
-      </w:r>
-      <w:r>
-        <w:fldChar w:fldCharType="begin"/>
-      </w:r>
-      <w:r>
-        <w:instrText xml:space="preserve"> ADDIN ZOTERO_ITEM CSL_CITATION {"citationID":"rhl1ryyF","properties":{"formattedCitation":"(Shlisky et al. 2009)","plainCitation":"(Shlisky et al. 2009)","noteIndex":0},"citationItems":[{"id":211,"uris":["http://zotero.org/users/18505960/items/VJ39LW7E"],"itemData":{"id":211,"type":"chapter","abstract":"Fire is a natural process that has played a major role in shaping our environment and maintaining biodiversity worldwide.\nHowever, over 60% of the world’s terrestrial habitats have altered fire regimes. At least 20% of global habitats are classified\nas fire-sensitive, including most tropical habitats; they are composed of species that did not largely evolve in the presence\nof fire. Over 70% of these fire-sensitive habitats have altered fire regimes. While fire has been, and still is, an important\ntool used by humans to cultivate agricultural landscapes, when human actions cause too much, too little, or the wrong type\nof fire, it can threaten our environment by releasing unacceptable levels of greenhouse gases into the atmosphere, providing\npathways for harmful invasive species, altering landscape hydrology, impairing local and regional air quality, and presenting\na direct and often increased risk to human habitation. Recognizing the value and need to assess the world’s fire regimes,\nThe Nature Conservancy, University of California at Berkeley, World Conservation Union (IUCN), and World Wildlife Fund (WWF)\ncompleted an expert-based analysis of the state of the world’s fire regimes based on currently available data and expert opinion.\nThe major sources of fire regime alteration worldwide include climate change, agriculture and ranching, deforestation, rural\nand urban development, energy production, fire exclusion and suppression, invasive species, plantations, and arson. Integrated\nfire management (IFM) is an approach that considers both damaging and beneficial fires within the context of the natural environments\nand socio-economic systems in which they occur. IFM takes into account fire ecology, socio-economic issues, and fire management\ntechnology to generate practical solutions to fire-related threats to biodiversity.","DOI":"10.1007/978-3-540-77381-8_3","ISBN":"978-3-540-77380-1","page":"65-83","source":"ResearchGate","title":"Overview: Global fire regime conditions, threats, and opportunities for fire management in the tropics","title-short":"Overview","author":[{"family":"Shlisky","given":"Ayn"},{"family":"Alencar","given":"Ane"},{"family":"Manta","given":"María"},{"family":"Curran","given":"Lisa"},{"family":"Cochrane","given":"Mark"}],"issued":{"date-parts":[["2009",1,1]]}}}],"schema":"https://github.com/citation-style-language/schema/raw/master/csl-citation.json"} </w:instrText>
-      </w:r>
-      <w:r>
-        <w:fldChar w:fldCharType="separate"/>
-      </w:r>
-      <w:r>
-        <w:t>(</w:t>
-      </w:r>
-      <w:proofErr w:type="spellStart"/>
-      <w:r>
-        <w:t>Shlisky</w:t>
-      </w:r>
-      <w:proofErr w:type="spellEnd"/>
-      <w:r>
-        <w:t xml:space="preserve"> et al. 2009)</w:t>
-      </w:r>
-      <w:r>
-        <w:fldChar w:fldCharType="end"/>
-      </w:r>
-      <w:r>
         <w:t>.</w:t>
-      </w:r>
-    </w:p>
-    <w:p/>
-    <w:p>
-      <w:r>
-        <w:t xml:space="preserve">The main drivers of </w:t>
-      </w:r>
-      <w:r>
-        <w:t xml:space="preserve">wildland </w:t>
-      </w:r>
-      <w:r>
-        <w:t>fire</w:t>
-      </w:r>
-      <w:r>
-        <w:t xml:space="preserve"> </w:t>
-      </w:r>
-      <w:r>
-        <w:t>spread,</w:t>
-      </w:r>
-      <w:r>
-        <w:t xml:space="preserve"> and intensity</w:t>
-      </w:r>
-      <w:r>
-        <w:t xml:space="preserve"> can be divided </w:t>
-      </w:r>
-      <w:r>
-        <w:t>into</w:t>
-      </w:r>
-      <w:r>
-        <w:t xml:space="preserve"> 4 groups: topography, vegetation, climatic variables, and human activity. These relationships are further subdivided by different attributes.</w:t>
-      </w:r>
-    </w:p>
-    <w:p/>
-    <w:p>
-      <w:r>
-        <w:t>These factors influence the dominant mechanisms of heat transfer in a fire event, which influences the rate of spread of the wildfire</w:t>
-      </w:r>
-      <w:r>
-        <w:t xml:space="preserve"> </w:t>
-      </w:r>
-      <w:r>
-        <w:fldChar w:fldCharType="begin"/>
-      </w:r>
-      <w:r>
-        <w:instrText xml:space="preserve"> ADDIN ZOTERO_ITEM CSL_CITATION {"citationID":"HeNrcRNV","properties":{"formattedCitation":"(Pyne et al. 1996)","plainCitation":"(Pyne et al. 1996)","noteIndex":0},"citationItems":[{"id":77,"uris":["http://zotero.org/users/18505960/items/5R8BRJNG"],"itemData":{"id":77,"type":"book","edition":"2. ed","ISBN":"978-0-471-54913-0","language":"en","number-of-pages":"769","publisher":"Wiley","publisher-place":"New York, NY","source":"K10plus ISBN","title":"Introduction to wildland fire","author":[{"family":"Pyne","given":"Stephen J."},{"family":"Andrews","given":"Patricia L."},{"family":"Laven","given":"Richard D."}],"issued":{"date-parts":[["1996"]]}}}],"schema":"https://github.com/citation-style-language/schema/raw/master/csl-citation.json"} </w:instrText>
-      </w:r>
-      <w:r>
-        <w:fldChar w:fldCharType="separate"/>
-      </w:r>
-      <w:r>
-        <w:t>(Pyne et al. 1996)</w:t>
-      </w:r>
-      <w:r>
-        <w:fldChar w:fldCharType="end"/>
-      </w:r>
-      <w:r>
-        <w:t>. Of particular importance are:</w:t>
-      </w:r>
-    </w:p>
-    <w:p/>
-    <w:p>
-      <w:pPr>
-        <w:numPr>
-          <w:ilvl w:val="0"/>
-          <w:numId w:val="11"/>
-        </w:numPr>
-      </w:pPr>
-      <w:r>
-        <w:t>Fuel arrangement</w:t>
-      </w:r>
-    </w:p>
-    <w:p>
-      <w:pPr>
-        <w:numPr>
-          <w:ilvl w:val="0"/>
-          <w:numId w:val="11"/>
-        </w:numPr>
-      </w:pPr>
-      <w:r>
-        <w:t>Speed of the wind acting on the fire</w:t>
-      </w:r>
-    </w:p>
-    <w:p>
-      <w:pPr>
-        <w:numPr>
-          <w:ilvl w:val="0"/>
-          <w:numId w:val="12"/>
-        </w:numPr>
-      </w:pPr>
-      <w:r>
-        <w:t>Slope</w:t>
       </w:r>
     </w:p>
     <w:p/>
@@ -12582,8 +12492,8 @@
                 <w:noProof/>
               </w:rPr>
               <w:drawing>
-                <wp:inline distT="0" distB="0" distL="0" distR="0" wp14:anchorId="38B63C8F" wp14:editId="037730CA">
-                  <wp:extent cx="2767009" cy="2770495"/>
+                <wp:inline distT="0" distB="0" distL="0" distR="0" wp14:anchorId="38B63C8F" wp14:editId="1F2D3093">
+                  <wp:extent cx="3597833" cy="3602367"/>
                   <wp:effectExtent l="0" t="0" r="0" b="0"/>
                   <wp:docPr id="809820360" name="Picture 2"/>
                   <wp:cNvGraphicFramePr>
@@ -12611,7 +12521,7 @@
                         <pic:spPr>
                           <a:xfrm>
                             <a:off x="0" y="0"/>
-                            <a:ext cx="2774304" cy="2777800"/>
+                            <a:ext cx="3623578" cy="3628144"/>
                           </a:xfrm>
                           <a:prstGeom prst="rect">
                             <a:avLst/>
@@ -12635,43 +12545,264 @@
       <w:r>
         <w:t xml:space="preserve">Figure </w:t>
       </w:r>
+      <w:fldSimple w:instr=" SEQ Figure \* ARABIC ">
+        <w:r>
+          <w:rPr>
+            <w:noProof/>
+          </w:rPr>
+          <w:t>2</w:t>
+        </w:r>
+      </w:fldSimple>
+      <w:r>
+        <w:t xml:space="preserve">. </w:t>
+      </w:r>
+      <w:r>
+        <w:t>Main drivers of wildfire, adapted from Yang et al. 2021</w:t>
+      </w:r>
+      <w:r>
+        <w:t>.</w:t>
+      </w:r>
+      <w:bookmarkEnd w:id="17"/>
+    </w:p>
+    <w:p>
+      <w:pPr>
+        <w:pStyle w:val="Heading4"/>
+      </w:pPr>
+      <w:r>
+        <w:t>2.1.2.1. Topography</w:t>
+      </w:r>
+    </w:p>
+    <w:p>
+      <w:r>
+        <w:t>Topography includes slope, aspect, elevation, and land configuration. Changes in topography across the landscape, although constant throughout time, will define other fire drivers such as humidity, wind speed and direction, sunshine duration, air pressure, among others.</w:t>
+      </w:r>
+      <w:r>
+        <w:t xml:space="preserve"> These impacts affect weather and fuel patterns </w:t>
+      </w:r>
       <w:r>
         <w:fldChar w:fldCharType="begin"/>
       </w:r>
       <w:r>
-        <w:instrText xml:space="preserve"> SEQ Figure \* ARABIC </w:instrText>
+        <w:instrText xml:space="preserve"> ADDIN ZOTERO_ITEM CSL_CITATION {"citationID":"Dwkuelu8","properties":{"formattedCitation":"(Pyne et al. 1996; Yang et al. 2021)","plainCitation":"(Pyne et al. 1996; Yang et al. 2021)","noteIndex":0},"citationItems":[{"id":77,"uris":["http://zotero.org/users/18505960/items/5R8BRJNG"],"itemData":{"id":77,"type":"book","edition":"2. ed","ISBN":"978-0-471-54913-0","language":"en","number-of-pages":"769","publisher":"Wiley","publisher-place":"New York, NY","source":"K10plus ISBN","title":"Introduction to wildland fire","author":[{"family":"Pyne","given":"Stephen J."},{"family":"Andrews","given":"Patricia L."},{"family":"Laven","given":"Richard D."}],"issued":{"date-parts":[["1996"]]}}},{"id":26,"uris":["http://zotero.org/users/18505960/items/543NEV7B"],"itemData":{"id":26,"type":"article-journal","abstract":"Forest wildfire is an important threat and disturbance facing natural forest ecosystems. Conducting wildfire risk assessments and zoning studies are o...","container-title":"Forests","DOI":"10.3390/f12101299","ISSN":"1999-4907","issue":"10","language":"en","license":"http://creativecommons.org/licenses/by/3.0/","note":"Company: Multidisciplinary Digital Publishing Institute\nDistributor: Multidisciplinary Digital Publishing Institute\nInstitution: Multidisciplinary Digital Publishing Institute\nLabel: Multidisciplinary Digital Publishing Institute","publisher":"publisher","source":"www-mdpi-com.proxy-um.researchport.umd.edu","title":"Wildfire Risk Assessment and Zoning by Integrating Maxent and GIS in Hunan Province, China","URL":"https://www.mdpi.com/1999-4907/12/10/1299","volume":"12","author":[{"family":"Yang","given":"Xuhong"},{"family":"Jin","given":"Xiaobin"},{"family":"Zhou","given":"Yinkang"}],"accessed":{"date-parts":[["2025",12,25]]},"issued":{"date-parts":[["2021",9,23]]}}}],"schema":"https://github.com/citation-style-language/schema/raw/master/csl-citation.json"} </w:instrText>
       </w:r>
       <w:r>
         <w:fldChar w:fldCharType="separate"/>
       </w:r>
       <w:r>
-        <w:rPr>
-          <w:noProof/>
-        </w:rPr>
-        <w:t>2</w:t>
+        <w:t>(Pyne et al. 1996; Yang et al. 2021)</w:t>
       </w:r>
       <w:r>
         <w:fldChar w:fldCharType="end"/>
       </w:r>
       <w:r>
-        <w:t xml:space="preserve">. </w:t>
-      </w:r>
-      <w:r>
-        <w:t>Main drivers of wildfire, adapted from Yang et al. 2021</w:t>
-      </w:r>
-      <w:r>
         <w:t>.</w:t>
       </w:r>
-      <w:bookmarkEnd w:id="17"/>
     </w:p>
     <w:p/>
     <w:p>
+      <w:r>
+        <w:t>Length of fire season and fuel availability is greatly affected by elevation, with effects on precipitation and snow melt. On the other hand, temperature and relative humidity are influenced by position on slope.</w:t>
+      </w:r>
+      <w:r>
+        <w:t xml:space="preserve"> Aspect affects the amount of sola radiation and wind that different orientations of the slope receive, thus affecting temperature and spread of the fire </w:t>
+      </w:r>
+      <w:r>
+        <w:fldChar w:fldCharType="begin"/>
+      </w:r>
+      <w:r>
+        <w:instrText xml:space="preserve"> ADDIN ZOTERO_ITEM CSL_CITATION {"citationID":"H4MWyEvL","properties":{"formattedCitation":"(Pyne et al. 1996)","plainCitation":"(Pyne et al. 1996)","noteIndex":0},"citationItems":[{"id":77,"uris":["http://zotero.org/users/18505960/items/5R8BRJNG"],"itemData":{"id":77,"type":"book","edition":"2. ed","ISBN":"978-0-471-54913-0","language":"en","number-of-pages":"769","publisher":"Wiley","publisher-place":"New York, NY","source":"K10plus ISBN","title":"Introduction to wildland fire","author":[{"family":"Pyne","given":"Stephen J."},{"family":"Andrews","given":"Patricia L."},{"family":"Laven","given":"Richard D."}],"issued":{"date-parts":[["1996"]]}}}],"schema":"https://github.com/citation-style-language/schema/raw/master/csl-citation.json"} </w:instrText>
+      </w:r>
+      <w:r>
+        <w:fldChar w:fldCharType="separate"/>
+      </w:r>
+      <w:r>
+        <w:t>(Pyne et al. 1996)</w:t>
+      </w:r>
+      <w:r>
+        <w:fldChar w:fldCharType="end"/>
+      </w:r>
+      <w:r>
+        <w:t>.</w:t>
+      </w:r>
+    </w:p>
+    <w:p/>
+    <w:p>
+      <w:pPr>
+        <w:pStyle w:val="Heading4"/>
+      </w:pPr>
+      <w:r>
+        <w:t>2.1.2.2. Vegetation</w:t>
+      </w:r>
+    </w:p>
+    <w:p>
+      <w:r>
+        <w:t xml:space="preserve">In wildland fire vegetation represents fuel. </w:t>
+      </w:r>
+      <w:r>
+        <w:t xml:space="preserve">Its properties such as quantity, shape and size, compactness, and arrangement affects fire distribution, spread speed and range, and overall fire behavior </w:t>
+      </w:r>
+      <w:r>
+        <w:fldChar w:fldCharType="begin"/>
+      </w:r>
+      <w:r>
+        <w:instrText xml:space="preserve"> ADDIN ZOTERO_ITEM CSL_CITATION {"citationID":"EJnMexLx","properties":{"formattedCitation":"(Pyne et al. 1996)","plainCitation":"(Pyne et al. 1996)","noteIndex":0},"citationItems":[{"id":77,"uris":["http://zotero.org/users/18505960/items/5R8BRJNG"],"itemData":{"id":77,"type":"book","edition":"2. ed","ISBN":"978-0-471-54913-0","language":"en","number-of-pages":"769","publisher":"Wiley","publisher-place":"New York, NY","source":"K10plus ISBN","title":"Introduction to wildland fire","author":[{"family":"Pyne","given":"Stephen J."},{"family":"Andrews","given":"Patricia L."},{"family":"Laven","given":"Richard D."}],"issued":{"date-parts":[["1996"]]}}}],"schema":"https://github.com/citation-style-language/schema/raw/master/csl-citation.json"} </w:instrText>
+      </w:r>
+      <w:r>
+        <w:fldChar w:fldCharType="separate"/>
+      </w:r>
+      <w:r>
+        <w:t>(Pyne et al. 1996)</w:t>
+      </w:r>
+      <w:r>
+        <w:fldChar w:fldCharType="end"/>
+      </w:r>
+      <w:r>
+        <w:t>.</w:t>
+      </w:r>
+      <w:r>
+        <w:t xml:space="preserve"> The availability of continuous fuel ultimately determines the size of a fire as seen in the figure below </w:t>
+      </w:r>
+      <w:r>
+        <w:fldChar w:fldCharType="begin"/>
+      </w:r>
+      <w:r>
+        <w:instrText xml:space="preserve"> ADDIN ZOTERO_ITEM CSL_CITATION {"citationID":"1oDq37KD","properties":{"formattedCitation":"(Pausas and Keeley 2021)","plainCitation":"(Pausas and Keeley 2021)","noteIndex":0},"citationItems":[{"id":227,"uris":["http://zotero.org/users/18505960/items/NYXIYWCP"],"itemData":{"id":227,"type":"article-journal","abstract":"No single factor produces wildfires; rather, they occur when fire thresholds (ignitions, fuels, and drought) are crossed. Anomalous weather events may lower these thresholds and thereby enhance the likelihood and spread of wildfires. Climate change increases the frequency with which some of these thresholds are crossed, extending the duration of the fire season and increasing the frequency of dry years. However, climate-related factors do not explain all of the complexity of global fire-regime changes, as altered ignition patterns (eg human behavior) and fuel structures (eg land-use changes, fire suppression, drought-induced dieback, fragmentation) are extremely important. When the thresholds are crossed, the size of a fire will largely depend on the duration of the fire weather and the extent of the available area with continuous fuels in the landscape.","container-title":"Frontiers in Ecology and the Environment","DOI":"10.1002/fee.2359","ISSN":"1540-9309","issue":"7","language":"en","license":"© The Ecological Society of America","note":"_eprint: https://esajournals.onlinelibrary.wiley.com/doi/pdf/10.1002/fee.2359","page":"387-395","source":"Wiley Online Library","title":"Wildfires and global change","volume":"19","author":[{"family":"Pausas","given":"Juli G"},{"family":"Keeley","given":"Jon E"}],"issued":{"date-parts":[["2021"]]}}}],"schema":"https://github.com/citation-style-language/schema/raw/master/csl-citation.json"} </w:instrText>
+      </w:r>
+      <w:r>
+        <w:fldChar w:fldCharType="separate"/>
+      </w:r>
+      <w:r>
+        <w:t>(</w:t>
+      </w:r>
+      <w:proofErr w:type="spellStart"/>
+      <w:r>
+        <w:t>Pausas</w:t>
+      </w:r>
+      <w:proofErr w:type="spellEnd"/>
+      <w:r>
+        <w:t xml:space="preserve"> and Keeley 2021)</w:t>
+      </w:r>
+      <w:r>
+        <w:fldChar w:fldCharType="end"/>
+      </w:r>
+      <w:r>
+        <w:t>.</w:t>
+      </w:r>
+    </w:p>
+    <w:p/>
+    <w:p/>
+    <w:p/>
+    <w:p>
+      <w:pPr>
+        <w:pStyle w:val="Heading4"/>
+      </w:pPr>
+      <w:r>
+        <w:t>2.1.2.3. Weather</w:t>
+      </w:r>
+    </w:p>
+    <w:p/>
+    <w:p/>
+    <w:p>
+      <w:pPr>
+        <w:pStyle w:val="Heading4"/>
+      </w:pPr>
+      <w:r>
+        <w:t>2.1.2.4. Human activity</w:t>
+      </w:r>
+    </w:p>
+    <w:p/>
+    <w:p/>
+    <w:p/>
+    <w:p>
+      <w:pPr>
+        <w:pStyle w:val="Heading3"/>
+      </w:pPr>
+      <w:r>
+        <w:t>2.1.3 Agricultural fire</w:t>
+      </w:r>
+    </w:p>
+    <w:p>
+      <w:r>
+        <w:t xml:space="preserve">Land clearing or grassland management fires are </w:t>
+      </w:r>
+      <w:r>
+        <w:t xml:space="preserve">most common type of fire in the tropics, with large forests in the Amazon starting as deforestation tools escaping outside of the agriculture bounds. This pattern of use change promotes forest fragmentation, degradation, and increase the forest edge density, which increases fuel material and enhances susceptibility to fire, thus creating a feedback loop </w:t>
+      </w:r>
+      <w:r>
+        <w:fldChar w:fldCharType="begin"/>
+      </w:r>
+      <w:r>
+        <w:instrText xml:space="preserve"> ADDIN ZOTERO_ITEM CSL_CITATION {"citationID":"rhl1ryyF","properties":{"formattedCitation":"(Shlisky et al. 2009)","plainCitation":"(Shlisky et al. 2009)","noteIndex":0},"citationItems":[{"id":211,"uris":["http://zotero.org/users/18505960/items/VJ39LW7E"],"itemData":{"id":211,"type":"chapter","abstract":"Fire is a natural process that has played a major role in shaping our environment and maintaining biodiversity worldwide.\nHowever, over 60% of the world’s terrestrial habitats have altered fire regimes. At least 20% of global habitats are classified\nas fire-sensitive, including most tropical habitats; they are composed of species that did not largely evolve in the presence\nof fire. Over 70% of these fire-sensitive habitats have altered fire regimes. While fire has been, and still is, an important\ntool used by humans to cultivate agricultural landscapes, when human actions cause too much, too little, or the wrong type\nof fire, it can threaten our environment by releasing unacceptable levels of greenhouse gases into the atmosphere, providing\npathways for harmful invasive species, altering landscape hydrology, impairing local and regional air quality, and presenting\na direct and often increased risk to human habitation. Recognizing the value and need to assess the world’s fire regimes,\nThe Nature Conservancy, University of California at Berkeley, World Conservation Union (IUCN), and World Wildlife Fund (WWF)\ncompleted an expert-based analysis of the state of the world’s fire regimes based on currently available data and expert opinion.\nThe major sources of fire regime alteration worldwide include climate change, agriculture and ranching, deforestation, rural\nand urban development, energy production, fire exclusion and suppression, invasive species, plantations, and arson. Integrated\nfire management (IFM) is an approach that considers both damaging and beneficial fires within the context of the natural environments\nand socio-economic systems in which they occur. IFM takes into account fire ecology, socio-economic issues, and fire management\ntechnology to generate practical solutions to fire-related threats to biodiversity.","DOI":"10.1007/978-3-540-77381-8_3","ISBN":"978-3-540-77380-1","page":"65-83","source":"ResearchGate","title":"Overview: Global fire regime conditions, threats, and opportunities for fire management in the tropics","title-short":"Overview","author":[{"family":"Shlisky","given":"Ayn"},{"family":"Alencar","given":"Ane"},{"family":"Manta","given":"María"},{"family":"Curran","given":"Lisa"},{"family":"Cochrane","given":"Mark"}],"issued":{"date-parts":[["2009",1,1]]}}}],"schema":"https://github.com/citation-style-language/schema/raw/master/csl-citation.json"} </w:instrText>
+      </w:r>
+      <w:r>
+        <w:fldChar w:fldCharType="separate"/>
+      </w:r>
+      <w:r>
+        <w:t>(</w:t>
+      </w:r>
+      <w:proofErr w:type="spellStart"/>
+      <w:r>
+        <w:t>Shlisky</w:t>
+      </w:r>
+      <w:proofErr w:type="spellEnd"/>
+      <w:r>
+        <w:t xml:space="preserve"> et al. 2009)</w:t>
+      </w:r>
+      <w:r>
+        <w:fldChar w:fldCharType="end"/>
+      </w:r>
+      <w:r>
+        <w:t>.</w:t>
+      </w:r>
+    </w:p>
+    <w:p/>
+    <w:p>
+      <w:r>
+        <w:t xml:space="preserve">Fire has been used as an agricultural tool for thousands of years, shaping the landscape and influencing the fire regime. Practices like slash and burn were an easy and effective way to clear land while making key nutrients available through ash </w:t>
+      </w:r>
+      <w:r>
+        <w:fldChar w:fldCharType="begin"/>
+      </w:r>
+      <w:r>
+        <w:instrText xml:space="preserve"> ADDIN ZOTERO_ITEM CSL_CITATION {"citationID":"KAtOrDiC","properties":{"formattedCitation":"(Bilbao et al. 2025)","plainCitation":"(Bilbao et al. 2025)","noteIndex":0},"citationItems":[{"id":229,"uris":["http://zotero.org/users/18505960/items/KLTHLR7J"],"itemData":{"id":229,"type":"chapter","abstract":"Indigenous Peoples and Local Communities (IPLCs) of South America have developed complex fire use systems for over 10,000 years that go beyond basic needs like warmth, cooking, and socializing. These practices evolved into sophisticated techniques for creating pyrobiocultural landscapes, polyculture agriculture, plant domestication, resource acquisition, soil enhancement, territory protection and cleaning, and spiritual and aesthetic purposes. Drawing from scientific literature and fieldwork, we demonstrate that these communities have used fire in diverse and complex ways to achieve multiple benefits across a wide range of ecosystems—from savannas and grasslands to fire-sensitive tropical and template forests that have not evolved with high fire exposure. Paradoxically, despite South America having an outstanding cultural diversity of Indigenous groups and substantial evidence supporting traditional fire management practices, current policies often ignore or prohibit them. Instead, “zero-fire” approaches have been promoted. Some of these policies persist despite their limited effectiveness, controversial outcomes in conservation and ecology, and increased socio-environmental risks, especially under climate and land-use changes. We argue that developing more holistic, effective, and equitable fire management policies requires the inclusion of diverse perspectives and revitalizing Indigenous and local traditional fire knowledge and adaptive practices that have sustainably managed South American landscapes for millennia.","container-title":"Fire in the South American Ecosystems","DOI":"10.1007/978-3-031-89372-8_3","ISBN":"978-3-031-89372-8","language":"en","page":"39-81","publisher":"Springer Nature Switzerland","publisher-place":"Cham","source":"Springer Link","title":"Traditional Fire Uses by Indigenous Peoples and Local Communities in South America","URL":"https://doi.org/10.1007/978-3-031-89372-8_3","author":[{"family":"Bilbao","given":"Bibiana A."},{"family":"Ferrero","given":"Brian G."},{"family":"Falleiro","given":"Rodrigo M."},{"family":"Moura","given":"Livia Carvalho"},{"family":"Fagundes","given":"Guilherme M."}],"editor":[{"family":"Fidelis","given":"Alessandra"},{"family":"Pivello","given":"Vânia R."}],"accessed":{"date-parts":[["2026",3,14]]},"issued":{"date-parts":[["2025"]]}}}],"schema":"https://github.com/citation-style-language/schema/raw/master/csl-citation.json"} </w:instrText>
+      </w:r>
+      <w:r>
+        <w:fldChar w:fldCharType="separate"/>
+      </w:r>
+      <w:r>
+        <w:t>(Bilbao et al. 2025)</w:t>
+      </w:r>
+      <w:r>
+        <w:fldChar w:fldCharType="end"/>
+      </w:r>
+      <w:r>
+        <w:t xml:space="preserve">. More recently, fire is used not only for land clearing but also to control pests and promote grass regrowth </w:t>
+      </w:r>
+      <w:r>
+        <w:fldChar w:fldCharType="begin"/>
+      </w:r>
+      <w:r>
+        <w:instrText xml:space="preserve"> ADDIN ZOTERO_ITEM CSL_CITATION {"citationID":"XAwopfw1","properties":{"formattedCitation":"(M. Cochrane 2009)","plainCitation":"(M. Cochrane 2009)","noteIndex":0},"citationItems":[{"id":230,"uris":["http://zotero.org/users/18505960/items/DD9EGWPX"],"itemData":{"id":230,"type":"chapter","abstract":"Once rare, wildfires are becoming increasingly common in the Amazon. For the last several decades, Brazil has worked to settle\nthe Amazon. People have cleared many areas and fragmented much of the remaining forest. Most regional land uses are fire-\nderived, fire-managed, or make the remaining forests more vulnerable to fire. Closed- canopy forests generally remain relatively\ncool and moist even during the dry season when weeks may pass without rain. However, extreme drought events eventually dry\nthe surface fuels enough to make the forest susceptible to fire. Continual ignition events along forest edges make forest\nfires inevitable during these periods. Once damaged by either fire or selective logging, the forest canopy becomes fractured,\nallowing moisture to be rapidly pumped from the forest by small-scale convection cells. These damaged forests dry rapidly\nand become fire-susceptible nearly every year during the dry season. Poorly adapted to fire, the forests suffer severe damage\nand high mortality even during low-intensity fires. Each fire results in an increase in fuel loads from dying and decaying\ntrees. Subsequent fires burn more intensely, spread faster, and can kill even the largest, thickest barked trees. Therefore,\nhuman land use and the ecological traits of the forest combine to make them susceptible to a positive feedback process whereby\nfires become more frequent and more severe until the forest collapses and is replaced by grass or scrub vegetation. Ongoing\nclimate change is warming the Amazon and may potentially reduce rainfall or increase drought frequency or intensity. These\nforests have persisted through many periods of previous climate change. However, the current conditions of ubiquitous ignitions,\nextensive clearing, fragmentation, and damage to the forests may combine to make large regions vulnerable to fire conversion\nof these lush biodiverse ecosystems to early successional and impoverished conditions. Without changes in land and fire management,\nfire will become endemic to many regions, threatening both the native species and the livelihoods of people who live in the\nAmazon.","container-title":"Tropical Fire Ecology: Climate Change, Land Use and Ecosystem Dynamics","DOI":"10.1007/978-3-540-77381-8_14","ISBN":"978-3-540-77380-1","note":"journalAbbreviation: Tropical Fire Ecology: Climate Change, Land Use and Ecosystem Dynamics","page":"389-426","source":"ResearchGate","title":"Fire, land use, land cover dynamics, and climate change in the Brazilian Amazon","author":[{"family":"Cochrane","given":"Mark"}],"issued":{"date-parts":[["2009",1,1]]}}}],"schema":"https://github.com/citation-style-language/schema/raw/master/csl-citation.json"} </w:instrText>
+      </w:r>
+      <w:r>
+        <w:fldChar w:fldCharType="separate"/>
+      </w:r>
+      <w:r>
+        <w:t>(M. Cochrane 2009)</w:t>
+      </w:r>
+      <w:r>
+        <w:fldChar w:fldCharType="end"/>
+      </w:r>
+      <w:r>
+        <w:t>.</w:t>
+      </w:r>
+    </w:p>
+    <w:p>
       <w:pPr>
         <w:pStyle w:val="Heading2"/>
         <w:spacing w:line="480" w:lineRule="auto"/>
         <w:rPr>
           <w:rFonts w:cs="Times New Roman"/>
-          <w:b/>
           <w:bCs w:val="0"/>
           <w:sz w:val="24"/>
           <w:u w:val="single"/>
@@ -12685,6 +12816,7 @@
           <w:sz w:val="24"/>
           <w:u w:val="single"/>
         </w:rPr>
+        <w:lastRenderedPageBreak/>
         <w:t xml:space="preserve">2.2. </w:t>
       </w:r>
       <w:r>
@@ -12700,6 +12832,43 @@
     </w:p>
     <w:p>
       <w:pPr>
+        <w:pStyle w:val="Heading3"/>
+      </w:pPr>
+      <w:r>
+        <w:t>2.2.1. Fire Hazard</w:t>
+      </w:r>
+    </w:p>
+    <w:p>
+      <w:pPr>
+        <w:pStyle w:val="Heading4"/>
+      </w:pPr>
+      <w:r>
+        <w:t>2.2.1.1. Ignition Probability</w:t>
+      </w:r>
+    </w:p>
+    <w:p>
+      <w:pPr>
+        <w:pStyle w:val="Heading4"/>
+      </w:pPr>
+      <w:r>
+        <w:t>2.2.1.2. Fire Spread</w:t>
+      </w:r>
+    </w:p>
+    <w:p>
+      <w:pPr>
+        <w:pStyle w:val="Heading4"/>
+      </w:pPr>
+      <w:r>
+        <w:t>2.2.1.3. Vulnerability</w:t>
+      </w:r>
+    </w:p>
+    <w:p>
+      <w:pPr>
+        <w:pStyle w:val="Heading4"/>
+      </w:pPr>
+    </w:p>
+    <w:p>
+      <w:pPr>
         <w:pStyle w:val="Heading2"/>
         <w:spacing w:line="480" w:lineRule="auto"/>
         <w:rPr>
@@ -12870,7 +13039,7 @@
         <w:ind w:left="720"/>
         <w:rPr>
           <w:rFonts w:cs="Times New Roman"/>
-          <w:b w:val="0"/>
+          <w:b/>
           <w:bCs w:val="0"/>
           <w:lang w:val="fr-BE"/>
         </w:rPr>
@@ -12880,7 +13049,6 @@
       <w:r>
         <w:rPr>
           <w:rFonts w:cs="Times New Roman"/>
-          <w:b w:val="0"/>
           <w:bCs w:val="0"/>
           <w:lang w:val="fr-BE"/>
         </w:rPr>
@@ -12890,7 +13058,6 @@
       <w:r>
         <w:rPr>
           <w:rFonts w:cs="Times New Roman"/>
-          <w:b w:val="0"/>
           <w:bCs w:val="0"/>
           <w:lang w:val="fr-BE"/>
         </w:rPr>
@@ -12905,7 +13072,7 @@
         <w:ind w:left="720"/>
         <w:rPr>
           <w:rFonts w:cs="Times New Roman"/>
-          <w:b w:val="0"/>
+          <w:b/>
           <w:bCs w:val="0"/>
           <w:lang w:val="fr-BE"/>
         </w:rPr>
@@ -12915,7 +13082,6 @@
       <w:r>
         <w:rPr>
           <w:rFonts w:cs="Times New Roman"/>
-          <w:b w:val="0"/>
           <w:bCs w:val="0"/>
           <w:lang w:val="fr-BE"/>
         </w:rPr>
@@ -12925,7 +13091,6 @@
       <w:r>
         <w:rPr>
           <w:rFonts w:cs="Times New Roman"/>
-          <w:b w:val="0"/>
           <w:bCs w:val="0"/>
           <w:lang w:val="fr-BE"/>
         </w:rPr>
@@ -12940,7 +13105,7 @@
         <w:ind w:left="720"/>
         <w:rPr>
           <w:rFonts w:cs="Times New Roman"/>
-          <w:b w:val="0"/>
+          <w:b/>
           <w:bCs w:val="0"/>
           <w:lang w:val="fr-BE"/>
         </w:rPr>
@@ -12950,7 +13115,6 @@
       <w:r>
         <w:rPr>
           <w:rFonts w:cs="Times New Roman"/>
-          <w:b w:val="0"/>
           <w:bCs w:val="0"/>
           <w:lang w:val="fr-BE"/>
         </w:rPr>
@@ -12960,7 +13124,6 @@
       <w:r>
         <w:rPr>
           <w:rFonts w:cs="Times New Roman"/>
-          <w:b w:val="0"/>
           <w:bCs w:val="0"/>
           <w:lang w:val="fr-BE"/>
         </w:rPr>
@@ -13001,7 +13164,7 @@
         <w:ind w:left="720"/>
         <w:rPr>
           <w:rFonts w:cs="Times New Roman"/>
-          <w:b w:val="0"/>
+          <w:b/>
           <w:bCs w:val="0"/>
           <w:lang w:val="fr-BE"/>
         </w:rPr>
@@ -13011,7 +13174,6 @@
       <w:r>
         <w:rPr>
           <w:rFonts w:cs="Times New Roman"/>
-          <w:b w:val="0"/>
           <w:bCs w:val="0"/>
           <w:lang w:val="fr-BE"/>
         </w:rPr>
@@ -13021,7 +13183,6 @@
       <w:r>
         <w:rPr>
           <w:rFonts w:cs="Times New Roman"/>
-          <w:b w:val="0"/>
           <w:bCs w:val="0"/>
           <w:lang w:val="fr-BE"/>
         </w:rPr>
@@ -13036,7 +13197,7 @@
         <w:ind w:left="720"/>
         <w:rPr>
           <w:rFonts w:cs="Times New Roman"/>
-          <w:b w:val="0"/>
+          <w:b/>
           <w:bCs w:val="0"/>
           <w:lang w:val="fr-BE"/>
         </w:rPr>
@@ -13046,7 +13207,6 @@
       <w:r>
         <w:rPr>
           <w:rFonts w:cs="Times New Roman"/>
-          <w:b w:val="0"/>
           <w:bCs w:val="0"/>
           <w:lang w:val="fr-BE"/>
         </w:rPr>
@@ -13056,7 +13216,6 @@
       <w:r>
         <w:rPr>
           <w:rFonts w:cs="Times New Roman"/>
-          <w:b w:val="0"/>
           <w:bCs w:val="0"/>
           <w:lang w:val="fr-BE"/>
         </w:rPr>
@@ -13071,7 +13230,7 @@
         <w:ind w:left="720"/>
         <w:rPr>
           <w:rFonts w:cs="Times New Roman"/>
-          <w:b w:val="0"/>
+          <w:b/>
           <w:bCs w:val="0"/>
           <w:lang w:val="fr-BE"/>
         </w:rPr>
@@ -13081,7 +13240,6 @@
       <w:r>
         <w:rPr>
           <w:rFonts w:cs="Times New Roman"/>
-          <w:b w:val="0"/>
           <w:bCs w:val="0"/>
           <w:lang w:val="fr-BE"/>
         </w:rPr>
@@ -13091,7 +13249,6 @@
       <w:r>
         <w:rPr>
           <w:rFonts w:cs="Times New Roman"/>
-          <w:b w:val="0"/>
           <w:bCs w:val="0"/>
           <w:lang w:val="fr-BE"/>
         </w:rPr>
@@ -13141,7 +13298,7 @@
         <w:ind w:left="720"/>
         <w:rPr>
           <w:rFonts w:cs="Times New Roman"/>
-          <w:b w:val="0"/>
+          <w:b/>
           <w:bCs w:val="0"/>
           <w:lang w:val="fr-BE"/>
         </w:rPr>
@@ -13151,7 +13308,6 @@
       <w:r>
         <w:rPr>
           <w:rFonts w:cs="Times New Roman"/>
-          <w:b w:val="0"/>
           <w:bCs w:val="0"/>
           <w:lang w:val="fr-BE"/>
         </w:rPr>
@@ -13161,7 +13317,6 @@
       <w:r>
         <w:rPr>
           <w:rFonts w:cs="Times New Roman"/>
-          <w:b w:val="0"/>
           <w:bCs w:val="0"/>
           <w:lang w:val="fr-BE"/>
         </w:rPr>
@@ -13176,7 +13331,7 @@
         <w:ind w:left="720"/>
         <w:rPr>
           <w:rFonts w:cs="Times New Roman"/>
-          <w:b w:val="0"/>
+          <w:b/>
           <w:bCs w:val="0"/>
           <w:lang w:val="fr-BE"/>
         </w:rPr>
@@ -13186,7 +13341,6 @@
       <w:r>
         <w:rPr>
           <w:rFonts w:cs="Times New Roman"/>
-          <w:b w:val="0"/>
           <w:bCs w:val="0"/>
           <w:lang w:val="fr-BE"/>
         </w:rPr>
@@ -13196,7 +13350,6 @@
       <w:r>
         <w:rPr>
           <w:rFonts w:cs="Times New Roman"/>
-          <w:b w:val="0"/>
           <w:bCs w:val="0"/>
           <w:lang w:val="fr-BE"/>
         </w:rPr>
@@ -13211,7 +13364,7 @@
         <w:ind w:left="720"/>
         <w:rPr>
           <w:rFonts w:cs="Times New Roman"/>
-          <w:b w:val="0"/>
+          <w:b/>
           <w:bCs w:val="0"/>
           <w:lang w:val="fr-BE"/>
         </w:rPr>
@@ -13221,7 +13374,6 @@
       <w:r>
         <w:rPr>
           <w:rFonts w:cs="Times New Roman"/>
-          <w:b w:val="0"/>
           <w:bCs w:val="0"/>
           <w:lang w:val="fr-BE"/>
         </w:rPr>
@@ -13231,7 +13383,6 @@
       <w:r>
         <w:rPr>
           <w:rFonts w:cs="Times New Roman"/>
-          <w:b w:val="0"/>
           <w:bCs w:val="0"/>
           <w:lang w:val="fr-BE"/>
         </w:rPr>
@@ -13281,7 +13432,7 @@
         <w:ind w:left="720"/>
         <w:rPr>
           <w:rFonts w:cs="Times New Roman"/>
-          <w:b w:val="0"/>
+          <w:b/>
           <w:bCs w:val="0"/>
           <w:lang w:val="fr-BE"/>
         </w:rPr>
@@ -13291,7 +13442,6 @@
       <w:r>
         <w:rPr>
           <w:rFonts w:cs="Times New Roman"/>
-          <w:b w:val="0"/>
           <w:bCs w:val="0"/>
           <w:lang w:val="fr-BE"/>
         </w:rPr>
@@ -13301,7 +13451,6 @@
       <w:r>
         <w:rPr>
           <w:rFonts w:cs="Times New Roman"/>
-          <w:b w:val="0"/>
           <w:bCs w:val="0"/>
           <w:lang w:val="fr-BE"/>
         </w:rPr>
@@ -13316,7 +13465,7 @@
         <w:ind w:left="720"/>
         <w:rPr>
           <w:rFonts w:cs="Times New Roman"/>
-          <w:b w:val="0"/>
+          <w:b/>
           <w:bCs w:val="0"/>
           <w:lang w:val="fr-BE"/>
         </w:rPr>
@@ -13326,7 +13475,6 @@
       <w:r>
         <w:rPr>
           <w:rFonts w:cs="Times New Roman"/>
-          <w:b w:val="0"/>
           <w:bCs w:val="0"/>
           <w:lang w:val="fr-BE"/>
         </w:rPr>
@@ -13336,7 +13484,6 @@
       <w:r>
         <w:rPr>
           <w:rFonts w:cs="Times New Roman"/>
-          <w:b w:val="0"/>
           <w:bCs w:val="0"/>
           <w:lang w:val="fr-BE"/>
         </w:rPr>
@@ -13351,7 +13498,7 @@
         <w:ind w:left="720"/>
         <w:rPr>
           <w:rFonts w:cs="Times New Roman"/>
-          <w:b w:val="0"/>
+          <w:b/>
           <w:bCs w:val="0"/>
           <w:lang w:val="fr-BE"/>
         </w:rPr>
@@ -13361,7 +13508,6 @@
       <w:r>
         <w:rPr>
           <w:rFonts w:cs="Times New Roman"/>
-          <w:b w:val="0"/>
           <w:bCs w:val="0"/>
           <w:lang w:val="fr-BE"/>
         </w:rPr>
@@ -13371,7 +13517,6 @@
       <w:r>
         <w:rPr>
           <w:rFonts w:cs="Times New Roman"/>
-          <w:b w:val="0"/>
           <w:bCs w:val="0"/>
           <w:lang w:val="fr-BE"/>
         </w:rPr>
@@ -13420,7 +13565,7 @@
         <w:ind w:left="720"/>
         <w:rPr>
           <w:rFonts w:cs="Times New Roman"/>
-          <w:b w:val="0"/>
+          <w:b/>
           <w:bCs w:val="0"/>
           <w:lang w:val="fr-BE"/>
         </w:rPr>
@@ -13430,7 +13575,6 @@
       <w:r>
         <w:rPr>
           <w:rFonts w:cs="Times New Roman"/>
-          <w:b w:val="0"/>
           <w:bCs w:val="0"/>
           <w:lang w:val="fr-BE"/>
         </w:rPr>
@@ -13440,7 +13584,6 @@
       <w:r>
         <w:rPr>
           <w:rFonts w:cs="Times New Roman"/>
-          <w:b w:val="0"/>
           <w:bCs w:val="0"/>
           <w:lang w:val="fr-BE"/>
         </w:rPr>
@@ -13455,7 +13598,7 @@
         <w:ind w:left="720"/>
         <w:rPr>
           <w:rFonts w:cs="Times New Roman"/>
-          <w:b w:val="0"/>
+          <w:b/>
           <w:bCs w:val="0"/>
           <w:lang w:val="fr-BE"/>
         </w:rPr>
@@ -13465,7 +13608,6 @@
       <w:r>
         <w:rPr>
           <w:rFonts w:cs="Times New Roman"/>
-          <w:b w:val="0"/>
           <w:bCs w:val="0"/>
           <w:lang w:val="fr-BE"/>
         </w:rPr>
@@ -13475,7 +13617,6 @@
       <w:r>
         <w:rPr>
           <w:rFonts w:cs="Times New Roman"/>
-          <w:b w:val="0"/>
           <w:bCs w:val="0"/>
           <w:lang w:val="fr-BE"/>
         </w:rPr>
@@ -13490,7 +13631,7 @@
         <w:ind w:left="720"/>
         <w:rPr>
           <w:rFonts w:cs="Times New Roman"/>
-          <w:b w:val="0"/>
+          <w:b/>
           <w:bCs w:val="0"/>
           <w:lang w:val="fr-BE"/>
         </w:rPr>
@@ -13500,7 +13641,6 @@
       <w:r>
         <w:rPr>
           <w:rFonts w:cs="Times New Roman"/>
-          <w:b w:val="0"/>
           <w:bCs w:val="0"/>
           <w:lang w:val="fr-BE"/>
         </w:rPr>
@@ -13510,7 +13650,6 @@
       <w:r>
         <w:rPr>
           <w:rFonts w:cs="Times New Roman"/>
-          <w:b w:val="0"/>
           <w:bCs w:val="0"/>
           <w:lang w:val="fr-BE"/>
         </w:rPr>
@@ -13559,7 +13698,7 @@
         <w:ind w:left="720"/>
         <w:rPr>
           <w:rFonts w:cs="Times New Roman"/>
-          <w:b w:val="0"/>
+          <w:b/>
           <w:bCs w:val="0"/>
           <w:lang w:val="fr-BE"/>
         </w:rPr>
@@ -13569,7 +13708,6 @@
       <w:r>
         <w:rPr>
           <w:rFonts w:cs="Times New Roman"/>
-          <w:b w:val="0"/>
           <w:bCs w:val="0"/>
           <w:lang w:val="fr-BE"/>
         </w:rPr>
@@ -13579,7 +13717,6 @@
       <w:r>
         <w:rPr>
           <w:rFonts w:cs="Times New Roman"/>
-          <w:b w:val="0"/>
           <w:bCs w:val="0"/>
           <w:lang w:val="fr-BE"/>
         </w:rPr>
@@ -13594,7 +13731,7 @@
         <w:ind w:left="720"/>
         <w:rPr>
           <w:rFonts w:cs="Times New Roman"/>
-          <w:b w:val="0"/>
+          <w:b/>
           <w:bCs w:val="0"/>
           <w:lang w:val="fr-BE"/>
         </w:rPr>
@@ -13604,7 +13741,6 @@
       <w:r>
         <w:rPr>
           <w:rFonts w:cs="Times New Roman"/>
-          <w:b w:val="0"/>
           <w:bCs w:val="0"/>
           <w:lang w:val="fr-BE"/>
         </w:rPr>
@@ -13614,7 +13750,6 @@
       <w:r>
         <w:rPr>
           <w:rFonts w:cs="Times New Roman"/>
-          <w:b w:val="0"/>
           <w:bCs w:val="0"/>
           <w:lang w:val="fr-BE"/>
         </w:rPr>
@@ -13629,7 +13764,7 @@
         <w:ind w:left="720"/>
         <w:rPr>
           <w:rFonts w:cs="Times New Roman"/>
-          <w:b w:val="0"/>
+          <w:b/>
           <w:bCs w:val="0"/>
           <w:lang w:val="fr-BE"/>
         </w:rPr>
@@ -13639,7 +13774,6 @@
       <w:r>
         <w:rPr>
           <w:rFonts w:cs="Times New Roman"/>
-          <w:b w:val="0"/>
           <w:bCs w:val="0"/>
           <w:lang w:val="fr-BE"/>
         </w:rPr>
@@ -13649,7 +13783,6 @@
       <w:r>
         <w:rPr>
           <w:rFonts w:cs="Times New Roman"/>
-          <w:b w:val="0"/>
           <w:bCs w:val="0"/>
           <w:lang w:val="fr-BE"/>
         </w:rPr>
@@ -13736,7 +13869,7 @@
         <w:ind w:left="720"/>
         <w:rPr>
           <w:rFonts w:cs="Times New Roman"/>
-          <w:b w:val="0"/>
+          <w:b/>
           <w:bCs w:val="0"/>
           <w:lang w:val="fr-BE"/>
         </w:rPr>
@@ -13746,7 +13879,6 @@
       <w:r>
         <w:rPr>
           <w:rFonts w:cs="Times New Roman"/>
-          <w:b w:val="0"/>
           <w:bCs w:val="0"/>
           <w:lang w:val="fr-BE"/>
         </w:rPr>
@@ -13756,7 +13888,6 @@
       <w:r>
         <w:rPr>
           <w:rFonts w:cs="Times New Roman"/>
-          <w:b w:val="0"/>
           <w:bCs w:val="0"/>
           <w:lang w:val="fr-BE"/>
         </w:rPr>
@@ -13771,7 +13902,7 @@
         <w:ind w:left="720"/>
         <w:rPr>
           <w:rFonts w:cs="Times New Roman"/>
-          <w:b w:val="0"/>
+          <w:b/>
           <w:bCs w:val="0"/>
           <w:lang w:val="fr-BE"/>
         </w:rPr>
@@ -13781,7 +13912,6 @@
       <w:r>
         <w:rPr>
           <w:rFonts w:cs="Times New Roman"/>
-          <w:b w:val="0"/>
           <w:bCs w:val="0"/>
           <w:lang w:val="fr-BE"/>
         </w:rPr>
@@ -13791,7 +13921,6 @@
       <w:r>
         <w:rPr>
           <w:rFonts w:cs="Times New Roman"/>
-          <w:b w:val="0"/>
           <w:bCs w:val="0"/>
           <w:lang w:val="fr-BE"/>
         </w:rPr>
@@ -13806,7 +13935,7 @@
         <w:ind w:left="720"/>
         <w:rPr>
           <w:rFonts w:cs="Times New Roman"/>
-          <w:b w:val="0"/>
+          <w:b/>
           <w:bCs w:val="0"/>
           <w:lang w:val="fr-BE"/>
         </w:rPr>
@@ -13816,7 +13945,6 @@
       <w:r>
         <w:rPr>
           <w:rFonts w:cs="Times New Roman"/>
-          <w:b w:val="0"/>
           <w:bCs w:val="0"/>
           <w:lang w:val="fr-BE"/>
         </w:rPr>
@@ -13826,7 +13954,6 @@
       <w:r>
         <w:rPr>
           <w:rFonts w:cs="Times New Roman"/>
-          <w:b w:val="0"/>
           <w:bCs w:val="0"/>
           <w:lang w:val="fr-BE"/>
         </w:rPr>
@@ -13867,7 +13994,7 @@
         <w:ind w:left="720"/>
         <w:rPr>
           <w:rFonts w:cs="Times New Roman"/>
-          <w:b w:val="0"/>
+          <w:b/>
           <w:bCs w:val="0"/>
           <w:lang w:val="fr-BE"/>
         </w:rPr>
@@ -13877,7 +14004,6 @@
       <w:r>
         <w:rPr>
           <w:rFonts w:cs="Times New Roman"/>
-          <w:b w:val="0"/>
           <w:bCs w:val="0"/>
           <w:lang w:val="fr-BE"/>
         </w:rPr>
@@ -13887,7 +14013,6 @@
       <w:r>
         <w:rPr>
           <w:rFonts w:cs="Times New Roman"/>
-          <w:b w:val="0"/>
           <w:bCs w:val="0"/>
           <w:lang w:val="fr-BE"/>
         </w:rPr>
@@ -13902,7 +14027,7 @@
         <w:ind w:left="720"/>
         <w:rPr>
           <w:rFonts w:cs="Times New Roman"/>
-          <w:b w:val="0"/>
+          <w:b/>
           <w:bCs w:val="0"/>
           <w:lang w:val="fr-BE"/>
         </w:rPr>
@@ -13912,7 +14037,6 @@
       <w:r>
         <w:rPr>
           <w:rFonts w:cs="Times New Roman"/>
-          <w:b w:val="0"/>
           <w:bCs w:val="0"/>
           <w:lang w:val="fr-BE"/>
         </w:rPr>
@@ -13922,7 +14046,6 @@
       <w:r>
         <w:rPr>
           <w:rFonts w:cs="Times New Roman"/>
-          <w:b w:val="0"/>
           <w:bCs w:val="0"/>
           <w:lang w:val="fr-BE"/>
         </w:rPr>
@@ -13937,7 +14060,7 @@
         <w:ind w:left="720"/>
         <w:rPr>
           <w:rFonts w:cs="Times New Roman"/>
-          <w:b w:val="0"/>
+          <w:b/>
           <w:bCs w:val="0"/>
           <w:lang w:val="fr-BE"/>
         </w:rPr>
@@ -13947,7 +14070,6 @@
       <w:r>
         <w:rPr>
           <w:rFonts w:cs="Times New Roman"/>
-          <w:b w:val="0"/>
           <w:bCs w:val="0"/>
           <w:lang w:val="fr-BE"/>
         </w:rPr>
@@ -13957,7 +14079,6 @@
       <w:r>
         <w:rPr>
           <w:rFonts w:cs="Times New Roman"/>
-          <w:b w:val="0"/>
           <w:bCs w:val="0"/>
           <w:lang w:val="fr-BE"/>
         </w:rPr>
@@ -14007,7 +14128,7 @@
         <w:ind w:left="720"/>
         <w:rPr>
           <w:rFonts w:cs="Times New Roman"/>
-          <w:b w:val="0"/>
+          <w:b/>
           <w:bCs w:val="0"/>
           <w:lang w:val="fr-BE"/>
         </w:rPr>
@@ -14017,7 +14138,6 @@
       <w:r>
         <w:rPr>
           <w:rFonts w:cs="Times New Roman"/>
-          <w:b w:val="0"/>
           <w:bCs w:val="0"/>
           <w:lang w:val="fr-BE"/>
         </w:rPr>
@@ -14027,7 +14147,6 @@
       <w:r>
         <w:rPr>
           <w:rFonts w:cs="Times New Roman"/>
-          <w:b w:val="0"/>
           <w:bCs w:val="0"/>
           <w:lang w:val="fr-BE"/>
         </w:rPr>
@@ -14042,7 +14161,7 @@
         <w:ind w:left="720"/>
         <w:rPr>
           <w:rFonts w:cs="Times New Roman"/>
-          <w:b w:val="0"/>
+          <w:b/>
           <w:bCs w:val="0"/>
           <w:lang w:val="fr-BE"/>
         </w:rPr>
@@ -14052,7 +14171,6 @@
       <w:r>
         <w:rPr>
           <w:rFonts w:cs="Times New Roman"/>
-          <w:b w:val="0"/>
           <w:bCs w:val="0"/>
           <w:lang w:val="fr-BE"/>
         </w:rPr>
@@ -14062,7 +14180,6 @@
       <w:r>
         <w:rPr>
           <w:rFonts w:cs="Times New Roman"/>
-          <w:b w:val="0"/>
           <w:bCs w:val="0"/>
           <w:lang w:val="fr-BE"/>
         </w:rPr>
@@ -14077,7 +14194,7 @@
         <w:ind w:left="720"/>
         <w:rPr>
           <w:rFonts w:cs="Times New Roman"/>
-          <w:b w:val="0"/>
+          <w:b/>
           <w:bCs w:val="0"/>
           <w:lang w:val="fr-BE"/>
         </w:rPr>
@@ -14087,7 +14204,6 @@
       <w:r>
         <w:rPr>
           <w:rFonts w:cs="Times New Roman"/>
-          <w:b w:val="0"/>
           <w:bCs w:val="0"/>
           <w:lang w:val="fr-BE"/>
         </w:rPr>
@@ -14097,7 +14213,6 @@
       <w:r>
         <w:rPr>
           <w:rFonts w:cs="Times New Roman"/>
-          <w:b w:val="0"/>
           <w:bCs w:val="0"/>
           <w:lang w:val="fr-BE"/>
         </w:rPr>
@@ -14147,7 +14262,7 @@
         <w:ind w:left="720"/>
         <w:rPr>
           <w:rFonts w:cs="Times New Roman"/>
-          <w:b w:val="0"/>
+          <w:b/>
           <w:bCs w:val="0"/>
           <w:lang w:val="fr-BE"/>
         </w:rPr>
@@ -14157,7 +14272,6 @@
       <w:r>
         <w:rPr>
           <w:rFonts w:cs="Times New Roman"/>
-          <w:b w:val="0"/>
           <w:bCs w:val="0"/>
           <w:lang w:val="fr-BE"/>
         </w:rPr>
@@ -14167,7 +14281,6 @@
       <w:r>
         <w:rPr>
           <w:rFonts w:cs="Times New Roman"/>
-          <w:b w:val="0"/>
           <w:bCs w:val="0"/>
           <w:lang w:val="fr-BE"/>
         </w:rPr>
@@ -14182,7 +14295,7 @@
         <w:ind w:left="720"/>
         <w:rPr>
           <w:rFonts w:cs="Times New Roman"/>
-          <w:b w:val="0"/>
+          <w:b/>
           <w:bCs w:val="0"/>
           <w:lang w:val="fr-BE"/>
         </w:rPr>
@@ -14192,7 +14305,6 @@
       <w:r>
         <w:rPr>
           <w:rFonts w:cs="Times New Roman"/>
-          <w:b w:val="0"/>
           <w:bCs w:val="0"/>
           <w:lang w:val="fr-BE"/>
         </w:rPr>
@@ -14202,7 +14314,6 @@
       <w:r>
         <w:rPr>
           <w:rFonts w:cs="Times New Roman"/>
-          <w:b w:val="0"/>
           <w:bCs w:val="0"/>
           <w:lang w:val="fr-BE"/>
         </w:rPr>
@@ -14217,7 +14328,7 @@
         <w:ind w:left="720"/>
         <w:rPr>
           <w:rFonts w:cs="Times New Roman"/>
-          <w:b w:val="0"/>
+          <w:b/>
           <w:bCs w:val="0"/>
           <w:lang w:val="fr-BE"/>
         </w:rPr>
@@ -14227,7 +14338,6 @@
       <w:r>
         <w:rPr>
           <w:rFonts w:cs="Times New Roman"/>
-          <w:b w:val="0"/>
           <w:bCs w:val="0"/>
           <w:lang w:val="fr-BE"/>
         </w:rPr>
@@ -14237,7 +14347,6 @@
       <w:r>
         <w:rPr>
           <w:rFonts w:cs="Times New Roman"/>
-          <w:b w:val="0"/>
           <w:bCs w:val="0"/>
           <w:lang w:val="fr-BE"/>
         </w:rPr>
@@ -14286,7 +14395,7 @@
         <w:ind w:left="720"/>
         <w:rPr>
           <w:rFonts w:cs="Times New Roman"/>
-          <w:b w:val="0"/>
+          <w:b/>
           <w:bCs w:val="0"/>
           <w:lang w:val="fr-BE"/>
         </w:rPr>
@@ -14296,7 +14405,6 @@
       <w:r>
         <w:rPr>
           <w:rFonts w:cs="Times New Roman"/>
-          <w:b w:val="0"/>
           <w:bCs w:val="0"/>
           <w:lang w:val="fr-BE"/>
         </w:rPr>
@@ -14306,7 +14414,6 @@
       <w:r>
         <w:rPr>
           <w:rFonts w:cs="Times New Roman"/>
-          <w:b w:val="0"/>
           <w:bCs w:val="0"/>
           <w:lang w:val="fr-BE"/>
         </w:rPr>
@@ -14321,7 +14428,7 @@
         <w:ind w:left="720"/>
         <w:rPr>
           <w:rFonts w:cs="Times New Roman"/>
-          <w:b w:val="0"/>
+          <w:b/>
           <w:bCs w:val="0"/>
           <w:lang w:val="fr-BE"/>
         </w:rPr>
@@ -14331,7 +14438,6 @@
       <w:r>
         <w:rPr>
           <w:rFonts w:cs="Times New Roman"/>
-          <w:b w:val="0"/>
           <w:bCs w:val="0"/>
           <w:lang w:val="fr-BE"/>
         </w:rPr>
@@ -14341,7 +14447,6 @@
       <w:r>
         <w:rPr>
           <w:rFonts w:cs="Times New Roman"/>
-          <w:b w:val="0"/>
           <w:bCs w:val="0"/>
           <w:lang w:val="fr-BE"/>
         </w:rPr>
@@ -14356,7 +14461,7 @@
         <w:ind w:left="720"/>
         <w:rPr>
           <w:rFonts w:cs="Times New Roman"/>
-          <w:b w:val="0"/>
+          <w:b/>
           <w:bCs w:val="0"/>
           <w:lang w:val="fr-BE"/>
         </w:rPr>
@@ -14366,7 +14471,6 @@
       <w:r>
         <w:rPr>
           <w:rFonts w:cs="Times New Roman"/>
-          <w:b w:val="0"/>
           <w:bCs w:val="0"/>
           <w:lang w:val="fr-BE"/>
         </w:rPr>
@@ -14376,7 +14480,6 @@
       <w:r>
         <w:rPr>
           <w:rFonts w:cs="Times New Roman"/>
-          <w:b w:val="0"/>
           <w:bCs w:val="0"/>
           <w:lang w:val="fr-BE"/>
         </w:rPr>
@@ -14425,7 +14528,7 @@
         <w:ind w:left="720"/>
         <w:rPr>
           <w:rFonts w:cs="Times New Roman"/>
-          <w:b w:val="0"/>
+          <w:b/>
           <w:bCs w:val="0"/>
         </w:rPr>
       </w:pPr>
@@ -14433,7 +14536,6 @@
       <w:r>
         <w:rPr>
           <w:rFonts w:cs="Times New Roman"/>
-          <w:b w:val="0"/>
           <w:bCs w:val="0"/>
         </w:rPr>
         <w:t>Subsection 1</w:t>
@@ -14447,7 +14549,7 @@
         <w:ind w:left="720"/>
         <w:rPr>
           <w:rFonts w:cs="Times New Roman"/>
-          <w:b w:val="0"/>
+          <w:b/>
           <w:bCs w:val="0"/>
         </w:rPr>
       </w:pPr>
@@ -14455,7 +14557,6 @@
       <w:r>
         <w:rPr>
           <w:rFonts w:cs="Times New Roman"/>
-          <w:b w:val="0"/>
           <w:bCs w:val="0"/>
         </w:rPr>
         <w:t>Subsection 2</w:t>
@@ -14469,7 +14570,7 @@
         <w:ind w:left="720"/>
         <w:rPr>
           <w:rFonts w:cs="Times New Roman"/>
-          <w:b w:val="0"/>
+          <w:b/>
           <w:bCs w:val="0"/>
         </w:rPr>
       </w:pPr>
@@ -14477,7 +14578,6 @@
       <w:r>
         <w:rPr>
           <w:rFonts w:cs="Times New Roman"/>
-          <w:b w:val="0"/>
           <w:bCs w:val="0"/>
         </w:rPr>
         <w:t>Subsection 3</w:t>
@@ -14551,7 +14651,7 @@
         <w:ind w:left="720"/>
         <w:rPr>
           <w:rFonts w:cs="Times New Roman"/>
-          <w:b w:val="0"/>
+          <w:b/>
           <w:bCs w:val="0"/>
           <w:lang w:val="fr-BE"/>
         </w:rPr>
@@ -14561,7 +14661,6 @@
       <w:r>
         <w:rPr>
           <w:rFonts w:cs="Times New Roman"/>
-          <w:b w:val="0"/>
           <w:bCs w:val="0"/>
           <w:lang w:val="fr-BE"/>
         </w:rPr>
@@ -14571,7 +14670,6 @@
       <w:r>
         <w:rPr>
           <w:rFonts w:cs="Times New Roman"/>
-          <w:b w:val="0"/>
           <w:bCs w:val="0"/>
           <w:lang w:val="fr-BE"/>
         </w:rPr>
@@ -14586,7 +14684,7 @@
         <w:ind w:left="720"/>
         <w:rPr>
           <w:rFonts w:cs="Times New Roman"/>
-          <w:b w:val="0"/>
+          <w:b/>
           <w:bCs w:val="0"/>
           <w:lang w:val="fr-BE"/>
         </w:rPr>
@@ -14596,7 +14694,6 @@
       <w:r>
         <w:rPr>
           <w:rFonts w:cs="Times New Roman"/>
-          <w:b w:val="0"/>
           <w:bCs w:val="0"/>
           <w:lang w:val="fr-BE"/>
         </w:rPr>
@@ -14606,7 +14703,6 @@
       <w:r>
         <w:rPr>
           <w:rFonts w:cs="Times New Roman"/>
-          <w:b w:val="0"/>
           <w:bCs w:val="0"/>
           <w:lang w:val="fr-BE"/>
         </w:rPr>
@@ -14621,7 +14717,7 @@
         <w:ind w:left="720"/>
         <w:rPr>
           <w:rFonts w:cs="Times New Roman"/>
-          <w:b w:val="0"/>
+          <w:b/>
           <w:bCs w:val="0"/>
           <w:lang w:val="fr-BE"/>
         </w:rPr>
@@ -14631,7 +14727,6 @@
       <w:r>
         <w:rPr>
           <w:rFonts w:cs="Times New Roman"/>
-          <w:b w:val="0"/>
           <w:bCs w:val="0"/>
           <w:lang w:val="fr-BE"/>
         </w:rPr>
@@ -14641,7 +14736,6 @@
       <w:r>
         <w:rPr>
           <w:rFonts w:cs="Times New Roman"/>
-          <w:b w:val="0"/>
           <w:bCs w:val="0"/>
           <w:lang w:val="fr-BE"/>
         </w:rPr>
@@ -14682,7 +14776,7 @@
         <w:ind w:left="720"/>
         <w:rPr>
           <w:rFonts w:cs="Times New Roman"/>
-          <w:b w:val="0"/>
+          <w:b/>
           <w:bCs w:val="0"/>
           <w:lang w:val="fr-BE"/>
         </w:rPr>
@@ -14692,7 +14786,6 @@
       <w:r>
         <w:rPr>
           <w:rFonts w:cs="Times New Roman"/>
-          <w:b w:val="0"/>
           <w:bCs w:val="0"/>
           <w:lang w:val="fr-BE"/>
         </w:rPr>
@@ -14702,7 +14795,6 @@
       <w:r>
         <w:rPr>
           <w:rFonts w:cs="Times New Roman"/>
-          <w:b w:val="0"/>
           <w:bCs w:val="0"/>
           <w:lang w:val="fr-BE"/>
         </w:rPr>
@@ -14717,7 +14809,7 @@
         <w:ind w:left="720"/>
         <w:rPr>
           <w:rFonts w:cs="Times New Roman"/>
-          <w:b w:val="0"/>
+          <w:b/>
           <w:bCs w:val="0"/>
           <w:lang w:val="fr-BE"/>
         </w:rPr>
@@ -14727,7 +14819,6 @@
       <w:r>
         <w:rPr>
           <w:rFonts w:cs="Times New Roman"/>
-          <w:b w:val="0"/>
           <w:bCs w:val="0"/>
           <w:lang w:val="fr-BE"/>
         </w:rPr>
@@ -14737,7 +14828,6 @@
       <w:r>
         <w:rPr>
           <w:rFonts w:cs="Times New Roman"/>
-          <w:b w:val="0"/>
           <w:bCs w:val="0"/>
           <w:lang w:val="fr-BE"/>
         </w:rPr>
@@ -14752,7 +14842,7 @@
         <w:ind w:left="720"/>
         <w:rPr>
           <w:rFonts w:cs="Times New Roman"/>
-          <w:b w:val="0"/>
+          <w:b/>
           <w:bCs w:val="0"/>
           <w:lang w:val="fr-BE"/>
         </w:rPr>
@@ -14762,7 +14852,6 @@
       <w:r>
         <w:rPr>
           <w:rFonts w:cs="Times New Roman"/>
-          <w:b w:val="0"/>
           <w:bCs w:val="0"/>
           <w:lang w:val="fr-BE"/>
         </w:rPr>
@@ -14772,7 +14861,6 @@
       <w:r>
         <w:rPr>
           <w:rFonts w:cs="Times New Roman"/>
-          <w:b w:val="0"/>
           <w:bCs w:val="0"/>
           <w:lang w:val="fr-BE"/>
         </w:rPr>
@@ -14822,7 +14910,7 @@
         <w:ind w:left="720"/>
         <w:rPr>
           <w:rFonts w:cs="Times New Roman"/>
-          <w:b w:val="0"/>
+          <w:b/>
           <w:bCs w:val="0"/>
           <w:lang w:val="fr-BE"/>
         </w:rPr>
@@ -14832,7 +14920,6 @@
       <w:r>
         <w:rPr>
           <w:rFonts w:cs="Times New Roman"/>
-          <w:b w:val="0"/>
           <w:bCs w:val="0"/>
           <w:lang w:val="fr-BE"/>
         </w:rPr>
@@ -14842,7 +14929,6 @@
       <w:r>
         <w:rPr>
           <w:rFonts w:cs="Times New Roman"/>
-          <w:b w:val="0"/>
           <w:bCs w:val="0"/>
           <w:lang w:val="fr-BE"/>
         </w:rPr>
@@ -14857,7 +14943,7 @@
         <w:ind w:left="720"/>
         <w:rPr>
           <w:rFonts w:cs="Times New Roman"/>
-          <w:b w:val="0"/>
+          <w:b/>
           <w:bCs w:val="0"/>
           <w:lang w:val="fr-BE"/>
         </w:rPr>
@@ -14867,7 +14953,6 @@
       <w:r>
         <w:rPr>
           <w:rFonts w:cs="Times New Roman"/>
-          <w:b w:val="0"/>
           <w:bCs w:val="0"/>
           <w:lang w:val="fr-BE"/>
         </w:rPr>
@@ -14877,7 +14962,6 @@
       <w:r>
         <w:rPr>
           <w:rFonts w:cs="Times New Roman"/>
-          <w:b w:val="0"/>
           <w:bCs w:val="0"/>
           <w:lang w:val="fr-BE"/>
         </w:rPr>
@@ -14892,7 +14976,7 @@
         <w:ind w:left="720"/>
         <w:rPr>
           <w:rFonts w:cs="Times New Roman"/>
-          <w:b w:val="0"/>
+          <w:b/>
           <w:bCs w:val="0"/>
           <w:lang w:val="fr-BE"/>
         </w:rPr>
@@ -14902,7 +14986,6 @@
       <w:r>
         <w:rPr>
           <w:rFonts w:cs="Times New Roman"/>
-          <w:b w:val="0"/>
           <w:bCs w:val="0"/>
           <w:lang w:val="fr-BE"/>
         </w:rPr>
@@ -14912,7 +14995,6 @@
       <w:r>
         <w:rPr>
           <w:rFonts w:cs="Times New Roman"/>
-          <w:b w:val="0"/>
           <w:bCs w:val="0"/>
           <w:lang w:val="fr-BE"/>
         </w:rPr>
@@ -14962,7 +15044,7 @@
         <w:ind w:left="720"/>
         <w:rPr>
           <w:rFonts w:cs="Times New Roman"/>
-          <w:b w:val="0"/>
+          <w:b/>
           <w:bCs w:val="0"/>
           <w:lang w:val="fr-BE"/>
         </w:rPr>
@@ -14972,7 +15054,6 @@
       <w:r>
         <w:rPr>
           <w:rFonts w:cs="Times New Roman"/>
-          <w:b w:val="0"/>
           <w:bCs w:val="0"/>
           <w:lang w:val="fr-BE"/>
         </w:rPr>
@@ -14982,7 +15063,6 @@
       <w:r>
         <w:rPr>
           <w:rFonts w:cs="Times New Roman"/>
-          <w:b w:val="0"/>
           <w:bCs w:val="0"/>
           <w:lang w:val="fr-BE"/>
         </w:rPr>
@@ -14997,7 +15077,7 @@
         <w:ind w:left="720"/>
         <w:rPr>
           <w:rFonts w:cs="Times New Roman"/>
-          <w:b w:val="0"/>
+          <w:b/>
           <w:bCs w:val="0"/>
           <w:lang w:val="fr-BE"/>
         </w:rPr>
@@ -15007,7 +15087,6 @@
       <w:r>
         <w:rPr>
           <w:rFonts w:cs="Times New Roman"/>
-          <w:b w:val="0"/>
           <w:bCs w:val="0"/>
           <w:lang w:val="fr-BE"/>
         </w:rPr>
@@ -15017,7 +15096,6 @@
       <w:r>
         <w:rPr>
           <w:rFonts w:cs="Times New Roman"/>
-          <w:b w:val="0"/>
           <w:bCs w:val="0"/>
           <w:lang w:val="fr-BE"/>
         </w:rPr>
@@ -15032,7 +15110,7 @@
         <w:ind w:left="720"/>
         <w:rPr>
           <w:rFonts w:cs="Times New Roman"/>
-          <w:b w:val="0"/>
+          <w:b/>
           <w:bCs w:val="0"/>
           <w:lang w:val="fr-BE"/>
         </w:rPr>
@@ -15042,7 +15120,6 @@
       <w:r>
         <w:rPr>
           <w:rFonts w:cs="Times New Roman"/>
-          <w:b w:val="0"/>
           <w:bCs w:val="0"/>
           <w:lang w:val="fr-BE"/>
         </w:rPr>
@@ -15052,7 +15129,6 @@
       <w:r>
         <w:rPr>
           <w:rFonts w:cs="Times New Roman"/>
-          <w:b w:val="0"/>
           <w:bCs w:val="0"/>
           <w:lang w:val="fr-BE"/>
         </w:rPr>
@@ -15101,7 +15177,7 @@
         <w:ind w:left="720"/>
         <w:rPr>
           <w:rFonts w:cs="Times New Roman"/>
-          <w:b w:val="0"/>
+          <w:b/>
           <w:bCs w:val="0"/>
           <w:lang w:val="fr-BE"/>
         </w:rPr>
@@ -15111,7 +15187,6 @@
       <w:r>
         <w:rPr>
           <w:rFonts w:cs="Times New Roman"/>
-          <w:b w:val="0"/>
           <w:bCs w:val="0"/>
           <w:lang w:val="fr-BE"/>
         </w:rPr>
@@ -15121,7 +15196,6 @@
       <w:r>
         <w:rPr>
           <w:rFonts w:cs="Times New Roman"/>
-          <w:b w:val="0"/>
           <w:bCs w:val="0"/>
           <w:lang w:val="fr-BE"/>
         </w:rPr>
@@ -15136,7 +15210,7 @@
         <w:ind w:left="720"/>
         <w:rPr>
           <w:rFonts w:cs="Times New Roman"/>
-          <w:b w:val="0"/>
+          <w:b/>
           <w:bCs w:val="0"/>
           <w:lang w:val="fr-BE"/>
         </w:rPr>
@@ -15146,7 +15220,6 @@
       <w:r>
         <w:rPr>
           <w:rFonts w:cs="Times New Roman"/>
-          <w:b w:val="0"/>
           <w:bCs w:val="0"/>
           <w:lang w:val="fr-BE"/>
         </w:rPr>
@@ -15156,7 +15229,6 @@
       <w:r>
         <w:rPr>
           <w:rFonts w:cs="Times New Roman"/>
-          <w:b w:val="0"/>
           <w:bCs w:val="0"/>
           <w:lang w:val="fr-BE"/>
         </w:rPr>
@@ -15171,7 +15243,7 @@
         <w:ind w:left="720"/>
         <w:rPr>
           <w:rFonts w:cs="Times New Roman"/>
-          <w:b w:val="0"/>
+          <w:b/>
           <w:bCs w:val="0"/>
           <w:lang w:val="fr-BE"/>
         </w:rPr>
@@ -15181,7 +15253,6 @@
       <w:r>
         <w:rPr>
           <w:rFonts w:cs="Times New Roman"/>
-          <w:b w:val="0"/>
           <w:bCs w:val="0"/>
           <w:lang w:val="fr-BE"/>
         </w:rPr>
@@ -15191,7 +15262,6 @@
       <w:r>
         <w:rPr>
           <w:rFonts w:cs="Times New Roman"/>
-          <w:b w:val="0"/>
           <w:bCs w:val="0"/>
           <w:lang w:val="fr-BE"/>
         </w:rPr>
@@ -15240,7 +15310,7 @@
         <w:ind w:left="720"/>
         <w:rPr>
           <w:rFonts w:cs="Times New Roman"/>
-          <w:b w:val="0"/>
+          <w:b/>
           <w:bCs w:val="0"/>
           <w:lang w:val="fr-BE"/>
         </w:rPr>
@@ -15250,7 +15320,6 @@
       <w:r>
         <w:rPr>
           <w:rFonts w:cs="Times New Roman"/>
-          <w:b w:val="0"/>
           <w:bCs w:val="0"/>
           <w:lang w:val="fr-BE"/>
         </w:rPr>
@@ -15260,7 +15329,6 @@
       <w:r>
         <w:rPr>
           <w:rFonts w:cs="Times New Roman"/>
-          <w:b w:val="0"/>
           <w:bCs w:val="0"/>
           <w:lang w:val="fr-BE"/>
         </w:rPr>
@@ -15275,7 +15343,7 @@
         <w:ind w:left="720"/>
         <w:rPr>
           <w:rFonts w:cs="Times New Roman"/>
-          <w:b w:val="0"/>
+          <w:b/>
           <w:bCs w:val="0"/>
           <w:lang w:val="fr-BE"/>
         </w:rPr>
@@ -15285,7 +15353,6 @@
       <w:r>
         <w:rPr>
           <w:rFonts w:cs="Times New Roman"/>
-          <w:b w:val="0"/>
           <w:bCs w:val="0"/>
           <w:lang w:val="fr-BE"/>
         </w:rPr>
@@ -15295,7 +15362,6 @@
       <w:r>
         <w:rPr>
           <w:rFonts w:cs="Times New Roman"/>
-          <w:b w:val="0"/>
           <w:bCs w:val="0"/>
           <w:lang w:val="fr-BE"/>
         </w:rPr>
@@ -15310,7 +15376,7 @@
         <w:ind w:left="720"/>
         <w:rPr>
           <w:rFonts w:cs="Times New Roman"/>
-          <w:b w:val="0"/>
+          <w:b/>
           <w:bCs w:val="0"/>
           <w:lang w:val="fr-BE"/>
         </w:rPr>
@@ -15320,7 +15386,6 @@
       <w:r>
         <w:rPr>
           <w:rFonts w:cs="Times New Roman"/>
-          <w:b w:val="0"/>
           <w:bCs w:val="0"/>
           <w:lang w:val="fr-BE"/>
         </w:rPr>
@@ -15330,7 +15395,6 @@
       <w:r>
         <w:rPr>
           <w:rFonts w:cs="Times New Roman"/>
-          <w:b w:val="0"/>
           <w:bCs w:val="0"/>
           <w:lang w:val="fr-BE"/>
         </w:rPr>
@@ -15464,7 +15528,7 @@
         <w:ind w:left="720"/>
         <w:rPr>
           <w:rFonts w:cs="Times New Roman"/>
-          <w:b w:val="0"/>
+          <w:b/>
           <w:bCs w:val="0"/>
           <w:lang w:val="fr-BE"/>
         </w:rPr>
@@ -15474,7 +15538,6 @@
       <w:r>
         <w:rPr>
           <w:rFonts w:cs="Times New Roman"/>
-          <w:b w:val="0"/>
           <w:bCs w:val="0"/>
           <w:lang w:val="fr-BE"/>
         </w:rPr>
@@ -15484,7 +15547,6 @@
       <w:r>
         <w:rPr>
           <w:rFonts w:cs="Times New Roman"/>
-          <w:b w:val="0"/>
           <w:bCs w:val="0"/>
           <w:lang w:val="fr-BE"/>
         </w:rPr>
@@ -15499,7 +15561,7 @@
         <w:ind w:left="720"/>
         <w:rPr>
           <w:rFonts w:cs="Times New Roman"/>
-          <w:b w:val="0"/>
+          <w:b/>
           <w:bCs w:val="0"/>
           <w:lang w:val="fr-BE"/>
         </w:rPr>
@@ -15509,7 +15571,6 @@
       <w:r>
         <w:rPr>
           <w:rFonts w:cs="Times New Roman"/>
-          <w:b w:val="0"/>
           <w:bCs w:val="0"/>
           <w:lang w:val="fr-BE"/>
         </w:rPr>
@@ -15519,7 +15580,6 @@
       <w:r>
         <w:rPr>
           <w:rFonts w:cs="Times New Roman"/>
-          <w:b w:val="0"/>
           <w:bCs w:val="0"/>
           <w:lang w:val="fr-BE"/>
         </w:rPr>
@@ -15534,7 +15594,7 @@
         <w:ind w:left="720"/>
         <w:rPr>
           <w:rFonts w:cs="Times New Roman"/>
-          <w:b w:val="0"/>
+          <w:b/>
           <w:bCs w:val="0"/>
           <w:lang w:val="fr-BE"/>
         </w:rPr>
@@ -15544,7 +15604,6 @@
       <w:r>
         <w:rPr>
           <w:rFonts w:cs="Times New Roman"/>
-          <w:b w:val="0"/>
           <w:bCs w:val="0"/>
           <w:lang w:val="fr-BE"/>
         </w:rPr>
@@ -15554,7 +15613,6 @@
       <w:r>
         <w:rPr>
           <w:rFonts w:cs="Times New Roman"/>
-          <w:b w:val="0"/>
           <w:bCs w:val="0"/>
           <w:lang w:val="fr-BE"/>
         </w:rPr>
@@ -15595,7 +15653,7 @@
         <w:ind w:left="720"/>
         <w:rPr>
           <w:rFonts w:cs="Times New Roman"/>
-          <w:b w:val="0"/>
+          <w:b/>
           <w:bCs w:val="0"/>
           <w:lang w:val="fr-BE"/>
         </w:rPr>
@@ -15605,7 +15663,6 @@
       <w:r>
         <w:rPr>
           <w:rFonts w:cs="Times New Roman"/>
-          <w:b w:val="0"/>
           <w:bCs w:val="0"/>
           <w:lang w:val="fr-BE"/>
         </w:rPr>
@@ -15615,7 +15672,6 @@
       <w:r>
         <w:rPr>
           <w:rFonts w:cs="Times New Roman"/>
-          <w:b w:val="0"/>
           <w:bCs w:val="0"/>
           <w:lang w:val="fr-BE"/>
         </w:rPr>
@@ -15630,7 +15686,7 @@
         <w:ind w:left="720"/>
         <w:rPr>
           <w:rFonts w:cs="Times New Roman"/>
-          <w:b w:val="0"/>
+          <w:b/>
           <w:bCs w:val="0"/>
           <w:lang w:val="fr-BE"/>
         </w:rPr>
@@ -15640,7 +15696,6 @@
       <w:r>
         <w:rPr>
           <w:rFonts w:cs="Times New Roman"/>
-          <w:b w:val="0"/>
           <w:bCs w:val="0"/>
           <w:lang w:val="fr-BE"/>
         </w:rPr>
@@ -15650,7 +15705,6 @@
       <w:r>
         <w:rPr>
           <w:rFonts w:cs="Times New Roman"/>
-          <w:b w:val="0"/>
           <w:bCs w:val="0"/>
           <w:lang w:val="fr-BE"/>
         </w:rPr>
@@ -15665,7 +15719,7 @@
         <w:ind w:left="720"/>
         <w:rPr>
           <w:rFonts w:cs="Times New Roman"/>
-          <w:b w:val="0"/>
+          <w:b/>
           <w:bCs w:val="0"/>
           <w:lang w:val="fr-BE"/>
         </w:rPr>
@@ -15675,7 +15729,6 @@
       <w:r>
         <w:rPr>
           <w:rFonts w:cs="Times New Roman"/>
-          <w:b w:val="0"/>
           <w:bCs w:val="0"/>
           <w:lang w:val="fr-BE"/>
         </w:rPr>
@@ -15685,7 +15738,6 @@
       <w:r>
         <w:rPr>
           <w:rFonts w:cs="Times New Roman"/>
-          <w:b w:val="0"/>
           <w:bCs w:val="0"/>
           <w:lang w:val="fr-BE"/>
         </w:rPr>
@@ -15735,7 +15787,7 @@
         <w:ind w:left="720"/>
         <w:rPr>
           <w:rFonts w:cs="Times New Roman"/>
-          <w:b w:val="0"/>
+          <w:b/>
           <w:bCs w:val="0"/>
           <w:lang w:val="fr-BE"/>
         </w:rPr>
@@ -15745,7 +15797,6 @@
       <w:r>
         <w:rPr>
           <w:rFonts w:cs="Times New Roman"/>
-          <w:b w:val="0"/>
           <w:bCs w:val="0"/>
           <w:lang w:val="fr-BE"/>
         </w:rPr>
@@ -15755,7 +15806,6 @@
       <w:r>
         <w:rPr>
           <w:rFonts w:cs="Times New Roman"/>
-          <w:b w:val="0"/>
           <w:bCs w:val="0"/>
           <w:lang w:val="fr-BE"/>
         </w:rPr>
@@ -15770,7 +15820,7 @@
         <w:ind w:left="720"/>
         <w:rPr>
           <w:rFonts w:cs="Times New Roman"/>
-          <w:b w:val="0"/>
+          <w:b/>
           <w:bCs w:val="0"/>
           <w:lang w:val="fr-BE"/>
         </w:rPr>
@@ -15780,7 +15830,6 @@
       <w:r>
         <w:rPr>
           <w:rFonts w:cs="Times New Roman"/>
-          <w:b w:val="0"/>
           <w:bCs w:val="0"/>
           <w:lang w:val="fr-BE"/>
         </w:rPr>
@@ -15790,7 +15839,6 @@
       <w:r>
         <w:rPr>
           <w:rFonts w:cs="Times New Roman"/>
-          <w:b w:val="0"/>
           <w:bCs w:val="0"/>
           <w:lang w:val="fr-BE"/>
         </w:rPr>
@@ -15805,7 +15853,7 @@
         <w:ind w:left="720"/>
         <w:rPr>
           <w:rFonts w:cs="Times New Roman"/>
-          <w:b w:val="0"/>
+          <w:b/>
           <w:bCs w:val="0"/>
           <w:lang w:val="fr-BE"/>
         </w:rPr>
@@ -15815,7 +15863,6 @@
       <w:r>
         <w:rPr>
           <w:rFonts w:cs="Times New Roman"/>
-          <w:b w:val="0"/>
           <w:bCs w:val="0"/>
           <w:lang w:val="fr-BE"/>
         </w:rPr>
@@ -15825,7 +15872,6 @@
       <w:r>
         <w:rPr>
           <w:rFonts w:cs="Times New Roman"/>
-          <w:b w:val="0"/>
           <w:bCs w:val="0"/>
           <w:lang w:val="fr-BE"/>
         </w:rPr>
@@ -15875,7 +15921,7 @@
         <w:ind w:left="720"/>
         <w:rPr>
           <w:rFonts w:cs="Times New Roman"/>
-          <w:b w:val="0"/>
+          <w:b/>
           <w:bCs w:val="0"/>
           <w:lang w:val="fr-BE"/>
         </w:rPr>
@@ -15885,7 +15931,6 @@
       <w:r>
         <w:rPr>
           <w:rFonts w:cs="Times New Roman"/>
-          <w:b w:val="0"/>
           <w:bCs w:val="0"/>
           <w:lang w:val="fr-BE"/>
         </w:rPr>
@@ -15895,7 +15940,6 @@
       <w:r>
         <w:rPr>
           <w:rFonts w:cs="Times New Roman"/>
-          <w:b w:val="0"/>
           <w:bCs w:val="0"/>
           <w:lang w:val="fr-BE"/>
         </w:rPr>
@@ -15910,7 +15954,7 @@
         <w:ind w:left="720"/>
         <w:rPr>
           <w:rFonts w:cs="Times New Roman"/>
-          <w:b w:val="0"/>
+          <w:b/>
           <w:bCs w:val="0"/>
           <w:lang w:val="fr-BE"/>
         </w:rPr>
@@ -15920,7 +15964,6 @@
       <w:r>
         <w:rPr>
           <w:rFonts w:cs="Times New Roman"/>
-          <w:b w:val="0"/>
           <w:bCs w:val="0"/>
           <w:lang w:val="fr-BE"/>
         </w:rPr>
@@ -15930,7 +15973,6 @@
       <w:r>
         <w:rPr>
           <w:rFonts w:cs="Times New Roman"/>
-          <w:b w:val="0"/>
           <w:bCs w:val="0"/>
           <w:lang w:val="fr-BE"/>
         </w:rPr>
@@ -15945,7 +15987,7 @@
         <w:ind w:left="720"/>
         <w:rPr>
           <w:rFonts w:cs="Times New Roman"/>
-          <w:b w:val="0"/>
+          <w:b/>
           <w:bCs w:val="0"/>
           <w:lang w:val="fr-BE"/>
         </w:rPr>
@@ -15955,7 +15997,6 @@
       <w:r>
         <w:rPr>
           <w:rFonts w:cs="Times New Roman"/>
-          <w:b w:val="0"/>
           <w:bCs w:val="0"/>
           <w:lang w:val="fr-BE"/>
         </w:rPr>
@@ -15965,7 +16006,6 @@
       <w:r>
         <w:rPr>
           <w:rFonts w:cs="Times New Roman"/>
-          <w:b w:val="0"/>
           <w:bCs w:val="0"/>
           <w:lang w:val="fr-BE"/>
         </w:rPr>
@@ -16014,7 +16054,7 @@
         <w:ind w:left="720"/>
         <w:rPr>
           <w:rFonts w:cs="Times New Roman"/>
-          <w:b w:val="0"/>
+          <w:b/>
           <w:bCs w:val="0"/>
           <w:lang w:val="fr-BE"/>
         </w:rPr>
@@ -16024,7 +16064,6 @@
       <w:r>
         <w:rPr>
           <w:rFonts w:cs="Times New Roman"/>
-          <w:b w:val="0"/>
           <w:bCs w:val="0"/>
           <w:lang w:val="fr-BE"/>
         </w:rPr>
@@ -16034,7 +16073,6 @@
       <w:r>
         <w:rPr>
           <w:rFonts w:cs="Times New Roman"/>
-          <w:b w:val="0"/>
           <w:bCs w:val="0"/>
           <w:lang w:val="fr-BE"/>
         </w:rPr>
@@ -16049,7 +16087,7 @@
         <w:ind w:left="720"/>
         <w:rPr>
           <w:rFonts w:cs="Times New Roman"/>
-          <w:b w:val="0"/>
+          <w:b/>
           <w:bCs w:val="0"/>
           <w:lang w:val="fr-BE"/>
         </w:rPr>
@@ -16059,7 +16097,6 @@
       <w:r>
         <w:rPr>
           <w:rFonts w:cs="Times New Roman"/>
-          <w:b w:val="0"/>
           <w:bCs w:val="0"/>
           <w:lang w:val="fr-BE"/>
         </w:rPr>
@@ -16069,7 +16106,6 @@
       <w:r>
         <w:rPr>
           <w:rFonts w:cs="Times New Roman"/>
-          <w:b w:val="0"/>
           <w:bCs w:val="0"/>
           <w:lang w:val="fr-BE"/>
         </w:rPr>
@@ -16084,7 +16120,7 @@
         <w:ind w:left="720"/>
         <w:rPr>
           <w:rFonts w:cs="Times New Roman"/>
-          <w:b w:val="0"/>
+          <w:b/>
           <w:bCs w:val="0"/>
           <w:lang w:val="fr-BE"/>
         </w:rPr>
@@ -16094,7 +16130,6 @@
       <w:r>
         <w:rPr>
           <w:rFonts w:cs="Times New Roman"/>
-          <w:b w:val="0"/>
           <w:bCs w:val="0"/>
           <w:lang w:val="fr-BE"/>
         </w:rPr>
@@ -16104,7 +16139,6 @@
       <w:r>
         <w:rPr>
           <w:rFonts w:cs="Times New Roman"/>
-          <w:b w:val="0"/>
           <w:bCs w:val="0"/>
           <w:lang w:val="fr-BE"/>
         </w:rPr>
@@ -16153,7 +16187,7 @@
         <w:ind w:left="720"/>
         <w:rPr>
           <w:rFonts w:cs="Times New Roman"/>
-          <w:b w:val="0"/>
+          <w:b/>
           <w:bCs w:val="0"/>
           <w:lang w:val="fr-BE"/>
         </w:rPr>
@@ -16163,7 +16197,6 @@
       <w:r>
         <w:rPr>
           <w:rFonts w:cs="Times New Roman"/>
-          <w:b w:val="0"/>
           <w:bCs w:val="0"/>
           <w:lang w:val="fr-BE"/>
         </w:rPr>
@@ -16173,7 +16206,6 @@
       <w:r>
         <w:rPr>
           <w:rFonts w:cs="Times New Roman"/>
-          <w:b w:val="0"/>
           <w:bCs w:val="0"/>
           <w:lang w:val="fr-BE"/>
         </w:rPr>
@@ -16188,7 +16220,7 @@
         <w:ind w:left="720"/>
         <w:rPr>
           <w:rFonts w:cs="Times New Roman"/>
-          <w:b w:val="0"/>
+          <w:b/>
           <w:bCs w:val="0"/>
           <w:lang w:val="fr-BE"/>
         </w:rPr>
@@ -16198,7 +16230,6 @@
       <w:r>
         <w:rPr>
           <w:rFonts w:cs="Times New Roman"/>
-          <w:b w:val="0"/>
           <w:bCs w:val="0"/>
           <w:lang w:val="fr-BE"/>
         </w:rPr>
@@ -16208,7 +16239,6 @@
       <w:r>
         <w:rPr>
           <w:rFonts w:cs="Times New Roman"/>
-          <w:b w:val="0"/>
           <w:bCs w:val="0"/>
           <w:lang w:val="fr-BE"/>
         </w:rPr>
@@ -16223,7 +16253,7 @@
         <w:ind w:left="720"/>
         <w:rPr>
           <w:rFonts w:cs="Times New Roman"/>
-          <w:b w:val="0"/>
+          <w:b/>
           <w:bCs w:val="0"/>
           <w:lang w:val="fr-BE"/>
         </w:rPr>
@@ -16233,7 +16263,6 @@
       <w:r>
         <w:rPr>
           <w:rFonts w:cs="Times New Roman"/>
-          <w:b w:val="0"/>
           <w:bCs w:val="0"/>
           <w:lang w:val="fr-BE"/>
         </w:rPr>
@@ -16243,7 +16272,6 @@
       <w:r>
         <w:rPr>
           <w:rFonts w:cs="Times New Roman"/>
-          <w:b w:val="0"/>
           <w:bCs w:val="0"/>
           <w:lang w:val="fr-BE"/>
         </w:rPr>
@@ -16337,7 +16365,7 @@
         <w:ind w:left="720"/>
         <w:rPr>
           <w:rFonts w:cs="Times New Roman"/>
-          <w:b w:val="0"/>
+          <w:b/>
           <w:bCs w:val="0"/>
           <w:lang w:val="fr-BE"/>
         </w:rPr>
@@ -16347,7 +16375,6 @@
       <w:r>
         <w:rPr>
           <w:rFonts w:cs="Times New Roman"/>
-          <w:b w:val="0"/>
           <w:bCs w:val="0"/>
           <w:lang w:val="fr-BE"/>
         </w:rPr>
@@ -16357,7 +16384,6 @@
       <w:r>
         <w:rPr>
           <w:rFonts w:cs="Times New Roman"/>
-          <w:b w:val="0"/>
           <w:bCs w:val="0"/>
           <w:lang w:val="fr-BE"/>
         </w:rPr>
@@ -16372,7 +16398,7 @@
         <w:ind w:left="720"/>
         <w:rPr>
           <w:rFonts w:cs="Times New Roman"/>
-          <w:b w:val="0"/>
+          <w:b/>
           <w:bCs w:val="0"/>
           <w:lang w:val="fr-BE"/>
         </w:rPr>
@@ -16382,7 +16408,6 @@
       <w:r>
         <w:rPr>
           <w:rFonts w:cs="Times New Roman"/>
-          <w:b w:val="0"/>
           <w:bCs w:val="0"/>
           <w:lang w:val="fr-BE"/>
         </w:rPr>
@@ -16392,7 +16417,6 @@
       <w:r>
         <w:rPr>
           <w:rFonts w:cs="Times New Roman"/>
-          <w:b w:val="0"/>
           <w:bCs w:val="0"/>
           <w:lang w:val="fr-BE"/>
         </w:rPr>
@@ -16407,7 +16431,7 @@
         <w:ind w:left="720"/>
         <w:rPr>
           <w:rFonts w:cs="Times New Roman"/>
-          <w:b w:val="0"/>
+          <w:b/>
           <w:bCs w:val="0"/>
           <w:lang w:val="fr-BE"/>
         </w:rPr>
@@ -16417,7 +16441,6 @@
       <w:r>
         <w:rPr>
           <w:rFonts w:cs="Times New Roman"/>
-          <w:b w:val="0"/>
           <w:bCs w:val="0"/>
           <w:lang w:val="fr-BE"/>
         </w:rPr>
@@ -16427,7 +16450,6 @@
       <w:r>
         <w:rPr>
           <w:rFonts w:cs="Times New Roman"/>
-          <w:b w:val="0"/>
           <w:bCs w:val="0"/>
           <w:lang w:val="fr-BE"/>
         </w:rPr>
@@ -16468,7 +16490,7 @@
         <w:ind w:left="720"/>
         <w:rPr>
           <w:rFonts w:cs="Times New Roman"/>
-          <w:b w:val="0"/>
+          <w:b/>
           <w:bCs w:val="0"/>
           <w:lang w:val="fr-BE"/>
         </w:rPr>
@@ -16478,7 +16500,6 @@
       <w:r>
         <w:rPr>
           <w:rFonts w:cs="Times New Roman"/>
-          <w:b w:val="0"/>
           <w:bCs w:val="0"/>
           <w:lang w:val="fr-BE"/>
         </w:rPr>
@@ -16488,7 +16509,6 @@
       <w:r>
         <w:rPr>
           <w:rFonts w:cs="Times New Roman"/>
-          <w:b w:val="0"/>
           <w:bCs w:val="0"/>
           <w:lang w:val="fr-BE"/>
         </w:rPr>
@@ -16503,7 +16523,7 @@
         <w:ind w:left="720"/>
         <w:rPr>
           <w:rFonts w:cs="Times New Roman"/>
-          <w:b w:val="0"/>
+          <w:b/>
           <w:bCs w:val="0"/>
           <w:lang w:val="fr-BE"/>
         </w:rPr>
@@ -16513,7 +16533,6 @@
       <w:r>
         <w:rPr>
           <w:rFonts w:cs="Times New Roman"/>
-          <w:b w:val="0"/>
           <w:bCs w:val="0"/>
           <w:lang w:val="fr-BE"/>
         </w:rPr>
@@ -16523,7 +16542,6 @@
       <w:r>
         <w:rPr>
           <w:rFonts w:cs="Times New Roman"/>
-          <w:b w:val="0"/>
           <w:bCs w:val="0"/>
           <w:lang w:val="fr-BE"/>
         </w:rPr>
@@ -16538,7 +16556,7 @@
         <w:ind w:left="720"/>
         <w:rPr>
           <w:rFonts w:cs="Times New Roman"/>
-          <w:b w:val="0"/>
+          <w:b/>
           <w:bCs w:val="0"/>
           <w:lang w:val="fr-BE"/>
         </w:rPr>
@@ -16548,7 +16566,6 @@
       <w:r>
         <w:rPr>
           <w:rFonts w:cs="Times New Roman"/>
-          <w:b w:val="0"/>
           <w:bCs w:val="0"/>
           <w:lang w:val="fr-BE"/>
         </w:rPr>
@@ -16558,7 +16575,6 @@
       <w:r>
         <w:rPr>
           <w:rFonts w:cs="Times New Roman"/>
-          <w:b w:val="0"/>
           <w:bCs w:val="0"/>
           <w:lang w:val="fr-BE"/>
         </w:rPr>
@@ -16618,7 +16634,7 @@
         <w:ind w:left="720"/>
         <w:rPr>
           <w:rFonts w:cs="Times New Roman"/>
-          <w:b w:val="0"/>
+          <w:b/>
           <w:bCs w:val="0"/>
           <w:lang w:val="fr-BE"/>
         </w:rPr>
@@ -16628,7 +16644,6 @@
       <w:r>
         <w:rPr>
           <w:rFonts w:cs="Times New Roman"/>
-          <w:b w:val="0"/>
           <w:bCs w:val="0"/>
           <w:lang w:val="fr-BE"/>
         </w:rPr>
@@ -16638,7 +16653,6 @@
       <w:r>
         <w:rPr>
           <w:rFonts w:cs="Times New Roman"/>
-          <w:b w:val="0"/>
           <w:bCs w:val="0"/>
           <w:lang w:val="fr-BE"/>
         </w:rPr>
@@ -16653,7 +16667,7 @@
         <w:ind w:left="720"/>
         <w:rPr>
           <w:rFonts w:cs="Times New Roman"/>
-          <w:b w:val="0"/>
+          <w:b/>
           <w:bCs w:val="0"/>
           <w:lang w:val="fr-BE"/>
         </w:rPr>
@@ -16663,7 +16677,6 @@
       <w:r>
         <w:rPr>
           <w:rFonts w:cs="Times New Roman"/>
-          <w:b w:val="0"/>
           <w:bCs w:val="0"/>
           <w:lang w:val="fr-BE"/>
         </w:rPr>
@@ -16673,7 +16686,6 @@
       <w:r>
         <w:rPr>
           <w:rFonts w:cs="Times New Roman"/>
-          <w:b w:val="0"/>
           <w:bCs w:val="0"/>
           <w:lang w:val="fr-BE"/>
         </w:rPr>
@@ -16688,7 +16700,7 @@
         <w:ind w:left="720"/>
         <w:rPr>
           <w:rFonts w:cs="Times New Roman"/>
-          <w:b w:val="0"/>
+          <w:b/>
           <w:bCs w:val="0"/>
           <w:lang w:val="fr-BE"/>
         </w:rPr>
@@ -16698,7 +16710,6 @@
       <w:r>
         <w:rPr>
           <w:rFonts w:cs="Times New Roman"/>
-          <w:b w:val="0"/>
           <w:bCs w:val="0"/>
           <w:lang w:val="fr-BE"/>
         </w:rPr>
@@ -16708,7 +16719,6 @@
       <w:r>
         <w:rPr>
           <w:rFonts w:cs="Times New Roman"/>
-          <w:b w:val="0"/>
           <w:bCs w:val="0"/>
           <w:lang w:val="fr-BE"/>
         </w:rPr>
@@ -16758,7 +16768,7 @@
         <w:ind w:left="720"/>
         <w:rPr>
           <w:rFonts w:cs="Times New Roman"/>
-          <w:b w:val="0"/>
+          <w:b/>
           <w:bCs w:val="0"/>
           <w:lang w:val="fr-BE"/>
         </w:rPr>
@@ -16768,7 +16778,6 @@
       <w:r>
         <w:rPr>
           <w:rFonts w:cs="Times New Roman"/>
-          <w:b w:val="0"/>
           <w:bCs w:val="0"/>
           <w:lang w:val="fr-BE"/>
         </w:rPr>
@@ -16778,7 +16787,6 @@
       <w:r>
         <w:rPr>
           <w:rFonts w:cs="Times New Roman"/>
-          <w:b w:val="0"/>
           <w:bCs w:val="0"/>
           <w:lang w:val="fr-BE"/>
         </w:rPr>
@@ -16793,7 +16801,7 @@
         <w:ind w:left="720"/>
         <w:rPr>
           <w:rFonts w:cs="Times New Roman"/>
-          <w:b w:val="0"/>
+          <w:b/>
           <w:bCs w:val="0"/>
           <w:lang w:val="fr-BE"/>
         </w:rPr>
@@ -16803,7 +16811,6 @@
       <w:r>
         <w:rPr>
           <w:rFonts w:cs="Times New Roman"/>
-          <w:b w:val="0"/>
           <w:bCs w:val="0"/>
           <w:lang w:val="fr-BE"/>
         </w:rPr>
@@ -16813,7 +16820,6 @@
       <w:r>
         <w:rPr>
           <w:rFonts w:cs="Times New Roman"/>
-          <w:b w:val="0"/>
           <w:bCs w:val="0"/>
           <w:lang w:val="fr-BE"/>
         </w:rPr>
@@ -16828,7 +16834,7 @@
         <w:ind w:left="720"/>
         <w:rPr>
           <w:rFonts w:cs="Times New Roman"/>
-          <w:b w:val="0"/>
+          <w:b/>
           <w:bCs w:val="0"/>
           <w:lang w:val="fr-BE"/>
         </w:rPr>
@@ -16838,7 +16844,6 @@
       <w:r>
         <w:rPr>
           <w:rFonts w:cs="Times New Roman"/>
-          <w:b w:val="0"/>
           <w:bCs w:val="0"/>
           <w:lang w:val="fr-BE"/>
         </w:rPr>
@@ -16848,7 +16853,6 @@
       <w:r>
         <w:rPr>
           <w:rFonts w:cs="Times New Roman"/>
-          <w:b w:val="0"/>
           <w:bCs w:val="0"/>
           <w:lang w:val="fr-BE"/>
         </w:rPr>
@@ -16897,7 +16901,7 @@
         <w:ind w:left="720"/>
         <w:rPr>
           <w:rFonts w:cs="Times New Roman"/>
-          <w:b w:val="0"/>
+          <w:b/>
           <w:bCs w:val="0"/>
           <w:lang w:val="fr-BE"/>
         </w:rPr>
@@ -16907,7 +16911,6 @@
       <w:r>
         <w:rPr>
           <w:rFonts w:cs="Times New Roman"/>
-          <w:b w:val="0"/>
           <w:bCs w:val="0"/>
           <w:lang w:val="fr-BE"/>
         </w:rPr>
@@ -16917,7 +16920,6 @@
       <w:r>
         <w:rPr>
           <w:rFonts w:cs="Times New Roman"/>
-          <w:b w:val="0"/>
           <w:bCs w:val="0"/>
           <w:lang w:val="fr-BE"/>
         </w:rPr>
@@ -16932,7 +16934,7 @@
         <w:ind w:left="720"/>
         <w:rPr>
           <w:rFonts w:cs="Times New Roman"/>
-          <w:b w:val="0"/>
+          <w:b/>
           <w:bCs w:val="0"/>
           <w:lang w:val="fr-BE"/>
         </w:rPr>
@@ -16942,7 +16944,6 @@
       <w:r>
         <w:rPr>
           <w:rFonts w:cs="Times New Roman"/>
-          <w:b w:val="0"/>
           <w:bCs w:val="0"/>
           <w:lang w:val="fr-BE"/>
         </w:rPr>
@@ -16952,7 +16953,6 @@
       <w:r>
         <w:rPr>
           <w:rFonts w:cs="Times New Roman"/>
-          <w:b w:val="0"/>
           <w:bCs w:val="0"/>
           <w:lang w:val="fr-BE"/>
         </w:rPr>
@@ -16967,7 +16967,7 @@
         <w:ind w:left="720"/>
         <w:rPr>
           <w:rFonts w:cs="Times New Roman"/>
-          <w:b w:val="0"/>
+          <w:b/>
           <w:bCs w:val="0"/>
           <w:lang w:val="fr-BE"/>
         </w:rPr>
@@ -16977,7 +16977,6 @@
       <w:r>
         <w:rPr>
           <w:rFonts w:cs="Times New Roman"/>
-          <w:b w:val="0"/>
           <w:bCs w:val="0"/>
           <w:lang w:val="fr-BE"/>
         </w:rPr>
@@ -16987,7 +16986,6 @@
       <w:r>
         <w:rPr>
           <w:rFonts w:cs="Times New Roman"/>
-          <w:b w:val="0"/>
           <w:bCs w:val="0"/>
           <w:lang w:val="fr-BE"/>
         </w:rPr>
@@ -17036,7 +17034,7 @@
         <w:ind w:left="720"/>
         <w:rPr>
           <w:rFonts w:cs="Times New Roman"/>
-          <w:b w:val="0"/>
+          <w:b/>
           <w:bCs w:val="0"/>
         </w:rPr>
       </w:pPr>
@@ -17044,7 +17042,6 @@
       <w:r>
         <w:rPr>
           <w:rFonts w:cs="Times New Roman"/>
-          <w:b w:val="0"/>
           <w:bCs w:val="0"/>
         </w:rPr>
         <w:t>Subsection 1</w:t>
@@ -17058,7 +17055,7 @@
         <w:ind w:left="720"/>
         <w:rPr>
           <w:rFonts w:cs="Times New Roman"/>
-          <w:b w:val="0"/>
+          <w:b/>
           <w:bCs w:val="0"/>
         </w:rPr>
       </w:pPr>
@@ -17066,7 +17063,6 @@
       <w:r>
         <w:rPr>
           <w:rFonts w:cs="Times New Roman"/>
-          <w:b w:val="0"/>
           <w:bCs w:val="0"/>
         </w:rPr>
         <w:t>Subsection 2</w:t>
@@ -17080,7 +17076,7 @@
         <w:ind w:left="720"/>
         <w:rPr>
           <w:rFonts w:cs="Times New Roman"/>
-          <w:b w:val="0"/>
+          <w:b/>
           <w:bCs w:val="0"/>
         </w:rPr>
       </w:pPr>
@@ -17088,7 +17084,6 @@
       <w:r>
         <w:rPr>
           <w:rFonts w:cs="Times New Roman"/>
-          <w:b w:val="0"/>
           <w:bCs w:val="0"/>
         </w:rPr>
         <w:t>Subsection 3</w:t>
@@ -17251,26 +17246,309 @@
         <w:rPr>
           <w:b/>
           <w:bCs w:val="0"/>
-        </w:rPr>
-      </w:pPr>
-      <w:r>
+          <w:lang w:val="es-PY"/>
+        </w:rPr>
+      </w:pPr>
+      <w:r>
+        <w:rPr>
+          <w:lang w:val="es-PY"/>
+        </w:rPr>
         <w:br w:type="page"/>
       </w:r>
       <w:bookmarkStart w:id="151" w:name="_Toc224055199"/>
-      <w:r>
-        <w:rPr>
-          <w:bCs w:val="0"/>
+      <w:proofErr w:type="spellStart"/>
+      <w:r>
+        <w:rPr>
+          <w:bCs w:val="0"/>
+          <w:lang w:val="es-PY"/>
         </w:rPr>
         <w:lastRenderedPageBreak/>
         <w:t>Bibliography</w:t>
       </w:r>
       <w:bookmarkEnd w:id="151"/>
+      <w:proofErr w:type="spellEnd"/>
+    </w:p>
+    <w:p>
+      <w:pPr>
+        <w:pStyle w:val="Bibliography"/>
+      </w:pPr>
+      <w:r>
+        <w:fldChar w:fldCharType="begin"/>
+      </w:r>
+      <w:r>
+        <w:rPr>
+          <w:lang w:val="es-PY"/>
+        </w:rPr>
+        <w:instrText xml:space="preserve"> ADDIN ZOTERO_BIBL {"uncited":[],"omitted":[],"custom":[]} CSL_BIBLIOGRAPHY </w:instrText>
+      </w:r>
+      <w:r>
+        <w:fldChar w:fldCharType="separate"/>
+      </w:r>
+      <w:r>
+        <w:rPr>
+          <w:lang w:val="es-PY"/>
+        </w:rPr>
+        <w:t xml:space="preserve">Bilbao, Bibiana A., Brian G. Ferrero, Rodrigo M. </w:t>
+      </w:r>
+      <w:proofErr w:type="spellStart"/>
+      <w:r>
+        <w:rPr>
+          <w:lang w:val="es-PY"/>
+        </w:rPr>
+        <w:t>Falleiro</w:t>
+      </w:r>
+      <w:proofErr w:type="spellEnd"/>
+      <w:r>
+        <w:rPr>
+          <w:lang w:val="es-PY"/>
+        </w:rPr>
+        <w:t xml:space="preserve">, Livia Carvalho Moura, and Guilherme M. Fagundes. </w:t>
+      </w:r>
+      <w:r>
+        <w:t xml:space="preserve">2025. “Traditional Fire Uses by Indigenous Peoples and Local Communities in South America.” In </w:t>
+      </w:r>
+      <w:r>
+        <w:rPr>
+          <w:i/>
+          <w:iCs/>
+        </w:rPr>
+        <w:t>Fire in the South American Ecosystems</w:t>
+      </w:r>
+      <w:r>
+        <w:t xml:space="preserve">, edited by Alessandra Fidelis and Vânia R. </w:t>
+      </w:r>
+      <w:proofErr w:type="spellStart"/>
+      <w:r>
+        <w:t>Pivello</w:t>
+      </w:r>
+      <w:proofErr w:type="spellEnd"/>
+      <w:r>
+        <w:t>. Springer Nature Switzerland. https://doi.org/10.1007/978-3-031-89372-8_3.</w:t>
+      </w:r>
+    </w:p>
+    <w:p>
+      <w:pPr>
+        <w:pStyle w:val="Bibliography"/>
+      </w:pPr>
+      <w:r>
+        <w:t xml:space="preserve">Bowman, M. J. S., Jennifer Balch, Paulo Artaxo, and William Bond. 2009. “Fire in the Earth System.” </w:t>
+      </w:r>
+      <w:r>
+        <w:rPr>
+          <w:i/>
+          <w:iCs/>
+        </w:rPr>
+        <w:t>Science</w:t>
+      </w:r>
+      <w:r>
+        <w:t xml:space="preserve"> 324 (5926): 481–84. https://doi.org/10.1126/science.1163886.</w:t>
+      </w:r>
+    </w:p>
+    <w:p>
+      <w:pPr>
+        <w:pStyle w:val="Bibliography"/>
+      </w:pPr>
+      <w:r>
+        <w:t xml:space="preserve">Cochrane, Mark. 2009. “Fire, Land Use, Land Cover Dynamics, and Climate Change in the Brazilian Amazon.” In </w:t>
+      </w:r>
+      <w:r>
+        <w:rPr>
+          <w:i/>
+          <w:iCs/>
+        </w:rPr>
+        <w:t>Tropical Fire Ecology: Climate Change, Land Use and Ecosystem Dynamics</w:t>
+      </w:r>
+      <w:r>
+        <w:t>. https://doi.org/10.1007/978-3-540-77381-8_14.</w:t>
+      </w:r>
+    </w:p>
+    <w:p>
+      <w:pPr>
+        <w:pStyle w:val="Bibliography"/>
+      </w:pPr>
+      <w:r>
+        <w:t xml:space="preserve">Cochrane, Mark A., and Kevin C. Ryan. 2009. “Fire and Fire Ecology: Concepts and Principles.” </w:t>
+      </w:r>
+      <w:r>
+        <w:rPr>
+          <w:i/>
+          <w:iCs/>
+        </w:rPr>
+        <w:t>In: Cochrane, Mark A., Ed. Tropical Fire Ecology: Climate Change, Land Use, and Ecosystem Dynamics. Springer-Praxis Books in Environmental Sciences. Chichester, UK: Praxis Publishing, Ltd. p. 25-62.</w:t>
+      </w:r>
+      <w:r>
+        <w:t>, 25–62. https://doi.org/10.1007/978-3-540-77381-8_2.</w:t>
+      </w:r>
+    </w:p>
+    <w:p>
+      <w:pPr>
+        <w:pStyle w:val="Bibliography"/>
+      </w:pPr>
+      <w:r>
+        <w:t xml:space="preserve">Harrison, Sandy P., I. Colin Prentice, Keith J. Bloomfield, et al. 2021. “Understanding and Modelling Wildfire Regimes: An Ecological Perspective.” </w:t>
+      </w:r>
+      <w:r>
+        <w:rPr>
+          <w:i/>
+          <w:iCs/>
+        </w:rPr>
+        <w:t>Environmental Research Letters</w:t>
+      </w:r>
+      <w:r>
+        <w:t xml:space="preserve"> 16 (12): 125008. https://doi.org/10.1088/1748-9326/ac39be.</w:t>
+      </w:r>
+    </w:p>
+    <w:p>
+      <w:pPr>
+        <w:pStyle w:val="Bibliography"/>
+      </w:pPr>
+      <w:proofErr w:type="spellStart"/>
+      <w:r>
+        <w:t>Pausas</w:t>
+      </w:r>
+      <w:proofErr w:type="spellEnd"/>
+      <w:r>
+        <w:t xml:space="preserve">, Juli G., and Jon E. Keeley. 2021. “Wildfires and Global Change.” </w:t>
+      </w:r>
+      <w:r>
+        <w:rPr>
+          <w:i/>
+          <w:iCs/>
+        </w:rPr>
+        <w:t>Frontiers in Ecology and the Environment</w:t>
+      </w:r>
+      <w:r>
+        <w:t xml:space="preserve"> 19 (7): 387–95. https://doi.org/10.1002/fee.2359.</w:t>
+      </w:r>
+    </w:p>
+    <w:p>
+      <w:pPr>
+        <w:pStyle w:val="Bibliography"/>
+      </w:pPr>
+      <w:r>
+        <w:t xml:space="preserve">Pyne, Stephen J., Patricia L. Andrews, and Richard D. Laven. 1996. </w:t>
+      </w:r>
+      <w:r>
+        <w:rPr>
+          <w:i/>
+          <w:iCs/>
+        </w:rPr>
+        <w:t>Introduction to Wildland Fire</w:t>
+      </w:r>
+      <w:r>
+        <w:t>. 2. ed. Wiley.</w:t>
+      </w:r>
+    </w:p>
+    <w:p>
+      <w:pPr>
+        <w:pStyle w:val="Bibliography"/>
+      </w:pPr>
+      <w:proofErr w:type="spellStart"/>
+      <w:r>
+        <w:t>Shakesby</w:t>
+      </w:r>
+      <w:proofErr w:type="spellEnd"/>
+      <w:r>
+        <w:t xml:space="preserve">, R. A., and S. H. Doerr. 2006. “Wildfire as a Hydrological and Geomorphological Agent.” </w:t>
+      </w:r>
+      <w:r>
+        <w:rPr>
+          <w:i/>
+          <w:iCs/>
+        </w:rPr>
+        <w:t>Earth-Science Reviews</w:t>
+      </w:r>
+      <w:r>
+        <w:t xml:space="preserve"> 74 (3): 269–307. https://doi.org/10.1016/j.earscirev.2005.10.006.</w:t>
+      </w:r>
+    </w:p>
+    <w:p>
+      <w:pPr>
+        <w:pStyle w:val="Bibliography"/>
+      </w:pPr>
+      <w:r>
+        <w:t xml:space="preserve">Shlisky, Ayn, Ane Alencar, María Manta, Lisa Curran, and Mark Cochrane. 2009. </w:t>
+      </w:r>
+      <w:r>
+        <w:rPr>
+          <w:i/>
+          <w:iCs/>
+        </w:rPr>
+        <w:t>Overview: Global Fire Regime Conditions, Threats, and Opportunities for Fire Management in the Tropics</w:t>
+      </w:r>
+      <w:r>
+        <w:t>. https://doi.org/10.1007/978-3-540-77381-8_3.</w:t>
+      </w:r>
+    </w:p>
+    <w:p>
+      <w:pPr>
+        <w:pStyle w:val="Bibliography"/>
+      </w:pPr>
+      <w:r>
+        <w:t xml:space="preserve">Tedim, Fantina, and Vittorio Leone. 2020. “The Dilemma of Wildfire Definition: What It Reveals and What It Implies.” </w:t>
+      </w:r>
+      <w:r>
+        <w:rPr>
+          <w:i/>
+          <w:iCs/>
+        </w:rPr>
+        <w:t>Frontiers in Forests and Global Change</w:t>
+      </w:r>
+      <w:r>
+        <w:t xml:space="preserve"> 3 (December). https://doi.org/10.3389/ffgc.2020.553116.</w:t>
+      </w:r>
+    </w:p>
+    <w:p>
+      <w:pPr>
+        <w:pStyle w:val="Bibliography"/>
+      </w:pPr>
+      <w:r>
+        <w:t xml:space="preserve">Yang, </w:t>
+      </w:r>
+      <w:proofErr w:type="spellStart"/>
+      <w:r>
+        <w:t>Xuhong</w:t>
+      </w:r>
+      <w:proofErr w:type="spellEnd"/>
+      <w:r>
+        <w:t xml:space="preserve">, </w:t>
+      </w:r>
+      <w:proofErr w:type="spellStart"/>
+      <w:r>
+        <w:t>Xiaobin</w:t>
+      </w:r>
+      <w:proofErr w:type="spellEnd"/>
+      <w:r>
+        <w:t xml:space="preserve"> Jin, and </w:t>
+      </w:r>
+      <w:proofErr w:type="spellStart"/>
+      <w:r>
+        <w:t>Yinkang</w:t>
+      </w:r>
+      <w:proofErr w:type="spellEnd"/>
+      <w:r>
+        <w:t xml:space="preserve"> Zhou. 2021. “Wildfire Risk Assessment and Zoning by Integrating Maxent and GIS in Hunan Province, China.” </w:t>
+      </w:r>
+      <w:r>
+        <w:rPr>
+          <w:i/>
+          <w:iCs/>
+        </w:rPr>
+        <w:t>Forests</w:t>
+      </w:r>
+      <w:r>
+        <w:t xml:space="preserve"> 12 (10). https://doi.org/10.3390/f12101299.</w:t>
+      </w:r>
     </w:p>
     <w:p>
       <w:pPr>
         <w:pStyle w:val="TOC1"/>
         <w:spacing w:line="480" w:lineRule="auto"/>
       </w:pPr>
+      <w:r>
+        <w:lastRenderedPageBreak/>
+        <w:fldChar w:fldCharType="end"/>
+      </w:r>
     </w:p>
     <w:p>
       <w:pPr>
@@ -17644,8 +17922,16 @@
       <w:rPr>
         <w:rStyle w:val="PageNumber"/>
       </w:rPr>
-      <w:t>xiii</w:t>
+      <w:t>xii</w:t>
     </w:r>
+    <w:proofErr w:type="spellStart"/>
+    <w:r>
+      <w:rPr>
+        <w:rStyle w:val="PageNumber"/>
+      </w:rPr>
+      <w:t>i</w:t>
+    </w:r>
+    <w:proofErr w:type="spellEnd"/>
     <w:r>
       <w:rPr>
         <w:rStyle w:val="PageNumber"/>
@@ -18658,7 +18944,7 @@
     <w:basedOn w:val="Normal"/>
     <w:next w:val="Normal"/>
     <w:qFormat/>
-    <w:rsid w:val="00556029"/>
+    <w:rsid w:val="00EF0BE7"/>
     <w:pPr>
       <w:keepNext/>
       <w:spacing w:before="240" w:after="60"/>
@@ -18666,9 +18952,7 @@
     </w:pPr>
     <w:rPr>
       <w:rFonts w:cs="Arial"/>
-      <w:b/>
       <w:bCs/>
-      <w:sz w:val="22"/>
       <w:szCs w:val="26"/>
     </w:rPr>
   </w:style>
@@ -18677,12 +18961,12 @@
     <w:basedOn w:val="Normal"/>
     <w:next w:val="Normal"/>
     <w:qFormat/>
+    <w:rsid w:val="00555F76"/>
     <w:pPr>
       <w:keepNext/>
       <w:outlineLvl w:val="3"/>
     </w:pPr>
     <w:rPr>
-      <w:b/>
       <w:bCs/>
     </w:rPr>
   </w:style>
@@ -18985,9 +19269,12 @@
     <w:basedOn w:val="Normal"/>
     <w:next w:val="Normal"/>
     <w:uiPriority w:val="37"/>
-    <w:semiHidden/>
     <w:unhideWhenUsed/>
     <w:rsid w:val="008A07F1"/>
+    <w:pPr>
+      <w:spacing w:after="240"/>
+      <w:ind w:left="720" w:hanging="720"/>
+    </w:pPr>
   </w:style>
   <w:style w:type="paragraph" w:styleId="BlockText">
     <w:name w:val="Block Text"/>

</xml_diff>

<commit_message>
Enhance Literature Review and Master Thesis Draft with updated fire impact analysis and new references
- Updated the Literature Review flowchart to include detailed groupings and relationships among fire-related factors.
- Expanded the introduction section of the Master Thesis to address the significance of fire impacts in the Paraguayan Chaco, highlighting biodiversity threats and community vulnerabilities.
- Revised sections on vegetation and weather to clarify their roles in fire dynamics, introducing a new subsection on fire weather.
- Added new references to support the updated content, including recent studies on fire impacts and management strategies.
</commit_message>
<xml_diff>
--- a/10_Draft/Master Thesis - Draft.docx
+++ b/10_Draft/Master Thesis - Draft.docx
@@ -11782,6 +11782,171 @@
       </w:r>
       <w:bookmarkEnd w:id="10"/>
     </w:p>
+    <w:p>
+      <w:r>
+        <w:t xml:space="preserve">Fires are a natural and recurrent earth system process, with wide impacts in different aspects of the earth's ecological, atmospheric, and geological composition </w:t>
+      </w:r>
+      <w:r>
+        <w:fldChar w:fldCharType="begin"/>
+      </w:r>
+      <w:r>
+        <w:instrText xml:space="preserve"> ADDIN ZOTERO_ITEM CSL_CITATION {"citationID":"IF5Hcncn","properties":{"formattedCitation":"(Bowman et al. 2009)","plainCitation":"(Bowman et al. 2009)","noteIndex":0},"citationItems":[{"id":82,"uris":["http://zotero.org/users/18505960/items/2DYVFGN9"],"itemData":{"id":82,"type":"article-journal","container-title":"Science","DOI":"10.1126/science.1163886","issue":"5926","language":"en","page":"481-484","publisher":"Science Magazine","source":"Zotero","title":"Fire in the Earth System","volume":"324","author":[{"family":"Bowman","given":"M. J. S."},{"family":"Balch","given":"Jennifer"},{"family":"Artaxo","given":"Paulo"},{"family":"Bond","given":"William"}],"issued":{"date-parts":[["2009"]]}}}],"schema":"https://github.com/citation-style-language/schema/raw/master/csl-citation.json"} </w:instrText>
+      </w:r>
+      <w:r>
+        <w:fldChar w:fldCharType="separate"/>
+      </w:r>
+      <w:r>
+        <w:t>(Bowman et al. 2009)</w:t>
+      </w:r>
+      <w:r>
+        <w:fldChar w:fldCharType="end"/>
+      </w:r>
+      <w:r>
+        <w:t>. Although these natural occurrences are understood, changes in land cover driven by the expansion of the agricultural and livestock ranching frontier, as well as climate change, have altered these fire regimes, resulting in threatened biodiversity, ecosystemic services, and rural communities</w:t>
+      </w:r>
+      <w:r>
+        <w:t xml:space="preserve"> </w:t>
+      </w:r>
+      <w:r>
+        <w:fldChar w:fldCharType="begin"/>
+      </w:r>
+      <w:r>
+        <w:instrText xml:space="preserve"> ADDIN ZOTERO_ITEM CSL_CITATION {"citationID":"B5AxOkjt","properties":{"formattedCitation":"(Shlisky et al. 2009)","plainCitation":"(Shlisky et al. 2009)","noteIndex":0},"citationItems":[{"id":211,"uris":["http://zotero.org/users/18505960/items/VJ39LW7E"],"itemData":{"id":211,"type":"chapter","abstract":"Fire is a natural process that has played a major role in shaping our environment and maintaining biodiversity worldwide.\nHowever, over 60% of the world’s terrestrial habitats have altered fire regimes. At least 20% of global habitats are classified\nas fire-sensitive, including most tropical habitats; they are composed of species that did not largely evolve in the presence\nof fire. Over 70% of these fire-sensitive habitats have altered fire regimes. While fire has been, and still is, an important\ntool used by humans to cultivate agricultural landscapes, when human actions cause too much, too little, or the wrong type\nof fire, it can threaten our environment by releasing unacceptable levels of greenhouse gases into the atmosphere, providing\npathways for harmful invasive species, altering landscape hydrology, impairing local and regional air quality, and presenting\na direct and often increased risk to human habitation. Recognizing the value and need to assess the world’s fire regimes,\nThe Nature Conservancy, University of California at Berkeley, World Conservation Union (IUCN), and World Wildlife Fund (WWF)\ncompleted an expert-based analysis of the state of the world’s fire regimes based on currently available data and expert opinion.\nThe major sources of fire regime alteration worldwide include climate change, agriculture and ranching, deforestation, rural\nand urban development, energy production, fire exclusion and suppression, invasive species, plantations, and arson. Integrated\nfire management (IFM) is an approach that considers both damaging and beneficial fires within the context of the natural environments\nand socio-economic systems in which they occur. IFM takes into account fire ecology, socio-economic issues, and fire management\ntechnology to generate practical solutions to fire-related threats to biodiversity.","DOI":"10.1007/978-3-540-77381-8_3","ISBN":"978-3-540-77380-1","page":"65-83","source":"ResearchGate","title":"Overview: Global fire regime conditions, threats, and opportunities for fire management in the tropics","title-short":"Overview","author":[{"family":"Shlisky","given":"Ayn"},{"family":"Alencar","given":"Ane"},{"family":"Manta","given":"María"},{"family":"Curran","given":"Lisa"},{"family":"Cochrane","given":"Mark"}],"issued":{"date-parts":[["2009",1,1]]}}}],"schema":"https://github.com/citation-style-language/schema/raw/master/csl-citation.json"} </w:instrText>
+      </w:r>
+      <w:r>
+        <w:fldChar w:fldCharType="separate"/>
+      </w:r>
+      <w:r>
+        <w:t>(</w:t>
+      </w:r>
+      <w:proofErr w:type="spellStart"/>
+      <w:r>
+        <w:t>Shlisky</w:t>
+      </w:r>
+      <w:proofErr w:type="spellEnd"/>
+      <w:r>
+        <w:t xml:space="preserve"> et al. 2009)</w:t>
+      </w:r>
+      <w:r>
+        <w:fldChar w:fldCharType="end"/>
+      </w:r>
+      <w:r>
+        <w:t>.</w:t>
+      </w:r>
+    </w:p>
+    <w:p/>
+    <w:p>
+      <w:r>
+        <w:t xml:space="preserve">Within this global context, Paraguay is at the forefront of accelerated </w:t>
+      </w:r>
+      <w:r>
+        <w:t>deforestation and</w:t>
+      </w:r>
+      <w:r>
+        <w:t xml:space="preserve"> is one of the hotspots for fires in South America, even surpassing Brazil in the period within 1999-2015, with most of the fires concentrating in the Paraguayan Chaco region. Despite this, a knowledge gap remains in fire impacts and vulnerabilities, particularly in Paraguayan Chaco, with most of the research focused on the neighboring countries</w:t>
+      </w:r>
+      <w:r>
+        <w:t xml:space="preserve"> </w:t>
+      </w:r>
+      <w:r>
+        <w:fldChar w:fldCharType="begin"/>
+      </w:r>
+      <w:r>
+        <w:instrText xml:space="preserve"> ADDIN ZOTERO_ITEM CSL_CITATION {"citationID":"CJtyT7FX","properties":{"formattedCitation":"(Vidal-Riveros et al. 2024)","plainCitation":"(Vidal-Riveros et al. 2024)","noteIndex":0},"citationItems":[{"id":93,"uris":["http://zotero.org/users/18505960/items/S6I5IDH3"],"itemData":{"id":93,"type":"article-journal","abstract":"The Gran Chaco and Pantanal ecoregions are the largest remaining dry forest areas in South America. Supporting diverse savanna, woodland and wetland ecosystems, these ecoregions are experiencing rapid changes in land use and fire occurrence with implications for ecosystem integrity. Our study characterizes the spatiotemporal patterns of wildfires in the Gran Chaco and Pantanal, and then examines the relationship between patterns of fire occurrence and climatic and anthropogenic drivers. We evaluated fire data of the last two decades (2001-2020) using the MODIS Collection 6.1 and the Global Fire Atlas products. Results of the fire pattern characterization were then used to model the probability of fire occurrence across each ecoregion (Random Forest, Generalized Linear Model, and Generalized Additive Model). Our results indicated that most of the total burned area belonged to the Humid Chaco, while the largest individual burned areas were mainly observed in the Pantanal. Fires primarily occurred during the dry season, with the majority of burned areas recorded during this period. Findings from the three modelling approaches consistently illustrated the spatial distribution of fire occurrence, depicting a declining probability of fire occurrence from East to West. All models underscored the importance of three variables to predict fire occurrence: temperature, livestock abundance and forest cover. Fire occurrence increased with increasing maximum temperatures and livestock presence and decreased with tree cover. This research helps to clarify the potential consequences of changes in land use, rainfall regime and temperature, and uncontrolled burning practices on the current fire activity in the Gran Chaco and Pantanal ecoregions. Understanding the spatiotemporal patterns of fire occurrence and their relationship with climatic, environmental and anthropogenic drivers can help to design more effective management strategies to mitigate fire impacts and to preserve the ecological integrity of these highly diverse regions","container-title":"Science of The Total Environment","DOI":"10.1016/j.scitotenv.2024.176823","ISSN":"0048-9697","journalAbbreviation":"Science of The Total Environment","page":"176823","source":"ScienceDirect","title":"Spatiotemporal analysis of wildfires and their relationship with climate and land use in the Gran Chaco and Pantanal ecoregions","volume":"955","author":[{"family":"Vidal-Riveros","given":"Cristina"},{"family":"Currey","given":"Bryce"},{"family":"McWethy","given":"David B."},{"family":"Bieng","given":"Marie Ange Ngo"},{"family":"Souza-Alonso","given":"Pablo"}],"issued":{"date-parts":[["2024",12,10]]}}}],"schema":"https://github.com/citation-style-language/schema/raw/master/csl-citation.json"} </w:instrText>
+      </w:r>
+      <w:r>
+        <w:fldChar w:fldCharType="separate"/>
+      </w:r>
+      <w:r>
+        <w:t>(Vidal-Riveros et al. 2024)</w:t>
+      </w:r>
+      <w:r>
+        <w:fldChar w:fldCharType="end"/>
+      </w:r>
+      <w:r>
+        <w:t>.</w:t>
+      </w:r>
+    </w:p>
+    <w:p/>
+    <w:p>
+      <w:r>
+        <w:t>Fires in the Paraguayan Chaco threaten biodiversity, the remaining unaltered protected areas, indigenous communities, and infrastructure. The fragmented pattern of the Paraguayan Chaco creates a greater exposure of forest edges, making the forests less resilient and more fire prone</w:t>
+      </w:r>
+      <w:r>
+        <w:t xml:space="preserve"> </w:t>
+      </w:r>
+      <w:r>
+        <w:fldChar w:fldCharType="begin"/>
+      </w:r>
+      <w:r>
+        <w:instrText xml:space="preserve"> ADDIN ZOTERO_ITEM CSL_CITATION {"citationID":"iNolWL6c","properties":{"formattedCitation":"(Armenteras et al. 2013)","plainCitation":"(Armenteras et al. 2013)","noteIndex":0},"citationItems":[{"id":206,"uris":["http://zotero.org/users/18505960/items/SHJBX6VY"],"itemData":{"id":206,"type":"article-journal","abstract":"The ecological characteristics of forest edges have been intensively studied in the Amazon region, but the occurrence and intensity of fires as large-scale edge effects are less well known, as is the role of different types of management in modifying this relationship. We used remote sensing techniques to examine the relationship between forest fragmentation, fire and management across NW Amazonia. Our study was based on forest data for 2005 and on active fire data from the MODerate-resolution imaging Spectro-radiometer (MODIS), with information on the occurrence and strength of fires based on fire radiative power (FRP) data. We analyzed the fragmentation and fire occurrence and intensity in a 50×50km grid. We also calculated the distance at which edge-related fires occur in the forest interior and outside the forest edge. Forest fragmentation had a significant impact on fire occurrence and fire intensity, supporting the hypothesis that the more fragmented a forest is, the higher the degree of biomass combustion. These results are in agreement with the occurrence of an edge effect on both the occurrence and the intensity of fire. The different types of management in the region influence the occurrence and intensity of fire, whereas fire as a large-scale edge effect occurs independent of the management type. Finally, we suggest that a high connectivity in protected areas and indigenous reserves and also in outside areas should be encouraged to minimize edge-driven fire processes.","container-title":"Biological Conservation","DOI":"10.1016/j.biocon.2012.10.026","ISSN":"0006-3207","journalAbbreviation":"Biological Conservation","page":"73-79","source":"ScienceDirect","title":"Forest fragmentation and edge influence on fire occurrence and intensity under different management types in Amazon forests","volume":"159","author":[{"family":"Armenteras","given":"Dolors"},{"family":"González","given":"Tania Marisol"},{"family":"Retana","given":"Javier"}],"issued":{"date-parts":[["2013",3,1]]}}}],"schema":"https://github.com/citation-style-language/schema/raw/master/csl-citation.json"} </w:instrText>
+      </w:r>
+      <w:r>
+        <w:fldChar w:fldCharType="separate"/>
+      </w:r>
+      <w:r>
+        <w:t>(</w:t>
+      </w:r>
+      <w:proofErr w:type="spellStart"/>
+      <w:r>
+        <w:t>Armenteras</w:t>
+      </w:r>
+      <w:proofErr w:type="spellEnd"/>
+      <w:r>
+        <w:t xml:space="preserve"> et al. 2013)</w:t>
+      </w:r>
+      <w:r>
+        <w:fldChar w:fldCharType="end"/>
+      </w:r>
+      <w:r>
+        <w:t>. In the sparsely populated Paraguayan Chaco, fires affect communities through respiratory illnesses, disruption in state services and general threats to livelihoods</w:t>
+      </w:r>
+      <w:r>
+        <w:t xml:space="preserve"> </w:t>
+      </w:r>
+      <w:r>
+        <w:fldChar w:fldCharType="begin"/>
+      </w:r>
+      <w:r>
+        <w:instrText xml:space="preserve"> ADDIN ZOTERO_ITEM CSL_CITATION {"citationID":"VOzvjHFO","properties":{"formattedCitation":"(Jasser et al. 2021)","plainCitation":"(Jasser et al. 2021)","noteIndex":0},"citationItems":[{"id":209,"uris":["http://zotero.org/users/18505960/items/4C7N2M3K"],"itemData":{"id":209,"type":"article-journal","abstract":"In August and September 2019, wildfires destroyed over 3 million hectares of forest in the Bolivian Chiquitanía. They were caused by slash-and-burn land clearance techniques used to prepare land for agriculture. In this article, we examine how the forest fires constitute a way of making territory, paying particular attention to how underlying relations of power have historically shaped territories in the region. We trace the actors and social relations of power that have historically developed in the region from the 17th century to today, putting an emphasis on the necessity to expand the temporal lens through which we analyse struggles over territory in Latin America. The Chiquitanía region is an illustrative case study, as it reflects Bolivia’s highly diverse society, revealing multiple, simultaneously existing territorialised social relations, which we conceptually grasp as motley territories. We define motley territories as diverse territorialised social relations that were established in different epochs but continue to coexist in often unarticulated ways. We argue that the state-sanctioned appropriation of slash-and-burn practices by landowners is a mechanism to integrate more land into the agricultural frontier while rendering other forms of inhabiting those motley territories more difficult.","container-title":"Third World Thematics: A TWQ Journal","DOI":"10.1080/23802014.2022.2146182","ISSN":"2380-2014","issue":"4-6","note":"_eprint: https://doi.org/10.1080/23802014.2022.2146182","page":"179-199","publisher":"Routledge","source":"Taylor and Francis+NEJM","title":"Motley territories in a plurinational state: forest fires in the Bolivian Chiquitanía","title-short":"Motley territories in a plurinational state","volume":"6","author":[{"family":"Jasser","given":"Marie Theresa"},{"family":"Radhuber","given":"Isabella M."},{"family":"Inturias","given":"Mirna"}],"issued":{"date-parts":[["2021",11,2]]}}}],"schema":"https://github.com/citation-style-language/schema/raw/master/csl-citation.json"} </w:instrText>
+      </w:r>
+      <w:r>
+        <w:fldChar w:fldCharType="separate"/>
+      </w:r>
+      <w:r>
+        <w:t>(Jasser et al. 2021)</w:t>
+      </w:r>
+      <w:r>
+        <w:fldChar w:fldCharType="end"/>
+      </w:r>
+      <w:r>
+        <w:t>.</w:t>
+      </w:r>
+    </w:p>
+    <w:p/>
+    <w:p>
+      <w:r>
+        <w:t xml:space="preserve">Research in the Paraguayan Chaco has mostly focused on identifying fire regimes, </w:t>
+      </w:r>
+      <w:proofErr w:type="spellStart"/>
+      <w:r>
+        <w:t>spatio</w:t>
+      </w:r>
+      <w:proofErr w:type="spellEnd"/>
+      <w:r>
+        <w:t xml:space="preserve">-temporal patterns, and climatic interactions, with little literature identifying vulnerable assets throughout the region. This project aims to address that gap by deploying a multi-decision criteria model integrating proven machine learning methodologies for predicting fire ignition probability and asset-based vulnerability into </w:t>
+      </w:r>
+      <w:proofErr w:type="gramStart"/>
+      <w:r>
+        <w:t>a</w:t>
+      </w:r>
+      <w:proofErr w:type="gramEnd"/>
+      <w:r>
+        <w:t xml:space="preserve"> Analytical Hierarchy Process (AHP) model. The high value assets (HVA) considered in this project are communities, forests, and infrastructure.</w:t>
+      </w:r>
+    </w:p>
+    <w:p/>
+    <w:p/>
     <w:p>
       <w:pPr>
         <w:rPr>
@@ -12302,14 +12467,27 @@
       <w:r>
         <w:t xml:space="preserve">Figure </w:t>
       </w:r>
-      <w:fldSimple w:instr=" SEQ Figure \* ARABIC ">
-        <w:r>
-          <w:rPr>
-            <w:noProof/>
-          </w:rPr>
-          <w:t>1</w:t>
-        </w:r>
-      </w:fldSimple>
+      <w:r>
+        <w:fldChar w:fldCharType="begin"/>
+      </w:r>
+      <w:r>
+        <w:instrText xml:space="preserve"> SEQ Figure \* ARABIC </w:instrText>
+      </w:r>
+      <w:r>
+        <w:fldChar w:fldCharType="separate"/>
+      </w:r>
+      <w:r>
+        <w:rPr>
+          <w:noProof/>
+        </w:rPr>
+        <w:t>1</w:t>
+      </w:r>
+      <w:r>
+        <w:rPr>
+          <w:noProof/>
+        </w:rPr>
+        <w:fldChar w:fldCharType="end"/>
+      </w:r>
       <w:r>
         <w:t xml:space="preserve">. </w:t>
       </w:r>
@@ -12545,14 +12723,27 @@
       <w:r>
         <w:t xml:space="preserve">Figure </w:t>
       </w:r>
-      <w:fldSimple w:instr=" SEQ Figure \* ARABIC ">
-        <w:r>
-          <w:rPr>
-            <w:noProof/>
-          </w:rPr>
-          <w:t>2</w:t>
-        </w:r>
-      </w:fldSimple>
+      <w:r>
+        <w:fldChar w:fldCharType="begin"/>
+      </w:r>
+      <w:r>
+        <w:instrText xml:space="preserve"> SEQ Figure \* ARABIC </w:instrText>
+      </w:r>
+      <w:r>
+        <w:fldChar w:fldCharType="separate"/>
+      </w:r>
+      <w:r>
+        <w:rPr>
+          <w:noProof/>
+        </w:rPr>
+        <w:t>2</w:t>
+      </w:r>
+      <w:r>
+        <w:rPr>
+          <w:noProof/>
+        </w:rPr>
+        <w:fldChar w:fldCharType="end"/>
+      </w:r>
       <w:r>
         <w:t xml:space="preserve">. </w:t>
       </w:r>
@@ -12660,7 +12851,19 @@
         <w:t>.</w:t>
       </w:r>
       <w:r>
-        <w:t xml:space="preserve"> The availability of continuous fuel ultimately determines the size of a fire as seen in the figure below </w:t>
+        <w:t xml:space="preserve"> The availability of continuous fuel</w:t>
+      </w:r>
+      <w:r>
+        <w:t>, defined as fuel continuity,</w:t>
+      </w:r>
+      <w:r>
+        <w:t xml:space="preserve"> </w:t>
+      </w:r>
+      <w:r>
+        <w:t>is deeply linked with fire spread and fire event size</w:t>
+      </w:r>
+      <w:r>
+        <w:t xml:space="preserve"> </w:t>
       </w:r>
       <w:r>
         <w:fldChar w:fldCharType="begin"/>
@@ -12687,6 +12890,35 @@
       </w:r>
       <w:r>
         <w:t>.</w:t>
+      </w:r>
+    </w:p>
+    <w:p/>
+    <w:p>
+      <w:pPr>
+        <w:pStyle w:val="Heading4"/>
+      </w:pPr>
+      <w:r>
+        <w:t xml:space="preserve">2.1.2.3. </w:t>
+      </w:r>
+      <w:r>
+        <w:t xml:space="preserve">Fire </w:t>
+      </w:r>
+      <w:r>
+        <w:t>Weather</w:t>
+      </w:r>
+    </w:p>
+    <w:p>
+      <w:r>
+        <w:t xml:space="preserve">The three main weather elements affecting wildfires are wind, temperature, and humidity. </w:t>
+      </w:r>
+    </w:p>
+    <w:p/>
+    <w:p>
+      <w:pPr>
+        <w:pStyle w:val="Heading4"/>
+      </w:pPr>
+      <w:r>
+        <w:t>2.1.2.4. Human activity</w:t>
       </w:r>
     </w:p>
     <w:p/>
@@ -12694,27 +12926,6 @@
     <w:p/>
     <w:p>
       <w:pPr>
-        <w:pStyle w:val="Heading4"/>
-      </w:pPr>
-      <w:r>
-        <w:t>2.1.2.3. Weather</w:t>
-      </w:r>
-    </w:p>
-    <w:p/>
-    <w:p/>
-    <w:p>
-      <w:pPr>
-        <w:pStyle w:val="Heading4"/>
-      </w:pPr>
-      <w:r>
-        <w:t>2.1.2.4. Human activity</w:t>
-      </w:r>
-    </w:p>
-    <w:p/>
-    <w:p/>
-    <w:p/>
-    <w:p>
-      <w:pPr>
         <w:pStyle w:val="Heading3"/>
       </w:pPr>
       <w:r>
@@ -12738,15 +12949,7 @@
         <w:fldChar w:fldCharType="separate"/>
       </w:r>
       <w:r>
-        <w:t>(</w:t>
-      </w:r>
-      <w:proofErr w:type="spellStart"/>
-      <w:r>
-        <w:t>Shlisky</w:t>
-      </w:r>
-      <w:proofErr w:type="spellEnd"/>
-      <w:r>
-        <w:t xml:space="preserve"> et al. 2009)</w:t>
+        <w:t>(Shlisky et al. 2009)</w:t>
       </w:r>
       <w:r>
         <w:fldChar w:fldCharType="end"/>
@@ -12816,7 +13019,6 @@
           <w:sz w:val="24"/>
           <w:u w:val="single"/>
         </w:rPr>
-        <w:lastRenderedPageBreak/>
         <w:t xml:space="preserve">2.2. </w:t>
       </w:r>
       <w:r>
@@ -12982,6 +13184,7 @@
           <w:sz w:val="24"/>
           <w:u w:val="single"/>
         </w:rPr>
+        <w:lastRenderedPageBreak/>
         <w:t>Section 6</w:t>
       </w:r>
       <w:bookmarkEnd w:id="22"/>
@@ -13016,7 +13219,6 @@
           <w:bCs w:val="0"/>
           <w:sz w:val="24"/>
           <w:u w:val="single"/>
-          <w:lang w:val="fr-BE"/>
         </w:rPr>
       </w:pPr>
       <w:bookmarkStart w:id="24" w:name="_Toc224055072"/>
@@ -13026,7 +13228,6 @@
           <w:bCs w:val="0"/>
           <w:sz w:val="24"/>
           <w:u w:val="single"/>
-          <w:lang w:val="fr-BE"/>
         </w:rPr>
         <w:t>Section 1</w:t>
       </w:r>
@@ -13041,27 +13242,15 @@
           <w:rFonts w:cs="Times New Roman"/>
           <w:b/>
           <w:bCs w:val="0"/>
-          <w:lang w:val="fr-BE"/>
         </w:rPr>
       </w:pPr>
       <w:bookmarkStart w:id="25" w:name="_Toc224055073"/>
-      <w:proofErr w:type="spellStart"/>
-      <w:r>
-        <w:rPr>
-          <w:rFonts w:cs="Times New Roman"/>
-          <w:bCs w:val="0"/>
-          <w:lang w:val="fr-BE"/>
-        </w:rPr>
-        <w:t>Subsection</w:t>
-      </w:r>
-      <w:proofErr w:type="spellEnd"/>
-      <w:r>
-        <w:rPr>
-          <w:rFonts w:cs="Times New Roman"/>
-          <w:bCs w:val="0"/>
-          <w:lang w:val="fr-BE"/>
-        </w:rPr>
-        <w:t xml:space="preserve"> 1</w:t>
+      <w:r>
+        <w:rPr>
+          <w:rFonts w:cs="Times New Roman"/>
+          <w:bCs w:val="0"/>
+        </w:rPr>
+        <w:t>Subsection 1</w:t>
       </w:r>
       <w:bookmarkEnd w:id="25"/>
     </w:p>
@@ -13074,27 +13263,15 @@
           <w:rFonts w:cs="Times New Roman"/>
           <w:b/>
           <w:bCs w:val="0"/>
-          <w:lang w:val="fr-BE"/>
         </w:rPr>
       </w:pPr>
       <w:bookmarkStart w:id="26" w:name="_Toc224055074"/>
-      <w:proofErr w:type="spellStart"/>
-      <w:r>
-        <w:rPr>
-          <w:rFonts w:cs="Times New Roman"/>
-          <w:bCs w:val="0"/>
-          <w:lang w:val="fr-BE"/>
-        </w:rPr>
-        <w:t>Subsection</w:t>
-      </w:r>
-      <w:proofErr w:type="spellEnd"/>
-      <w:r>
-        <w:rPr>
-          <w:rFonts w:cs="Times New Roman"/>
-          <w:bCs w:val="0"/>
-          <w:lang w:val="fr-BE"/>
-        </w:rPr>
-        <w:t xml:space="preserve"> 2</w:t>
+      <w:r>
+        <w:rPr>
+          <w:rFonts w:cs="Times New Roman"/>
+          <w:bCs w:val="0"/>
+        </w:rPr>
+        <w:t>Subsection 2</w:t>
       </w:r>
       <w:bookmarkEnd w:id="26"/>
     </w:p>
@@ -13107,27 +13284,15 @@
           <w:rFonts w:cs="Times New Roman"/>
           <w:b/>
           <w:bCs w:val="0"/>
-          <w:lang w:val="fr-BE"/>
         </w:rPr>
       </w:pPr>
       <w:bookmarkStart w:id="27" w:name="_Toc224055075"/>
-      <w:proofErr w:type="spellStart"/>
-      <w:r>
-        <w:rPr>
-          <w:rFonts w:cs="Times New Roman"/>
-          <w:bCs w:val="0"/>
-          <w:lang w:val="fr-BE"/>
-        </w:rPr>
-        <w:t>Subsection</w:t>
-      </w:r>
-      <w:proofErr w:type="spellEnd"/>
-      <w:r>
-        <w:rPr>
-          <w:rFonts w:cs="Times New Roman"/>
-          <w:bCs w:val="0"/>
-          <w:lang w:val="fr-BE"/>
-        </w:rPr>
-        <w:t xml:space="preserve"> 3</w:t>
+      <w:r>
+        <w:rPr>
+          <w:rFonts w:cs="Times New Roman"/>
+          <w:bCs w:val="0"/>
+        </w:rPr>
+        <w:t>Subsection 3</w:t>
       </w:r>
       <w:bookmarkEnd w:id="27"/>
     </w:p>
@@ -13141,7 +13306,6 @@
           <w:bCs w:val="0"/>
           <w:sz w:val="24"/>
           <w:u w:val="single"/>
-          <w:lang w:val="fr-BE"/>
         </w:rPr>
       </w:pPr>
       <w:bookmarkStart w:id="28" w:name="_Toc224055076"/>
@@ -13151,7 +13315,6 @@
           <w:bCs w:val="0"/>
           <w:sz w:val="24"/>
           <w:u w:val="single"/>
-          <w:lang w:val="fr-BE"/>
         </w:rPr>
         <w:t>Section 2</w:t>
       </w:r>
@@ -13166,27 +13329,15 @@
           <w:rFonts w:cs="Times New Roman"/>
           <w:b/>
           <w:bCs w:val="0"/>
-          <w:lang w:val="fr-BE"/>
         </w:rPr>
       </w:pPr>
       <w:bookmarkStart w:id="29" w:name="_Toc224055077"/>
-      <w:proofErr w:type="spellStart"/>
-      <w:r>
-        <w:rPr>
-          <w:rFonts w:cs="Times New Roman"/>
-          <w:bCs w:val="0"/>
-          <w:lang w:val="fr-BE"/>
-        </w:rPr>
-        <w:t>Subsection</w:t>
-      </w:r>
-      <w:proofErr w:type="spellEnd"/>
-      <w:r>
-        <w:rPr>
-          <w:rFonts w:cs="Times New Roman"/>
-          <w:bCs w:val="0"/>
-          <w:lang w:val="fr-BE"/>
-        </w:rPr>
-        <w:t xml:space="preserve"> 1</w:t>
+      <w:r>
+        <w:rPr>
+          <w:rFonts w:cs="Times New Roman"/>
+          <w:bCs w:val="0"/>
+        </w:rPr>
+        <w:t>Subsection 1</w:t>
       </w:r>
       <w:bookmarkEnd w:id="29"/>
     </w:p>
@@ -13199,27 +13350,15 @@
           <w:rFonts w:cs="Times New Roman"/>
           <w:b/>
           <w:bCs w:val="0"/>
-          <w:lang w:val="fr-BE"/>
         </w:rPr>
       </w:pPr>
       <w:bookmarkStart w:id="30" w:name="_Toc224055078"/>
-      <w:proofErr w:type="spellStart"/>
-      <w:r>
-        <w:rPr>
-          <w:rFonts w:cs="Times New Roman"/>
-          <w:bCs w:val="0"/>
-          <w:lang w:val="fr-BE"/>
-        </w:rPr>
-        <w:t>Subsection</w:t>
-      </w:r>
-      <w:proofErr w:type="spellEnd"/>
-      <w:r>
-        <w:rPr>
-          <w:rFonts w:cs="Times New Roman"/>
-          <w:bCs w:val="0"/>
-          <w:lang w:val="fr-BE"/>
-        </w:rPr>
-        <w:t xml:space="preserve"> 2</w:t>
+      <w:r>
+        <w:rPr>
+          <w:rFonts w:cs="Times New Roman"/>
+          <w:bCs w:val="0"/>
+        </w:rPr>
+        <w:t>Subsection 2</w:t>
       </w:r>
       <w:bookmarkEnd w:id="30"/>
     </w:p>
@@ -13232,27 +13371,15 @@
           <w:rFonts w:cs="Times New Roman"/>
           <w:b/>
           <w:bCs w:val="0"/>
-          <w:lang w:val="fr-BE"/>
         </w:rPr>
       </w:pPr>
       <w:bookmarkStart w:id="31" w:name="_Toc224055079"/>
-      <w:proofErr w:type="spellStart"/>
-      <w:r>
-        <w:rPr>
-          <w:rFonts w:cs="Times New Roman"/>
-          <w:bCs w:val="0"/>
-          <w:lang w:val="fr-BE"/>
-        </w:rPr>
-        <w:t>Subsection</w:t>
-      </w:r>
-      <w:proofErr w:type="spellEnd"/>
-      <w:r>
-        <w:rPr>
-          <w:rFonts w:cs="Times New Roman"/>
-          <w:bCs w:val="0"/>
-          <w:lang w:val="fr-BE"/>
-        </w:rPr>
-        <w:t xml:space="preserve"> 3</w:t>
+      <w:r>
+        <w:rPr>
+          <w:rFonts w:cs="Times New Roman"/>
+          <w:bCs w:val="0"/>
+        </w:rPr>
+        <w:t>Subsection 3</w:t>
       </w:r>
       <w:bookmarkEnd w:id="31"/>
     </w:p>
@@ -13260,9 +13387,6 @@
       <w:pPr>
         <w:pStyle w:val="TOC1"/>
         <w:spacing w:line="480" w:lineRule="auto"/>
-        <w:rPr>
-          <w:lang w:val="fr-BE"/>
-        </w:rPr>
       </w:pPr>
     </w:p>
     <w:p>
@@ -13275,7 +13399,6 @@
           <w:bCs w:val="0"/>
           <w:sz w:val="24"/>
           <w:u w:val="single"/>
-          <w:lang w:val="fr-BE"/>
         </w:rPr>
       </w:pPr>
       <w:bookmarkStart w:id="32" w:name="_Toc224055080"/>
@@ -13285,7 +13408,6 @@
           <w:bCs w:val="0"/>
           <w:sz w:val="24"/>
           <w:u w:val="single"/>
-          <w:lang w:val="fr-BE"/>
         </w:rPr>
         <w:t>Section 3</w:t>
       </w:r>
@@ -13300,27 +13422,15 @@
           <w:rFonts w:cs="Times New Roman"/>
           <w:b/>
           <w:bCs w:val="0"/>
-          <w:lang w:val="fr-BE"/>
         </w:rPr>
       </w:pPr>
       <w:bookmarkStart w:id="33" w:name="_Toc224055081"/>
-      <w:proofErr w:type="spellStart"/>
-      <w:r>
-        <w:rPr>
-          <w:rFonts w:cs="Times New Roman"/>
-          <w:bCs w:val="0"/>
-          <w:lang w:val="fr-BE"/>
-        </w:rPr>
-        <w:t>Subsection</w:t>
-      </w:r>
-      <w:proofErr w:type="spellEnd"/>
-      <w:r>
-        <w:rPr>
-          <w:rFonts w:cs="Times New Roman"/>
-          <w:bCs w:val="0"/>
-          <w:lang w:val="fr-BE"/>
-        </w:rPr>
-        <w:t xml:space="preserve"> 1</w:t>
+      <w:r>
+        <w:rPr>
+          <w:rFonts w:cs="Times New Roman"/>
+          <w:bCs w:val="0"/>
+        </w:rPr>
+        <w:t>Subsection 1</w:t>
       </w:r>
       <w:bookmarkEnd w:id="33"/>
     </w:p>
@@ -13333,27 +13443,15 @@
           <w:rFonts w:cs="Times New Roman"/>
           <w:b/>
           <w:bCs w:val="0"/>
-          <w:lang w:val="fr-BE"/>
         </w:rPr>
       </w:pPr>
       <w:bookmarkStart w:id="34" w:name="_Toc224055082"/>
-      <w:proofErr w:type="spellStart"/>
-      <w:r>
-        <w:rPr>
-          <w:rFonts w:cs="Times New Roman"/>
-          <w:bCs w:val="0"/>
-          <w:lang w:val="fr-BE"/>
-        </w:rPr>
-        <w:t>Subsection</w:t>
-      </w:r>
-      <w:proofErr w:type="spellEnd"/>
-      <w:r>
-        <w:rPr>
-          <w:rFonts w:cs="Times New Roman"/>
-          <w:bCs w:val="0"/>
-          <w:lang w:val="fr-BE"/>
-        </w:rPr>
-        <w:t xml:space="preserve"> 2</w:t>
+      <w:r>
+        <w:rPr>
+          <w:rFonts w:cs="Times New Roman"/>
+          <w:bCs w:val="0"/>
+        </w:rPr>
+        <w:t>Subsection 2</w:t>
       </w:r>
       <w:bookmarkEnd w:id="34"/>
     </w:p>
@@ -13366,36 +13464,21 @@
           <w:rFonts w:cs="Times New Roman"/>
           <w:b/>
           <w:bCs w:val="0"/>
-          <w:lang w:val="fr-BE"/>
         </w:rPr>
       </w:pPr>
       <w:bookmarkStart w:id="35" w:name="_Toc224055083"/>
-      <w:proofErr w:type="spellStart"/>
-      <w:r>
-        <w:rPr>
-          <w:rFonts w:cs="Times New Roman"/>
-          <w:bCs w:val="0"/>
-          <w:lang w:val="fr-BE"/>
-        </w:rPr>
-        <w:t>Subsection</w:t>
-      </w:r>
-      <w:proofErr w:type="spellEnd"/>
-      <w:r>
-        <w:rPr>
-          <w:rFonts w:cs="Times New Roman"/>
-          <w:bCs w:val="0"/>
-          <w:lang w:val="fr-BE"/>
-        </w:rPr>
-        <w:t xml:space="preserve"> 3</w:t>
+      <w:r>
+        <w:rPr>
+          <w:rFonts w:cs="Times New Roman"/>
+          <w:bCs w:val="0"/>
+        </w:rPr>
+        <w:t>Subsection 3</w:t>
       </w:r>
       <w:bookmarkEnd w:id="35"/>
     </w:p>
     <w:p>
       <w:pPr>
         <w:spacing w:line="480" w:lineRule="auto"/>
-        <w:rPr>
-          <w:lang w:val="fr-BE"/>
-        </w:rPr>
       </w:pPr>
     </w:p>
     <w:p>
@@ -13408,7 +13491,6 @@
           <w:bCs w:val="0"/>
           <w:sz w:val="24"/>
           <w:u w:val="single"/>
-          <w:lang w:val="fr-BE"/>
         </w:rPr>
       </w:pPr>
       <w:bookmarkStart w:id="36" w:name="_Toc224055084"/>
@@ -13418,7 +13500,6 @@
           <w:bCs w:val="0"/>
           <w:sz w:val="24"/>
           <w:u w:val="single"/>
-          <w:lang w:val="fr-BE"/>
         </w:rPr>
         <w:lastRenderedPageBreak/>
         <w:t>Section 4</w:t>
@@ -13434,27 +13515,15 @@
           <w:rFonts w:cs="Times New Roman"/>
           <w:b/>
           <w:bCs w:val="0"/>
-          <w:lang w:val="fr-BE"/>
         </w:rPr>
       </w:pPr>
       <w:bookmarkStart w:id="37" w:name="_Toc224055085"/>
-      <w:proofErr w:type="spellStart"/>
-      <w:r>
-        <w:rPr>
-          <w:rFonts w:cs="Times New Roman"/>
-          <w:bCs w:val="0"/>
-          <w:lang w:val="fr-BE"/>
-        </w:rPr>
-        <w:t>Subsection</w:t>
-      </w:r>
-      <w:proofErr w:type="spellEnd"/>
-      <w:r>
-        <w:rPr>
-          <w:rFonts w:cs="Times New Roman"/>
-          <w:bCs w:val="0"/>
-          <w:lang w:val="fr-BE"/>
-        </w:rPr>
-        <w:t xml:space="preserve"> 1</w:t>
+      <w:r>
+        <w:rPr>
+          <w:rFonts w:cs="Times New Roman"/>
+          <w:bCs w:val="0"/>
+        </w:rPr>
+        <w:t>Subsection 1</w:t>
       </w:r>
       <w:bookmarkEnd w:id="37"/>
     </w:p>
@@ -13467,27 +13536,15 @@
           <w:rFonts w:cs="Times New Roman"/>
           <w:b/>
           <w:bCs w:val="0"/>
-          <w:lang w:val="fr-BE"/>
         </w:rPr>
       </w:pPr>
       <w:bookmarkStart w:id="38" w:name="_Toc224055086"/>
-      <w:proofErr w:type="spellStart"/>
-      <w:r>
-        <w:rPr>
-          <w:rFonts w:cs="Times New Roman"/>
-          <w:bCs w:val="0"/>
-          <w:lang w:val="fr-BE"/>
-        </w:rPr>
-        <w:t>Subsection</w:t>
-      </w:r>
-      <w:proofErr w:type="spellEnd"/>
-      <w:r>
-        <w:rPr>
-          <w:rFonts w:cs="Times New Roman"/>
-          <w:bCs w:val="0"/>
-          <w:lang w:val="fr-BE"/>
-        </w:rPr>
-        <w:t xml:space="preserve"> 2</w:t>
+      <w:r>
+        <w:rPr>
+          <w:rFonts w:cs="Times New Roman"/>
+          <w:bCs w:val="0"/>
+        </w:rPr>
+        <w:t>Subsection 2</w:t>
       </w:r>
       <w:bookmarkEnd w:id="38"/>
     </w:p>
@@ -13500,36 +13557,21 @@
           <w:rFonts w:cs="Times New Roman"/>
           <w:b/>
           <w:bCs w:val="0"/>
-          <w:lang w:val="fr-BE"/>
         </w:rPr>
       </w:pPr>
       <w:bookmarkStart w:id="39" w:name="_Toc224055087"/>
-      <w:proofErr w:type="spellStart"/>
-      <w:r>
-        <w:rPr>
-          <w:rFonts w:cs="Times New Roman"/>
-          <w:bCs w:val="0"/>
-          <w:lang w:val="fr-BE"/>
-        </w:rPr>
-        <w:t>Subsection</w:t>
-      </w:r>
-      <w:proofErr w:type="spellEnd"/>
-      <w:r>
-        <w:rPr>
-          <w:rFonts w:cs="Times New Roman"/>
-          <w:bCs w:val="0"/>
-          <w:lang w:val="fr-BE"/>
-        </w:rPr>
-        <w:t xml:space="preserve"> 3</w:t>
+      <w:r>
+        <w:rPr>
+          <w:rFonts w:cs="Times New Roman"/>
+          <w:bCs w:val="0"/>
+        </w:rPr>
+        <w:t>Subsection 3</w:t>
       </w:r>
       <w:bookmarkEnd w:id="39"/>
     </w:p>
     <w:p>
       <w:pPr>
         <w:spacing w:line="480" w:lineRule="auto"/>
-        <w:rPr>
-          <w:lang w:val="fr-BE"/>
-        </w:rPr>
       </w:pPr>
     </w:p>
     <w:p>
@@ -17284,64 +17326,66 @@
       <w:r>
         <w:fldChar w:fldCharType="separate"/>
       </w:r>
+      <w:proofErr w:type="spellStart"/>
       <w:r>
         <w:rPr>
           <w:lang w:val="es-PY"/>
         </w:rPr>
-        <w:t xml:space="preserve">Bilbao, Bibiana A., Brian G. Ferrero, Rodrigo M. </w:t>
-      </w:r>
-      <w:proofErr w:type="spellStart"/>
+        <w:t>Armenteras</w:t>
+      </w:r>
+      <w:proofErr w:type="spellEnd"/>
       <w:r>
         <w:rPr>
           <w:lang w:val="es-PY"/>
         </w:rPr>
-        <w:t>Falleiro</w:t>
-      </w:r>
-      <w:proofErr w:type="spellEnd"/>
-      <w:r>
-        <w:rPr>
-          <w:lang w:val="es-PY"/>
-        </w:rPr>
-        <w:t xml:space="preserve">, Livia Carvalho Moura, and Guilherme M. Fagundes. </w:t>
-      </w:r>
-      <w:r>
-        <w:t xml:space="preserve">2025. “Traditional Fire Uses by Indigenous Peoples and Local Communities in South America.” In </w:t>
+        <w:t xml:space="preserve">, Dolors, Tania Marisol González, and Javier Retana. </w:t>
+      </w:r>
+      <w:r>
+        <w:t xml:space="preserve">2013. “Forest Fragmentation and Edge Influence on Fire Occurrence and Intensity under Different Management Types in Amazon Forests.” </w:t>
       </w:r>
       <w:r>
         <w:rPr>
           <w:i/>
           <w:iCs/>
         </w:rPr>
-        <w:t>Fire in the South American Ecosystems</w:t>
-      </w:r>
-      <w:r>
-        <w:t xml:space="preserve">, edited by Alessandra Fidelis and Vânia R. </w:t>
+        <w:t>Biological Conservation</w:t>
+      </w:r>
+      <w:r>
+        <w:t xml:space="preserve"> 159 (March): 73–79. https://doi.org/10.1016/j.biocon.2012.10.026.</w:t>
+      </w:r>
+    </w:p>
+    <w:p>
+      <w:pPr>
+        <w:pStyle w:val="Bibliography"/>
+      </w:pPr>
+      <w:r>
+        <w:t xml:space="preserve">Bilbao, Bibiana A., Brian G. Ferrero, Rodrigo M. </w:t>
       </w:r>
       <w:proofErr w:type="spellStart"/>
       <w:r>
-        <w:t>Pivello</w:t>
+        <w:t>Falleiro</w:t>
       </w:r>
       <w:proofErr w:type="spellEnd"/>
       <w:r>
-        <w:t>. Springer Nature Switzerland. https://doi.org/10.1007/978-3-031-89372-8_3.</w:t>
-      </w:r>
-    </w:p>
-    <w:p>
-      <w:pPr>
-        <w:pStyle w:val="Bibliography"/>
-      </w:pPr>
-      <w:r>
-        <w:t xml:space="preserve">Bowman, M. J. S., Jennifer Balch, Paulo Artaxo, and William Bond. 2009. “Fire in the Earth System.” </w:t>
+        <w:t xml:space="preserve">, Livia Carvalho Moura, and Guilherme M. Fagundes. 2025. “Traditional Fire Uses by Indigenous Peoples and Local Communities in South America.” In </w:t>
       </w:r>
       <w:r>
         <w:rPr>
           <w:i/>
           <w:iCs/>
         </w:rPr>
-        <w:t>Science</w:t>
-      </w:r>
-      <w:r>
-        <w:t xml:space="preserve"> 324 (5926): 481–84. https://doi.org/10.1126/science.1163886.</w:t>
+        <w:t>Fire in the South American Ecosystems</w:t>
+      </w:r>
+      <w:r>
+        <w:t xml:space="preserve">, edited by Alessandra Fidelis and Vânia R. </w:t>
+      </w:r>
+      <w:proofErr w:type="spellStart"/>
+      <w:r>
+        <w:t>Pivello</w:t>
+      </w:r>
+      <w:proofErr w:type="spellEnd"/>
+      <w:r>
+        <w:t>. Springer Nature Switzerland. https://doi.org/10.1007/978-3-031-89372-8_3.</w:t>
       </w:r>
     </w:p>
     <w:p>
@@ -17349,17 +17393,17 @@
         <w:pStyle w:val="Bibliography"/>
       </w:pPr>
       <w:r>
-        <w:t xml:space="preserve">Cochrane, Mark. 2009. “Fire, Land Use, Land Cover Dynamics, and Climate Change in the Brazilian Amazon.” In </w:t>
+        <w:t xml:space="preserve">Bowman, M. J. S., Jennifer Balch, Paulo Artaxo, and William Bond. 2009. “Fire in the Earth System.” </w:t>
       </w:r>
       <w:r>
         <w:rPr>
           <w:i/>
           <w:iCs/>
         </w:rPr>
-        <w:t>Tropical Fire Ecology: Climate Change, Land Use and Ecosystem Dynamics</w:t>
-      </w:r>
-      <w:r>
-        <w:t>. https://doi.org/10.1007/978-3-540-77381-8_14.</w:t>
+        <w:t>Science</w:t>
+      </w:r>
+      <w:r>
+        <w:t xml:space="preserve"> 324 (5926): 481–84. https://doi.org/10.1126/science.1163886.</w:t>
       </w:r>
     </w:p>
     <w:p>
@@ -17367,17 +17411,17 @@
         <w:pStyle w:val="Bibliography"/>
       </w:pPr>
       <w:r>
-        <w:t xml:space="preserve">Cochrane, Mark A., and Kevin C. Ryan. 2009. “Fire and Fire Ecology: Concepts and Principles.” </w:t>
+        <w:t xml:space="preserve">Cochrane, Mark. 2009. “Fire, Land Use, Land Cover Dynamics, and Climate Change in the Brazilian Amazon.” In </w:t>
       </w:r>
       <w:r>
         <w:rPr>
           <w:i/>
           <w:iCs/>
         </w:rPr>
-        <w:t>In: Cochrane, Mark A., Ed. Tropical Fire Ecology: Climate Change, Land Use, and Ecosystem Dynamics. Springer-Praxis Books in Environmental Sciences. Chichester, UK: Praxis Publishing, Ltd. p. 25-62.</w:t>
-      </w:r>
-      <w:r>
-        <w:t>, 25–62. https://doi.org/10.1007/978-3-540-77381-8_2.</w:t>
+        <w:t>Tropical Fire Ecology: Climate Change, Land Use and Ecosystem Dynamics</w:t>
+      </w:r>
+      <w:r>
+        <w:t>. https://doi.org/10.1007/978-3-540-77381-8_14.</w:t>
       </w:r>
     </w:p>
     <w:p>
@@ -17385,40 +17429,35 @@
         <w:pStyle w:val="Bibliography"/>
       </w:pPr>
       <w:r>
-        <w:t xml:space="preserve">Harrison, Sandy P., I. Colin Prentice, Keith J. Bloomfield, et al. 2021. “Understanding and Modelling Wildfire Regimes: An Ecological Perspective.” </w:t>
+        <w:t xml:space="preserve">Cochrane, Mark A., and Kevin C. Ryan. 2009. “Fire and Fire Ecology: Concepts and Principles.” </w:t>
       </w:r>
       <w:r>
         <w:rPr>
           <w:i/>
           <w:iCs/>
         </w:rPr>
-        <w:t>Environmental Research Letters</w:t>
-      </w:r>
-      <w:r>
-        <w:t xml:space="preserve"> 16 (12): 125008. https://doi.org/10.1088/1748-9326/ac39be.</w:t>
+        <w:t>In: Cochrane, Mark A., Ed. Tropical Fire Ecology: Climate Change, Land Use, and Ecosystem Dynamics. Springer-Praxis Books in Environmental Sciences. Chichester, UK: Praxis Publishing, Ltd. p. 25-62.</w:t>
+      </w:r>
+      <w:r>
+        <w:t>, 25–62. https://doi.org/10.1007/978-3-540-77381-8_2.</w:t>
       </w:r>
     </w:p>
     <w:p>
       <w:pPr>
         <w:pStyle w:val="Bibliography"/>
       </w:pPr>
-      <w:proofErr w:type="spellStart"/>
-      <w:r>
-        <w:t>Pausas</w:t>
-      </w:r>
-      <w:proofErr w:type="spellEnd"/>
-      <w:r>
-        <w:t xml:space="preserve">, Juli G., and Jon E. Keeley. 2021. “Wildfires and Global Change.” </w:t>
+      <w:r>
+        <w:t xml:space="preserve">Harrison, Sandy P., I. Colin Prentice, Keith J. Bloomfield, et al. 2021. “Understanding and Modelling Wildfire Regimes: An Ecological Perspective.” </w:t>
       </w:r>
       <w:r>
         <w:rPr>
           <w:i/>
           <w:iCs/>
         </w:rPr>
-        <w:t>Frontiers in Ecology and the Environment</w:t>
-      </w:r>
-      <w:r>
-        <w:t xml:space="preserve"> 19 (7): 387–95. https://doi.org/10.1002/fee.2359.</w:t>
+        <w:t>Environmental Research Letters</w:t>
+      </w:r>
+      <w:r>
+        <w:t xml:space="preserve"> 16 (12): 125008. https://doi.org/10.1088/1748-9326/ac39be.</w:t>
       </w:r>
     </w:p>
     <w:p>
@@ -17426,17 +17465,45 @@
         <w:pStyle w:val="Bibliography"/>
       </w:pPr>
       <w:r>
-        <w:t xml:space="preserve">Pyne, Stephen J., Patricia L. Andrews, and Richard D. Laven. 1996. </w:t>
+        <w:rPr>
+          <w:lang w:val="es-PY"/>
+        </w:rPr>
+        <w:t xml:space="preserve">Jasser, Marie Theresa, Isabella M. </w:t>
+      </w:r>
+      <w:proofErr w:type="spellStart"/>
+      <w:r>
+        <w:rPr>
+          <w:lang w:val="es-PY"/>
+        </w:rPr>
+        <w:t>Radhuber</w:t>
+      </w:r>
+      <w:proofErr w:type="spellEnd"/>
+      <w:r>
+        <w:rPr>
+          <w:lang w:val="es-PY"/>
+        </w:rPr>
+        <w:t xml:space="preserve">, and Mirna Inturias. </w:t>
+      </w:r>
+      <w:r>
+        <w:t xml:space="preserve">2021. “Motley Territories in a Plurinational State: Forest Fires in the Bolivian </w:t>
+      </w:r>
+      <w:proofErr w:type="spellStart"/>
+      <w:r>
+        <w:t>Chiquitanía</w:t>
+      </w:r>
+      <w:proofErr w:type="spellEnd"/>
+      <w:r>
+        <w:t xml:space="preserve">.” </w:t>
       </w:r>
       <w:r>
         <w:rPr>
           <w:i/>
           <w:iCs/>
         </w:rPr>
-        <w:t>Introduction to Wildland Fire</w:t>
-      </w:r>
-      <w:r>
-        <w:t>. 2. ed. Wiley.</w:t>
+        <w:t>Third World Thematics: A TWQ Journal</w:t>
+      </w:r>
+      <w:r>
+        <w:t xml:space="preserve"> 6 (4–6): 179–99. https://doi.org/10.1080/23802014.2022.2146182.</w:t>
       </w:r>
     </w:p>
     <w:p>
@@ -17445,21 +17512,21 @@
       </w:pPr>
       <w:proofErr w:type="spellStart"/>
       <w:r>
-        <w:t>Shakesby</w:t>
+        <w:t>Pausas</w:t>
       </w:r>
       <w:proofErr w:type="spellEnd"/>
       <w:r>
-        <w:t xml:space="preserve">, R. A., and S. H. Doerr. 2006. “Wildfire as a Hydrological and Geomorphological Agent.” </w:t>
+        <w:t xml:space="preserve">, Juli G., and Jon E. Keeley. 2021. “Wildfires and Global Change.” </w:t>
       </w:r>
       <w:r>
         <w:rPr>
           <w:i/>
           <w:iCs/>
         </w:rPr>
-        <w:t>Earth-Science Reviews</w:t>
-      </w:r>
-      <w:r>
-        <w:t xml:space="preserve"> 74 (3): 269–307. https://doi.org/10.1016/j.earscirev.2005.10.006.</w:t>
+        <w:t>Frontiers in Ecology and the Environment</w:t>
+      </w:r>
+      <w:r>
+        <w:t xml:space="preserve"> 19 (7): 387–95. https://doi.org/10.1002/fee.2359.</w:t>
       </w:r>
     </w:p>
     <w:p>
@@ -17467,35 +17534,40 @@
         <w:pStyle w:val="Bibliography"/>
       </w:pPr>
       <w:r>
-        <w:t xml:space="preserve">Shlisky, Ayn, Ane Alencar, María Manta, Lisa Curran, and Mark Cochrane. 2009. </w:t>
+        <w:t xml:space="preserve">Pyne, Stephen J., Patricia L. Andrews, and Richard D. Laven. 1996. </w:t>
       </w:r>
       <w:r>
         <w:rPr>
           <w:i/>
           <w:iCs/>
         </w:rPr>
-        <w:t>Overview: Global Fire Regime Conditions, Threats, and Opportunities for Fire Management in the Tropics</w:t>
-      </w:r>
-      <w:r>
-        <w:t>. https://doi.org/10.1007/978-3-540-77381-8_3.</w:t>
+        <w:t>Introduction to Wildland Fire</w:t>
+      </w:r>
+      <w:r>
+        <w:t>. 2. ed. Wiley.</w:t>
       </w:r>
     </w:p>
     <w:p>
       <w:pPr>
         <w:pStyle w:val="Bibliography"/>
       </w:pPr>
-      <w:r>
-        <w:t xml:space="preserve">Tedim, Fantina, and Vittorio Leone. 2020. “The Dilemma of Wildfire Definition: What It Reveals and What It Implies.” </w:t>
+      <w:proofErr w:type="spellStart"/>
+      <w:r>
+        <w:t>Shakesby</w:t>
+      </w:r>
+      <w:proofErr w:type="spellEnd"/>
+      <w:r>
+        <w:t xml:space="preserve">, R. A., and S. H. Doerr. 2006. “Wildfire as a Hydrological and Geomorphological Agent.” </w:t>
       </w:r>
       <w:r>
         <w:rPr>
           <w:i/>
           <w:iCs/>
         </w:rPr>
-        <w:t>Frontiers in Forests and Global Change</w:t>
-      </w:r>
-      <w:r>
-        <w:t xml:space="preserve"> 3 (December). https://doi.org/10.3389/ffgc.2020.553116.</w:t>
+        <w:t>Earth-Science Reviews</w:t>
+      </w:r>
+      <w:r>
+        <w:t xml:space="preserve"> 74 (3): 269–307. https://doi.org/10.1016/j.earscirev.2005.10.006.</w:t>
       </w:r>
     </w:p>
     <w:p>
@@ -17503,37 +17575,100 @@
         <w:pStyle w:val="Bibliography"/>
       </w:pPr>
       <w:r>
-        <w:t xml:space="preserve">Yang, </w:t>
-      </w:r>
-      <w:proofErr w:type="spellStart"/>
-      <w:r>
-        <w:t>Xuhong</w:t>
-      </w:r>
-      <w:proofErr w:type="spellEnd"/>
-      <w:r>
-        <w:t xml:space="preserve">, </w:t>
-      </w:r>
-      <w:proofErr w:type="spellStart"/>
-      <w:r>
-        <w:t>Xiaobin</w:t>
-      </w:r>
-      <w:proofErr w:type="spellEnd"/>
-      <w:r>
-        <w:t xml:space="preserve"> Jin, and </w:t>
-      </w:r>
-      <w:proofErr w:type="spellStart"/>
-      <w:r>
-        <w:t>Yinkang</w:t>
-      </w:r>
-      <w:proofErr w:type="spellEnd"/>
-      <w:r>
-        <w:t xml:space="preserve"> Zhou. 2021. “Wildfire Risk Assessment and Zoning by Integrating Maxent and GIS in Hunan Province, China.” </w:t>
+        <w:t xml:space="preserve">Shlisky, Ayn, Ane Alencar, María Manta, Lisa Curran, and Mark Cochrane. 2009. </w:t>
       </w:r>
       <w:r>
         <w:rPr>
           <w:i/>
           <w:iCs/>
         </w:rPr>
+        <w:t>Overview: Global Fire Regime Conditions, Threats, and Opportunities for Fire Management in the Tropics</w:t>
+      </w:r>
+      <w:r>
+        <w:t>. https://doi.org/10.1007/978-3-540-77381-8_3.</w:t>
+      </w:r>
+    </w:p>
+    <w:p>
+      <w:pPr>
+        <w:pStyle w:val="Bibliography"/>
+      </w:pPr>
+      <w:r>
+        <w:lastRenderedPageBreak/>
+        <w:t xml:space="preserve">Tedim, Fantina, and Vittorio Leone. 2020. “The Dilemma of Wildfire Definition: What It Reveals and What It Implies.” </w:t>
+      </w:r>
+      <w:r>
+        <w:rPr>
+          <w:i/>
+          <w:iCs/>
+        </w:rPr>
+        <w:t>Frontiers in Forests and Global Change</w:t>
+      </w:r>
+      <w:r>
+        <w:t xml:space="preserve"> 3 (December). https://doi.org/10.3389/ffgc.2020.553116.</w:t>
+      </w:r>
+    </w:p>
+    <w:p>
+      <w:pPr>
+        <w:pStyle w:val="Bibliography"/>
+      </w:pPr>
+      <w:r>
+        <w:t xml:space="preserve">Vidal-Riveros, Cristina, Bryce Currey, David B. McWethy, Marie Ange Ngo </w:t>
+      </w:r>
+      <w:proofErr w:type="spellStart"/>
+      <w:r>
+        <w:t>Bieng</w:t>
+      </w:r>
+      <w:proofErr w:type="spellEnd"/>
+      <w:r>
+        <w:t xml:space="preserve">, and Pablo Souza-Alonso. 2024. “Spatiotemporal Analysis of Wildfires and Their Relationship with Climate and Land Use in the Gran Chaco and Pantanal Ecoregions.” </w:t>
+      </w:r>
+      <w:r>
+        <w:rPr>
+          <w:i/>
+          <w:iCs/>
+        </w:rPr>
+        <w:t>Science of The Total Environment</w:t>
+      </w:r>
+      <w:r>
+        <w:t xml:space="preserve"> 955 (December): 176823. https://doi.org/10.1016/j.scitotenv.2024.176823.</w:t>
+      </w:r>
+    </w:p>
+    <w:p>
+      <w:pPr>
+        <w:pStyle w:val="Bibliography"/>
+      </w:pPr>
+      <w:r>
+        <w:t xml:space="preserve">Yang, </w:t>
+      </w:r>
+      <w:proofErr w:type="spellStart"/>
+      <w:r>
+        <w:t>Xuhong</w:t>
+      </w:r>
+      <w:proofErr w:type="spellEnd"/>
+      <w:r>
+        <w:t xml:space="preserve">, </w:t>
+      </w:r>
+      <w:proofErr w:type="spellStart"/>
+      <w:r>
+        <w:t>Xiaobin</w:t>
+      </w:r>
+      <w:proofErr w:type="spellEnd"/>
+      <w:r>
+        <w:t xml:space="preserve"> Jin, and </w:t>
+      </w:r>
+      <w:proofErr w:type="spellStart"/>
+      <w:r>
+        <w:t>Yinkang</w:t>
+      </w:r>
+      <w:proofErr w:type="spellEnd"/>
+      <w:r>
+        <w:t xml:space="preserve"> Zhou. 2021. “Wildfire Risk Assessment and Zoning by Integrating Maxent and GIS in Hunan Province, China.” </w:t>
+      </w:r>
+      <w:r>
+        <w:rPr>
+          <w:i/>
+          <w:iCs/>
+        </w:rPr>
         <w:t>Forests</w:t>
       </w:r>
       <w:r>
@@ -17546,7 +17681,6 @@
         <w:spacing w:line="480" w:lineRule="auto"/>
       </w:pPr>
       <w:r>
-        <w:lastRenderedPageBreak/>
         <w:fldChar w:fldCharType="end"/>
       </w:r>
     </w:p>
@@ -17922,16 +18056,8 @@
       <w:rPr>
         <w:rStyle w:val="PageNumber"/>
       </w:rPr>
-      <w:t>xii</w:t>
+      <w:t>xiii</w:t>
     </w:r>
-    <w:proofErr w:type="spellStart"/>
-    <w:r>
-      <w:rPr>
-        <w:rStyle w:val="PageNumber"/>
-      </w:rPr>
-      <w:t>i</w:t>
-    </w:r>
-    <w:proofErr w:type="spellEnd"/>
     <w:r>
       <w:rPr>
         <w:rStyle w:val="PageNumber"/>
@@ -19467,11 +19593,12 @@
     <w:next w:val="Normal"/>
     <w:unhideWhenUsed/>
     <w:qFormat/>
-    <w:rsid w:val="00896E87"/>
+    <w:rsid w:val="00715E63"/>
     <w:pPr>
       <w:spacing w:after="200"/>
     </w:pPr>
     <w:rPr>
+      <w:i/>
       <w:iCs/>
       <w:color w:val="000000" w:themeColor="text1"/>
       <w:sz w:val="22"/>

</xml_diff>